<commit_message>
Implementación de codigo en estructura y gestor
</commit_message>
<xml_diff>
--- a/Informe/INFORME.docx
+++ b/Informe/INFORME.docx
@@ -655,21 +655,7 @@
           <w:sz w:val="28"/>
           <w:szCs w:val="28"/>
         </w:rPr>
-        <w:t xml:space="preserve">2. </w:t>
-      </w:r>
-      <w:r>
-        <w:rPr>
-          <w:sz w:val="28"/>
-          <w:szCs w:val="28"/>
-        </w:rPr>
-        <w:t>Implementación de las estructuras de datos y operaciones requeridas</w:t>
-      </w:r>
-      <w:r>
-        <w:rPr>
-          <w:sz w:val="28"/>
-          <w:szCs w:val="28"/>
-        </w:rPr>
-        <w:t>:</w:t>
+        <w:t>2. Implementación de las estructuras de datos y operaciones requeridas:</w:t>
       </w:r>
     </w:p>
     <w:p>
@@ -1360,6 +1346,2878 @@
         </w:drawing>
       </w:r>
     </w:p>
+    <w:p>
+      <w:pPr>
+        <w:spacing w:after="0"/>
+        <w:rPr>
+          <w:sz w:val="28"/>
+          <w:szCs w:val="28"/>
+        </w:rPr>
+      </w:pPr>
+    </w:p>
+    <w:p>
+      <w:pPr>
+        <w:spacing w:after="0"/>
+        <w:rPr>
+          <w:sz w:val="28"/>
+          <w:szCs w:val="28"/>
+        </w:rPr>
+      </w:pPr>
+    </w:p>
+    <w:p>
+      <w:pPr>
+        <w:spacing w:after="0"/>
+        <w:rPr>
+          <w:sz w:val="28"/>
+          <w:szCs w:val="28"/>
+        </w:rPr>
+      </w:pPr>
+    </w:p>
+    <w:p>
+      <w:pPr>
+        <w:spacing w:after="0"/>
+        <w:rPr>
+          <w:sz w:val="28"/>
+          <w:szCs w:val="28"/>
+        </w:rPr>
+      </w:pPr>
+    </w:p>
+    <w:p>
+      <w:pPr>
+        <w:spacing w:after="0"/>
+        <w:rPr>
+          <w:sz w:val="28"/>
+          <w:szCs w:val="28"/>
+        </w:rPr>
+      </w:pPr>
+    </w:p>
+    <w:p>
+      <w:pPr>
+        <w:spacing w:after="0"/>
+        <w:rPr>
+          <w:sz w:val="28"/>
+          <w:szCs w:val="28"/>
+        </w:rPr>
+      </w:pPr>
+    </w:p>
+    <w:p>
+      <w:pPr>
+        <w:spacing w:after="0"/>
+        <w:rPr>
+          <w:sz w:val="28"/>
+          <w:szCs w:val="28"/>
+        </w:rPr>
+      </w:pPr>
+    </w:p>
+    <w:p>
+      <w:pPr>
+        <w:spacing w:after="0"/>
+        <w:rPr>
+          <w:sz w:val="28"/>
+          <w:szCs w:val="28"/>
+        </w:rPr>
+      </w:pPr>
+    </w:p>
+    <w:p>
+      <w:pPr>
+        <w:spacing w:after="0"/>
+        <w:rPr>
+          <w:sz w:val="28"/>
+          <w:szCs w:val="28"/>
+        </w:rPr>
+      </w:pPr>
+    </w:p>
+    <w:p>
+      <w:pPr>
+        <w:spacing w:after="0"/>
+        <w:rPr>
+          <w:sz w:val="28"/>
+          <w:szCs w:val="28"/>
+        </w:rPr>
+      </w:pPr>
+    </w:p>
+    <w:p>
+      <w:pPr>
+        <w:spacing w:after="0"/>
+        <w:rPr>
+          <w:sz w:val="28"/>
+          <w:szCs w:val="28"/>
+        </w:rPr>
+      </w:pPr>
+      <w:r>
+        <w:rPr>
+          <w:sz w:val="28"/>
+          <w:szCs w:val="28"/>
+        </w:rPr>
+        <w:lastRenderedPageBreak/>
+        <w:t>Responsabilidades iniciales:</w:t>
+      </w:r>
+    </w:p>
+    <w:p>
+      <w:pPr>
+        <w:spacing w:after="0"/>
+        <w:rPr>
+          <w:sz w:val="28"/>
+          <w:szCs w:val="28"/>
+        </w:rPr>
+      </w:pPr>
+    </w:p>
+    <w:p>
+      <w:pPr>
+        <w:spacing w:after="0"/>
+        <w:rPr>
+          <w:sz w:val="28"/>
+          <w:szCs w:val="28"/>
+          <w:lang w:val="es-ES"/>
+        </w:rPr>
+      </w:pPr>
+      <w:r>
+        <w:rPr>
+          <w:sz w:val="28"/>
+          <w:szCs w:val="28"/>
+          <w:lang w:val="es-ES"/>
+        </w:rPr>
+        <w:t xml:space="preserve">Para estructurar este proyecto </w:t>
+      </w:r>
+      <w:r>
+        <w:rPr>
+          <w:sz w:val="28"/>
+          <w:szCs w:val="28"/>
+          <w:lang w:val="es-ES"/>
+        </w:rPr>
+        <w:t>para</w:t>
+      </w:r>
+      <w:r>
+        <w:rPr>
+          <w:sz w:val="28"/>
+          <w:szCs w:val="28"/>
+          <w:lang w:val="es-ES"/>
+        </w:rPr>
+        <w:t xml:space="preserve"> </w:t>
+      </w:r>
+      <w:r>
+        <w:rPr>
+          <w:sz w:val="28"/>
+          <w:szCs w:val="28"/>
+          <w:lang w:val="es-ES"/>
+        </w:rPr>
+        <w:t>poder</w:t>
+      </w:r>
+      <w:r>
+        <w:rPr>
+          <w:sz w:val="28"/>
+          <w:szCs w:val="28"/>
+          <w:lang w:val="es-ES"/>
+        </w:rPr>
+        <w:t xml:space="preserve"> trabajar en paralelo (usando ramas en Git). Al encapsular cada gran responsabilidad en un archivo independiente, uno puede programar la mensajería mientras</w:t>
+      </w:r>
+      <w:r>
+        <w:rPr>
+          <w:sz w:val="28"/>
+          <w:szCs w:val="28"/>
+          <w:lang w:val="es-ES"/>
+        </w:rPr>
+        <w:t xml:space="preserve"> </w:t>
+      </w:r>
+      <w:r>
+        <w:rPr>
+          <w:sz w:val="28"/>
+          <w:szCs w:val="28"/>
+          <w:lang w:val="es-ES"/>
+        </w:rPr>
+        <w:t xml:space="preserve">otro diseña la gestión de archivos, sin generar conflictos. </w:t>
+      </w:r>
+    </w:p>
+    <w:p>
+      <w:pPr>
+        <w:spacing w:after="0"/>
+        <w:rPr>
+          <w:sz w:val="28"/>
+          <w:szCs w:val="28"/>
+          <w:lang w:val="es-ES"/>
+        </w:rPr>
+      </w:pPr>
+      <w:r>
+        <w:rPr>
+          <w:sz w:val="28"/>
+          <w:szCs w:val="28"/>
+          <w:lang w:val="es-ES"/>
+        </w:rPr>
+        <w:br/>
+      </w:r>
+    </w:p>
+    <w:p>
+      <w:pPr>
+        <w:spacing w:after="0"/>
+        <w:rPr>
+          <w:b/>
+          <w:bCs/>
+          <w:sz w:val="28"/>
+          <w:szCs w:val="28"/>
+          <w:lang w:val="en-US"/>
+        </w:rPr>
+      </w:pPr>
+      <w:r>
+        <w:rPr>
+          <w:b/>
+          <w:bCs/>
+          <w:sz w:val="28"/>
+          <w:szCs w:val="28"/>
+          <w:lang w:val="en-US"/>
+        </w:rPr>
+        <w:t xml:space="preserve">1. </w:t>
+      </w:r>
+      <w:proofErr w:type="spellStart"/>
+      <w:r>
+        <w:rPr>
+          <w:b/>
+          <w:bCs/>
+          <w:sz w:val="28"/>
+          <w:szCs w:val="28"/>
+          <w:lang w:val="en-US"/>
+        </w:rPr>
+        <w:t>Módulo</w:t>
+      </w:r>
+      <w:proofErr w:type="spellEnd"/>
+      <w:r>
+        <w:rPr>
+          <w:b/>
+          <w:bCs/>
+          <w:sz w:val="28"/>
+          <w:szCs w:val="28"/>
+          <w:lang w:val="en-US"/>
+        </w:rPr>
+        <w:t xml:space="preserve"> </w:t>
+      </w:r>
+      <w:r>
+        <w:rPr>
+          <w:b/>
+          <w:bCs/>
+          <w:sz w:val="28"/>
+          <w:szCs w:val="28"/>
+          <w:lang w:val="en-US"/>
+        </w:rPr>
+        <w:t>principal</w:t>
+      </w:r>
+      <w:r>
+        <w:rPr>
+          <w:b/>
+          <w:bCs/>
+          <w:sz w:val="28"/>
+          <w:szCs w:val="28"/>
+          <w:lang w:val="en-US"/>
+        </w:rPr>
+        <w:t xml:space="preserve"> (</w:t>
+      </w:r>
+      <w:r>
+        <w:rPr>
+          <w:sz w:val="28"/>
+          <w:szCs w:val="28"/>
+          <w:lang w:val="en-US"/>
+        </w:rPr>
+        <w:t>main.cpp</w:t>
+      </w:r>
+      <w:r>
+        <w:rPr>
+          <w:b/>
+          <w:bCs/>
+          <w:sz w:val="28"/>
+          <w:szCs w:val="28"/>
+          <w:lang w:val="en-US"/>
+        </w:rPr>
+        <w:t>)</w:t>
+      </w:r>
+    </w:p>
+    <w:p>
+      <w:pPr>
+        <w:numPr>
+          <w:ilvl w:val="0"/>
+          <w:numId w:val="12"/>
+        </w:numPr>
+        <w:spacing w:after="0"/>
+        <w:rPr>
+          <w:sz w:val="28"/>
+          <w:szCs w:val="28"/>
+          <w:lang w:val="es-ES"/>
+        </w:rPr>
+      </w:pPr>
+      <w:r>
+        <w:rPr>
+          <w:b/>
+          <w:bCs/>
+          <w:sz w:val="28"/>
+          <w:szCs w:val="28"/>
+          <w:lang w:val="es-ES"/>
+        </w:rPr>
+        <w:t>Qué es:</w:t>
+      </w:r>
+      <w:r>
+        <w:rPr>
+          <w:sz w:val="28"/>
+          <w:szCs w:val="28"/>
+          <w:lang w:val="es-ES"/>
+        </w:rPr>
+        <w:t xml:space="preserve"> El cerebro central, pero que no realiza trabajo pesado</w:t>
+      </w:r>
+      <w:r>
+        <w:rPr>
+          <w:sz w:val="28"/>
+          <w:szCs w:val="28"/>
+          <w:lang w:val="es-ES"/>
+        </w:rPr>
+        <w:t>, solo llama</w:t>
+      </w:r>
+      <w:r>
+        <w:rPr>
+          <w:sz w:val="28"/>
+          <w:szCs w:val="28"/>
+          <w:lang w:val="es-ES"/>
+        </w:rPr>
+        <w:t xml:space="preserve"> </w:t>
+      </w:r>
+    </w:p>
+    <w:p>
+      <w:pPr>
+        <w:numPr>
+          <w:ilvl w:val="0"/>
+          <w:numId w:val="12"/>
+        </w:numPr>
+        <w:spacing w:after="0"/>
+        <w:rPr>
+          <w:sz w:val="28"/>
+          <w:szCs w:val="28"/>
+          <w:lang w:val="es-ES"/>
+        </w:rPr>
+      </w:pPr>
+      <w:r>
+        <w:rPr>
+          <w:b/>
+          <w:bCs/>
+          <w:sz w:val="28"/>
+          <w:szCs w:val="28"/>
+          <w:lang w:val="es-ES"/>
+        </w:rPr>
+        <w:t>Qué recibe:</w:t>
+      </w:r>
+      <w:r>
+        <w:rPr>
+          <w:sz w:val="28"/>
+          <w:szCs w:val="28"/>
+          <w:lang w:val="es-ES"/>
+        </w:rPr>
+        <w:t xml:space="preserve"> Las selecciones numéricas del usuario a través de la consola </w:t>
+      </w:r>
+      <w:r>
+        <w:rPr>
+          <w:sz w:val="28"/>
+          <w:szCs w:val="28"/>
+          <w:lang w:val="es-ES"/>
+        </w:rPr>
+        <w:t xml:space="preserve">o leyendo directamente de archivo texto o </w:t>
+      </w:r>
+      <w:proofErr w:type="spellStart"/>
+      <w:r>
+        <w:rPr>
+          <w:sz w:val="28"/>
+          <w:szCs w:val="28"/>
+          <w:lang w:val="es-ES"/>
+        </w:rPr>
+        <w:t>json</w:t>
+      </w:r>
+      <w:proofErr w:type="spellEnd"/>
+      <w:r>
+        <w:rPr>
+          <w:sz w:val="28"/>
+          <w:szCs w:val="28"/>
+          <w:lang w:val="es-ES"/>
+        </w:rPr>
+        <w:t>, sin usar librerías.</w:t>
+      </w:r>
+    </w:p>
+    <w:p>
+      <w:pPr>
+        <w:numPr>
+          <w:ilvl w:val="0"/>
+          <w:numId w:val="12"/>
+        </w:numPr>
+        <w:spacing w:after="0"/>
+        <w:rPr>
+          <w:sz w:val="28"/>
+          <w:szCs w:val="28"/>
+          <w:lang w:val="es-ES"/>
+        </w:rPr>
+      </w:pPr>
+      <w:r>
+        <w:rPr>
+          <w:b/>
+          <w:bCs/>
+          <w:sz w:val="28"/>
+          <w:szCs w:val="28"/>
+          <w:lang w:val="es-ES"/>
+        </w:rPr>
+        <w:t>Qué retorna:</w:t>
+      </w:r>
+      <w:r>
+        <w:rPr>
+          <w:sz w:val="28"/>
+          <w:szCs w:val="28"/>
+          <w:lang w:val="es-ES"/>
+        </w:rPr>
+        <w:t xml:space="preserve"> El flujo del programa (el estado de salida o finalización). </w:t>
+      </w:r>
+    </w:p>
+    <w:p>
+      <w:pPr>
+        <w:numPr>
+          <w:ilvl w:val="0"/>
+          <w:numId w:val="12"/>
+        </w:numPr>
+        <w:spacing w:after="0"/>
+        <w:rPr>
+          <w:sz w:val="28"/>
+          <w:szCs w:val="28"/>
+          <w:lang w:val="es-ES"/>
+        </w:rPr>
+      </w:pPr>
+      <w:r>
+        <w:rPr>
+          <w:b/>
+          <w:bCs/>
+          <w:sz w:val="28"/>
+          <w:szCs w:val="28"/>
+          <w:lang w:val="es-ES"/>
+        </w:rPr>
+        <w:t>Lógica y Conexión:</w:t>
+      </w:r>
+      <w:r>
+        <w:rPr>
+          <w:sz w:val="28"/>
+          <w:szCs w:val="28"/>
+          <w:lang w:val="es-ES"/>
+        </w:rPr>
+        <w:t xml:space="preserve"> Este archivo solo imprime el menú principal, captura excepciones (errores try-catch) y </w:t>
+      </w:r>
+      <w:r>
+        <w:rPr>
+          <w:sz w:val="28"/>
+          <w:szCs w:val="28"/>
+          <w:lang w:val="es-ES"/>
+        </w:rPr>
+        <w:t>maneja</w:t>
+      </w:r>
+      <w:r>
+        <w:rPr>
+          <w:sz w:val="28"/>
+          <w:szCs w:val="28"/>
+          <w:lang w:val="es-ES"/>
+        </w:rPr>
+        <w:t xml:space="preserve"> las llamadas a los demás módulos.</w:t>
+      </w:r>
+      <w:r>
+        <w:rPr>
+          <w:sz w:val="28"/>
+          <w:szCs w:val="28"/>
+          <w:lang w:val="es-ES"/>
+        </w:rPr>
+        <w:t xml:space="preserve"> S</w:t>
+      </w:r>
+      <w:r>
+        <w:rPr>
+          <w:sz w:val="28"/>
+          <w:szCs w:val="28"/>
+          <w:lang w:val="es-ES"/>
+        </w:rPr>
+        <w:t>olo será para agregar una nueva opción al menú que llame a una función que ya</w:t>
+      </w:r>
+      <w:r>
+        <w:rPr>
+          <w:sz w:val="28"/>
+          <w:szCs w:val="28"/>
+          <w:lang w:val="es-ES"/>
+        </w:rPr>
+        <w:t xml:space="preserve"> se programó </w:t>
+      </w:r>
+      <w:r>
+        <w:rPr>
+          <w:sz w:val="28"/>
+          <w:szCs w:val="28"/>
+          <w:lang w:val="es-ES"/>
+        </w:rPr>
+        <w:t xml:space="preserve">en otro archivo. </w:t>
+      </w:r>
+    </w:p>
+    <w:p>
+      <w:pPr>
+        <w:spacing w:after="0"/>
+        <w:rPr>
+          <w:sz w:val="28"/>
+          <w:szCs w:val="28"/>
+          <w:lang w:val="es-ES"/>
+        </w:rPr>
+      </w:pPr>
+    </w:p>
+    <w:p>
+      <w:pPr>
+        <w:spacing w:after="0"/>
+        <w:rPr>
+          <w:b/>
+          <w:bCs/>
+          <w:sz w:val="28"/>
+          <w:szCs w:val="28"/>
+          <w:lang w:val="es-ES"/>
+        </w:rPr>
+      </w:pPr>
+      <w:r>
+        <w:rPr>
+          <w:b/>
+          <w:bCs/>
+          <w:sz w:val="28"/>
+          <w:szCs w:val="28"/>
+          <w:lang w:val="es-ES"/>
+        </w:rPr>
+        <w:t>2. Módulo Estático y de Persistencia (</w:t>
+      </w:r>
+      <w:r>
+        <w:rPr>
+          <w:sz w:val="28"/>
+          <w:szCs w:val="28"/>
+          <w:lang w:val="es-ES"/>
+        </w:rPr>
+        <w:t>centro/</w:t>
+      </w:r>
+      <w:r>
+        <w:rPr>
+          <w:b/>
+          <w:bCs/>
+          <w:sz w:val="28"/>
+          <w:szCs w:val="28"/>
+          <w:lang w:val="es-ES"/>
+        </w:rPr>
+        <w:t>)</w:t>
+      </w:r>
+    </w:p>
+    <w:p>
+      <w:pPr>
+        <w:spacing w:after="0"/>
+        <w:rPr>
+          <w:sz w:val="28"/>
+          <w:szCs w:val="28"/>
+          <w:lang w:val="es-ES"/>
+        </w:rPr>
+      </w:pPr>
+      <w:r>
+        <w:rPr>
+          <w:sz w:val="28"/>
+          <w:szCs w:val="28"/>
+          <w:lang w:val="es-ES"/>
+        </w:rPr>
+        <w:t xml:space="preserve">Aquí se ubican los cimientos del proyecto, como </w:t>
+      </w:r>
+      <w:proofErr w:type="spellStart"/>
+      <w:r>
+        <w:rPr>
+          <w:sz w:val="28"/>
+          <w:szCs w:val="28"/>
+          <w:lang w:val="es-ES"/>
+        </w:rPr>
+        <w:t>estructuras_base</w:t>
+      </w:r>
+      <w:proofErr w:type="spellEnd"/>
+      <w:r>
+        <w:rPr>
+          <w:sz w:val="28"/>
+          <w:szCs w:val="28"/>
+          <w:lang w:val="es-ES"/>
+        </w:rPr>
+        <w:t xml:space="preserve"> y </w:t>
+      </w:r>
+      <w:proofErr w:type="spellStart"/>
+      <w:r>
+        <w:rPr>
+          <w:sz w:val="28"/>
+          <w:szCs w:val="28"/>
+          <w:lang w:val="es-ES"/>
+        </w:rPr>
+        <w:t>gestor_archivos</w:t>
+      </w:r>
+      <w:proofErr w:type="spellEnd"/>
+      <w:r>
+        <w:rPr>
+          <w:sz w:val="28"/>
+          <w:szCs w:val="28"/>
+          <w:lang w:val="es-ES"/>
+        </w:rPr>
+        <w:t xml:space="preserve">. Es la única parte autorizada para interactuar con el almacenamiento. </w:t>
+      </w:r>
+    </w:p>
+    <w:p>
+      <w:pPr>
+        <w:spacing w:after="0"/>
+        <w:rPr>
+          <w:sz w:val="28"/>
+          <w:szCs w:val="28"/>
+          <w:lang w:val="es-ES"/>
+        </w:rPr>
+      </w:pPr>
+      <w:r>
+        <w:rPr>
+          <w:sz w:val="28"/>
+          <w:szCs w:val="28"/>
+          <w:lang w:val="es-ES"/>
+        </w:rPr>
+        <w:br/>
+      </w:r>
+    </w:p>
+    <w:p>
+      <w:pPr>
+        <w:numPr>
+          <w:ilvl w:val="0"/>
+          <w:numId w:val="13"/>
+        </w:numPr>
+        <w:spacing w:after="0"/>
+        <w:rPr>
+          <w:sz w:val="28"/>
+          <w:szCs w:val="28"/>
+          <w:lang w:val="es-ES"/>
+        </w:rPr>
+      </w:pPr>
+      <w:r>
+        <w:rPr>
+          <w:b/>
+          <w:bCs/>
+          <w:sz w:val="28"/>
+          <w:szCs w:val="28"/>
+          <w:lang w:val="es-ES"/>
+        </w:rPr>
+        <w:t>Qué recibe:</w:t>
+      </w:r>
+      <w:r>
+        <w:rPr>
+          <w:sz w:val="28"/>
+          <w:szCs w:val="28"/>
+          <w:lang w:val="es-ES"/>
+        </w:rPr>
+        <w:t xml:space="preserve"> Peticiones de los módulos dinámicos (ej. un "ID de usuario" o "datos a guardar"). </w:t>
+      </w:r>
+    </w:p>
+    <w:p>
+      <w:pPr>
+        <w:numPr>
+          <w:ilvl w:val="0"/>
+          <w:numId w:val="13"/>
+        </w:numPr>
+        <w:spacing w:after="0"/>
+        <w:rPr>
+          <w:sz w:val="28"/>
+          <w:szCs w:val="28"/>
+          <w:lang w:val="es-ES"/>
+        </w:rPr>
+      </w:pPr>
+      <w:r>
+        <w:rPr>
+          <w:b/>
+          <w:bCs/>
+          <w:sz w:val="28"/>
+          <w:szCs w:val="28"/>
+          <w:lang w:val="es-ES"/>
+        </w:rPr>
+        <w:t>Qué retorna:</w:t>
+      </w:r>
+      <w:r>
+        <w:rPr>
+          <w:sz w:val="28"/>
+          <w:szCs w:val="28"/>
+          <w:lang w:val="es-ES"/>
+        </w:rPr>
+        <w:t xml:space="preserve"> Objetos de datos completos (usando constructores de copia para no dañar los originales) o confirmaciones de escritura (booleanos). </w:t>
+      </w:r>
+    </w:p>
+    <w:p>
+      <w:pPr>
+        <w:numPr>
+          <w:ilvl w:val="0"/>
+          <w:numId w:val="13"/>
+        </w:numPr>
+        <w:spacing w:after="0"/>
+        <w:rPr>
+          <w:sz w:val="28"/>
+          <w:szCs w:val="28"/>
+          <w:lang w:val="es-ES"/>
+        </w:rPr>
+      </w:pPr>
+      <w:r>
+        <w:rPr>
+          <w:b/>
+          <w:bCs/>
+          <w:sz w:val="28"/>
+          <w:szCs w:val="28"/>
+          <w:lang w:val="es-ES"/>
+        </w:rPr>
+        <w:lastRenderedPageBreak/>
+        <w:t>Lógica y Conexión:</w:t>
+      </w:r>
+      <w:r>
+        <w:rPr>
+          <w:sz w:val="28"/>
+          <w:szCs w:val="28"/>
+          <w:lang w:val="es-ES"/>
+        </w:rPr>
+        <w:t xml:space="preserve"> Actúa como la "base de datos". Lee los archivos de texto, ensambla los esqueletos (Usuarios, Álbumes, Mensajes) y se los entrega a los módulos dinámicos para que trabajen con ellos. De este modo, mantienen la memoria RAM optimizada al no cargar cosas innecesarias. </w:t>
+      </w:r>
+    </w:p>
+    <w:p>
+      <w:pPr>
+        <w:spacing w:after="0"/>
+        <w:rPr>
+          <w:sz w:val="28"/>
+          <w:szCs w:val="28"/>
+          <w:lang w:val="es-ES"/>
+        </w:rPr>
+      </w:pPr>
+    </w:p>
+    <w:p>
+      <w:pPr>
+        <w:spacing w:after="0"/>
+        <w:rPr>
+          <w:b/>
+          <w:bCs/>
+          <w:sz w:val="28"/>
+          <w:szCs w:val="28"/>
+          <w:lang w:val="en-US"/>
+        </w:rPr>
+      </w:pPr>
+      <w:r>
+        <w:rPr>
+          <w:b/>
+          <w:bCs/>
+          <w:sz w:val="28"/>
+          <w:szCs w:val="28"/>
+          <w:lang w:val="en-US"/>
+        </w:rPr>
+        <w:t xml:space="preserve">3. </w:t>
+      </w:r>
+      <w:proofErr w:type="spellStart"/>
+      <w:r>
+        <w:rPr>
+          <w:b/>
+          <w:bCs/>
+          <w:sz w:val="28"/>
+          <w:szCs w:val="28"/>
+          <w:lang w:val="en-US"/>
+        </w:rPr>
+        <w:t>Módulo</w:t>
+      </w:r>
+      <w:proofErr w:type="spellEnd"/>
+      <w:r>
+        <w:rPr>
+          <w:b/>
+          <w:bCs/>
+          <w:sz w:val="28"/>
+          <w:szCs w:val="28"/>
+          <w:lang w:val="en-US"/>
+        </w:rPr>
+        <w:t xml:space="preserve"> </w:t>
+      </w:r>
+      <w:proofErr w:type="spellStart"/>
+      <w:r>
+        <w:rPr>
+          <w:b/>
+          <w:bCs/>
+          <w:sz w:val="28"/>
+          <w:szCs w:val="28"/>
+          <w:lang w:val="en-US"/>
+        </w:rPr>
+        <w:t>Dinámico</w:t>
+      </w:r>
+      <w:proofErr w:type="spellEnd"/>
+      <w:r>
+        <w:rPr>
+          <w:b/>
+          <w:bCs/>
+          <w:sz w:val="28"/>
+          <w:szCs w:val="28"/>
+          <w:lang w:val="en-US"/>
+        </w:rPr>
+        <w:t xml:space="preserve">: </w:t>
+      </w:r>
+      <w:proofErr w:type="spellStart"/>
+      <w:r>
+        <w:rPr>
+          <w:b/>
+          <w:bCs/>
+          <w:sz w:val="28"/>
+          <w:szCs w:val="28"/>
+          <w:lang w:val="en-US"/>
+        </w:rPr>
+        <w:t>Autenticación</w:t>
+      </w:r>
+      <w:proofErr w:type="spellEnd"/>
+      <w:r>
+        <w:rPr>
+          <w:b/>
+          <w:bCs/>
+          <w:sz w:val="28"/>
+          <w:szCs w:val="28"/>
+          <w:lang w:val="en-US"/>
+        </w:rPr>
+        <w:t xml:space="preserve"> e </w:t>
+      </w:r>
+      <w:proofErr w:type="spellStart"/>
+      <w:r>
+        <w:rPr>
+          <w:b/>
+          <w:bCs/>
+          <w:sz w:val="28"/>
+          <w:szCs w:val="28"/>
+          <w:lang w:val="en-US"/>
+        </w:rPr>
+        <w:t>Inicio</w:t>
+      </w:r>
+      <w:proofErr w:type="spellEnd"/>
+    </w:p>
+    <w:p>
+      <w:pPr>
+        <w:numPr>
+          <w:ilvl w:val="0"/>
+          <w:numId w:val="14"/>
+        </w:numPr>
+        <w:spacing w:after="0"/>
+        <w:rPr>
+          <w:sz w:val="28"/>
+          <w:szCs w:val="28"/>
+          <w:lang w:val="es-ES"/>
+        </w:rPr>
+      </w:pPr>
+      <w:r>
+        <w:rPr>
+          <w:b/>
+          <w:bCs/>
+          <w:sz w:val="28"/>
+          <w:szCs w:val="28"/>
+          <w:lang w:val="es-ES"/>
+        </w:rPr>
+        <w:t>Qué recibe:</w:t>
+      </w:r>
+      <w:r>
+        <w:rPr>
+          <w:sz w:val="28"/>
+          <w:szCs w:val="28"/>
+          <w:lang w:val="es-ES"/>
+        </w:rPr>
+        <w:t xml:space="preserve"> Credenciales (ID y contraseña). </w:t>
+      </w:r>
+    </w:p>
+    <w:p>
+      <w:pPr>
+        <w:numPr>
+          <w:ilvl w:val="0"/>
+          <w:numId w:val="14"/>
+        </w:numPr>
+        <w:spacing w:after="0"/>
+        <w:rPr>
+          <w:sz w:val="28"/>
+          <w:szCs w:val="28"/>
+          <w:lang w:val="es-ES"/>
+        </w:rPr>
+      </w:pPr>
+      <w:r>
+        <w:rPr>
+          <w:b/>
+          <w:bCs/>
+          <w:sz w:val="28"/>
+          <w:szCs w:val="28"/>
+          <w:lang w:val="es-ES"/>
+        </w:rPr>
+        <w:t>Qué retorna:</w:t>
+      </w:r>
+      <w:r>
+        <w:rPr>
+          <w:sz w:val="28"/>
+          <w:szCs w:val="28"/>
+          <w:lang w:val="es-ES"/>
+        </w:rPr>
+        <w:t xml:space="preserve"> Un booleano de autorización (Acceso concedido/denegado) y el objeto del perfil del usuario que acaba de ingresar. </w:t>
+      </w:r>
+    </w:p>
+    <w:p>
+      <w:pPr>
+        <w:numPr>
+          <w:ilvl w:val="0"/>
+          <w:numId w:val="14"/>
+        </w:numPr>
+        <w:spacing w:after="0"/>
+        <w:rPr>
+          <w:sz w:val="28"/>
+          <w:szCs w:val="28"/>
+          <w:lang w:val="es-ES"/>
+        </w:rPr>
+      </w:pPr>
+      <w:r>
+        <w:rPr>
+          <w:b/>
+          <w:bCs/>
+          <w:sz w:val="28"/>
+          <w:szCs w:val="28"/>
+          <w:lang w:val="es-ES"/>
+        </w:rPr>
+        <w:t>Lógica y Conexión:</w:t>
+      </w:r>
+      <w:r>
+        <w:rPr>
+          <w:sz w:val="28"/>
+          <w:szCs w:val="28"/>
+          <w:lang w:val="es-ES"/>
+        </w:rPr>
+        <w:t xml:space="preserve"> Primero hace una búsqueda ligera en el Gestor de Archivos validando solo credenciales para no gastar memoria. Si es correcto, carga el menú principal y cruza información para mostrar las tres fotos de amigos iniciales basadas en el peso matemático de interacciones.</w:t>
+      </w:r>
+    </w:p>
+    <w:p>
+      <w:pPr>
+        <w:spacing w:after="0"/>
+        <w:rPr>
+          <w:sz w:val="28"/>
+          <w:szCs w:val="28"/>
+          <w:lang w:val="es-ES"/>
+        </w:rPr>
+      </w:pPr>
+    </w:p>
+    <w:p>
+      <w:pPr>
+        <w:spacing w:after="0"/>
+        <w:rPr>
+          <w:b/>
+          <w:bCs/>
+          <w:sz w:val="28"/>
+          <w:szCs w:val="28"/>
+          <w:lang w:val="es-ES"/>
+        </w:rPr>
+      </w:pPr>
+      <w:r>
+        <w:rPr>
+          <w:b/>
+          <w:bCs/>
+          <w:sz w:val="28"/>
+          <w:szCs w:val="28"/>
+          <w:lang w:val="es-ES"/>
+        </w:rPr>
+        <w:t>4. Módulo Dinámico: Gestión de Amistades y Sugerencias</w:t>
+      </w:r>
+    </w:p>
+    <w:p>
+      <w:pPr>
+        <w:numPr>
+          <w:ilvl w:val="0"/>
+          <w:numId w:val="15"/>
+        </w:numPr>
+        <w:spacing w:after="0"/>
+        <w:rPr>
+          <w:sz w:val="28"/>
+          <w:szCs w:val="28"/>
+          <w:lang w:val="es-ES"/>
+        </w:rPr>
+      </w:pPr>
+      <w:r>
+        <w:rPr>
+          <w:b/>
+          <w:bCs/>
+          <w:sz w:val="28"/>
+          <w:szCs w:val="28"/>
+          <w:lang w:val="es-ES"/>
+        </w:rPr>
+        <w:t>Qué recibe:</w:t>
+      </w:r>
+      <w:r>
+        <w:rPr>
+          <w:sz w:val="28"/>
+          <w:szCs w:val="28"/>
+          <w:lang w:val="es-ES"/>
+        </w:rPr>
+        <w:t xml:space="preserve"> El objeto del usuario activo, el nombre/ID a buscar, y la cantidad de sugerencias requeridas (K). </w:t>
+      </w:r>
+    </w:p>
+    <w:p>
+      <w:pPr>
+        <w:numPr>
+          <w:ilvl w:val="0"/>
+          <w:numId w:val="15"/>
+        </w:numPr>
+        <w:spacing w:after="0"/>
+        <w:rPr>
+          <w:sz w:val="28"/>
+          <w:szCs w:val="28"/>
+          <w:lang w:val="es-ES"/>
+        </w:rPr>
+      </w:pPr>
+      <w:r>
+        <w:rPr>
+          <w:b/>
+          <w:bCs/>
+          <w:sz w:val="28"/>
+          <w:szCs w:val="28"/>
+          <w:lang w:val="es-ES"/>
+        </w:rPr>
+        <w:t>Qué retorna:</w:t>
+      </w:r>
+      <w:r>
+        <w:rPr>
+          <w:sz w:val="28"/>
+          <w:szCs w:val="28"/>
+          <w:lang w:val="es-ES"/>
+        </w:rPr>
+        <w:t xml:space="preserve"> Listados de usuarios o la actualización del estado de una solicitud (un cambio de false a true). </w:t>
+      </w:r>
+    </w:p>
+    <w:p>
+      <w:pPr>
+        <w:spacing w:after="0"/>
+        <w:rPr>
+          <w:sz w:val="28"/>
+          <w:szCs w:val="28"/>
+          <w:lang w:val="es-ES"/>
+        </w:rPr>
+      </w:pPr>
+    </w:p>
+    <w:p>
+      <w:pPr>
+        <w:numPr>
+          <w:ilvl w:val="0"/>
+          <w:numId w:val="15"/>
+        </w:numPr>
+        <w:spacing w:after="0"/>
+        <w:rPr>
+          <w:sz w:val="28"/>
+          <w:szCs w:val="28"/>
+          <w:lang w:val="en-US"/>
+        </w:rPr>
+      </w:pPr>
+      <w:proofErr w:type="spellStart"/>
+      <w:r>
+        <w:rPr>
+          <w:b/>
+          <w:bCs/>
+          <w:sz w:val="28"/>
+          <w:szCs w:val="28"/>
+          <w:lang w:val="en-US"/>
+        </w:rPr>
+        <w:t>Lógica</w:t>
+      </w:r>
+      <w:proofErr w:type="spellEnd"/>
+      <w:r>
+        <w:rPr>
+          <w:b/>
+          <w:bCs/>
+          <w:sz w:val="28"/>
+          <w:szCs w:val="28"/>
+          <w:lang w:val="en-US"/>
+        </w:rPr>
+        <w:t xml:space="preserve"> y </w:t>
+      </w:r>
+      <w:proofErr w:type="spellStart"/>
+      <w:r>
+        <w:rPr>
+          <w:b/>
+          <w:bCs/>
+          <w:sz w:val="28"/>
+          <w:szCs w:val="28"/>
+          <w:lang w:val="en-US"/>
+        </w:rPr>
+        <w:t>Conexión</w:t>
+      </w:r>
+      <w:proofErr w:type="spellEnd"/>
+      <w:r>
+        <w:rPr>
+          <w:b/>
+          <w:bCs/>
+          <w:sz w:val="28"/>
+          <w:szCs w:val="28"/>
+          <w:lang w:val="en-US"/>
+        </w:rPr>
+        <w:t>:</w:t>
+      </w:r>
+    </w:p>
+    <w:p>
+      <w:pPr>
+        <w:spacing w:after="0"/>
+        <w:rPr>
+          <w:sz w:val="28"/>
+          <w:szCs w:val="28"/>
+          <w:lang w:val="en-US"/>
+        </w:rPr>
+      </w:pPr>
+      <w:r>
+        <w:rPr>
+          <w:sz w:val="28"/>
+          <w:szCs w:val="28"/>
+          <w:lang w:val="en-US"/>
+        </w:rPr>
+        <w:br/>
+      </w:r>
+    </w:p>
+    <w:p>
+      <w:pPr>
+        <w:numPr>
+          <w:ilvl w:val="1"/>
+          <w:numId w:val="15"/>
+        </w:numPr>
+        <w:spacing w:after="0"/>
+        <w:rPr>
+          <w:sz w:val="28"/>
+          <w:szCs w:val="28"/>
+          <w:lang w:val="es-ES"/>
+        </w:rPr>
+      </w:pPr>
+      <w:r>
+        <w:rPr>
+          <w:b/>
+          <w:bCs/>
+          <w:sz w:val="28"/>
+          <w:szCs w:val="28"/>
+          <w:lang w:val="es-ES"/>
+        </w:rPr>
+        <w:t>Sugerencias:</w:t>
+      </w:r>
+      <w:r>
+        <w:rPr>
+          <w:sz w:val="28"/>
+          <w:szCs w:val="28"/>
+          <w:lang w:val="es-ES"/>
+        </w:rPr>
+        <w:t xml:space="preserve"> Extrae del "Centro" una matriz de adyacencia (una tabla de ceros y unos). Cruza rápidamente quién conoce a quién y aplica un algoritmo matemático para retornar a los usuarios más conectados, ordenados por prioridad. </w:t>
+      </w:r>
+    </w:p>
+    <w:p>
+      <w:pPr>
+        <w:spacing w:after="0"/>
+        <w:rPr>
+          <w:sz w:val="28"/>
+          <w:szCs w:val="28"/>
+          <w:lang w:val="es-ES"/>
+        </w:rPr>
+      </w:pPr>
+    </w:p>
+    <w:p>
+      <w:pPr>
+        <w:numPr>
+          <w:ilvl w:val="1"/>
+          <w:numId w:val="15"/>
+        </w:numPr>
+        <w:spacing w:after="0"/>
+        <w:rPr>
+          <w:sz w:val="28"/>
+          <w:szCs w:val="28"/>
+          <w:lang w:val="es-ES"/>
+        </w:rPr>
+      </w:pPr>
+      <w:r>
+        <w:rPr>
+          <w:b/>
+          <w:bCs/>
+          <w:sz w:val="28"/>
+          <w:szCs w:val="28"/>
+          <w:lang w:val="es-ES"/>
+        </w:rPr>
+        <w:lastRenderedPageBreak/>
+        <w:t>Solicitudes:</w:t>
+      </w:r>
+      <w:r>
+        <w:rPr>
+          <w:sz w:val="28"/>
+          <w:szCs w:val="28"/>
+          <w:lang w:val="es-ES"/>
+        </w:rPr>
+        <w:t xml:space="preserve"> Utiliza </w:t>
+      </w:r>
+      <w:proofErr w:type="spellStart"/>
+      <w:r>
+        <w:rPr>
+          <w:i/>
+          <w:iCs/>
+          <w:sz w:val="28"/>
+          <w:szCs w:val="28"/>
+          <w:lang w:val="es-ES"/>
+        </w:rPr>
+        <w:t>setters</w:t>
+      </w:r>
+      <w:proofErr w:type="spellEnd"/>
+      <w:r>
+        <w:rPr>
+          <w:sz w:val="28"/>
+          <w:szCs w:val="28"/>
+          <w:lang w:val="es-ES"/>
+        </w:rPr>
+        <w:t xml:space="preserve"> (modificadores encapsulados) para alterar los estados de los perfiles y le avisa al Gestor de Archivos que guarde el cambio. </w:t>
+      </w:r>
+    </w:p>
+    <w:p>
+      <w:pPr>
+        <w:spacing w:after="0"/>
+        <w:rPr>
+          <w:sz w:val="28"/>
+          <w:szCs w:val="28"/>
+          <w:lang w:val="es-ES"/>
+        </w:rPr>
+      </w:pPr>
+    </w:p>
+    <w:p>
+      <w:pPr>
+        <w:spacing w:after="0"/>
+        <w:rPr>
+          <w:b/>
+          <w:bCs/>
+          <w:sz w:val="28"/>
+          <w:szCs w:val="28"/>
+          <w:lang w:val="es-ES"/>
+        </w:rPr>
+      </w:pPr>
+      <w:r>
+        <w:rPr>
+          <w:b/>
+          <w:bCs/>
+          <w:sz w:val="28"/>
+          <w:szCs w:val="28"/>
+          <w:lang w:val="es-ES"/>
+        </w:rPr>
+        <w:t>5. Módulo Dinámico: Interacción de Perfiles (Álbumes y Fotos)</w:t>
+      </w:r>
+    </w:p>
+    <w:p>
+      <w:pPr>
+        <w:numPr>
+          <w:ilvl w:val="0"/>
+          <w:numId w:val="16"/>
+        </w:numPr>
+        <w:spacing w:after="0"/>
+        <w:rPr>
+          <w:sz w:val="28"/>
+          <w:szCs w:val="28"/>
+          <w:lang w:val="es-ES"/>
+        </w:rPr>
+      </w:pPr>
+      <w:r>
+        <w:rPr>
+          <w:b/>
+          <w:bCs/>
+          <w:sz w:val="28"/>
+          <w:szCs w:val="28"/>
+          <w:lang w:val="es-ES"/>
+        </w:rPr>
+        <w:t>Qué recibe:</w:t>
+      </w:r>
+      <w:r>
+        <w:rPr>
+          <w:sz w:val="28"/>
+          <w:szCs w:val="28"/>
+          <w:lang w:val="es-ES"/>
+        </w:rPr>
+        <w:t xml:space="preserve"> El ID del amigo que se desea visitar y la acción a realizar (ver siguiente foto o </w:t>
+      </w:r>
+      <w:proofErr w:type="gramStart"/>
+      <w:r>
+        <w:rPr>
+          <w:sz w:val="28"/>
+          <w:szCs w:val="28"/>
+          <w:lang w:val="es-ES"/>
+        </w:rPr>
+        <w:t xml:space="preserve">dar </w:t>
+      </w:r>
+      <w:proofErr w:type="spellStart"/>
+      <w:r>
+        <w:rPr>
+          <w:i/>
+          <w:iCs/>
+          <w:sz w:val="28"/>
+          <w:szCs w:val="28"/>
+          <w:lang w:val="es-ES"/>
+        </w:rPr>
+        <w:t>like</w:t>
+      </w:r>
+      <w:proofErr w:type="spellEnd"/>
+      <w:proofErr w:type="gramEnd"/>
+      <w:r>
+        <w:rPr>
+          <w:sz w:val="28"/>
+          <w:szCs w:val="28"/>
+          <w:lang w:val="es-ES"/>
+        </w:rPr>
+        <w:t xml:space="preserve">). </w:t>
+      </w:r>
+    </w:p>
+    <w:p>
+      <w:pPr>
+        <w:numPr>
+          <w:ilvl w:val="0"/>
+          <w:numId w:val="16"/>
+        </w:numPr>
+        <w:spacing w:after="0"/>
+        <w:rPr>
+          <w:sz w:val="28"/>
+          <w:szCs w:val="28"/>
+          <w:lang w:val="es-ES"/>
+        </w:rPr>
+      </w:pPr>
+      <w:r>
+        <w:rPr>
+          <w:b/>
+          <w:bCs/>
+          <w:sz w:val="28"/>
+          <w:szCs w:val="28"/>
+          <w:lang w:val="es-ES"/>
+        </w:rPr>
+        <w:t>Qué retorna:</w:t>
+      </w:r>
+      <w:r>
+        <w:rPr>
+          <w:sz w:val="28"/>
+          <w:szCs w:val="28"/>
+          <w:lang w:val="es-ES"/>
+        </w:rPr>
+        <w:t xml:space="preserve"> Un carrusel visual (rutas de las fotos). </w:t>
+      </w:r>
+    </w:p>
+    <w:p>
+      <w:pPr>
+        <w:numPr>
+          <w:ilvl w:val="0"/>
+          <w:numId w:val="16"/>
+        </w:numPr>
+        <w:spacing w:after="0"/>
+        <w:rPr>
+          <w:sz w:val="28"/>
+          <w:szCs w:val="28"/>
+          <w:lang w:val="es-ES"/>
+        </w:rPr>
+      </w:pPr>
+      <w:r>
+        <w:rPr>
+          <w:b/>
+          <w:bCs/>
+          <w:sz w:val="28"/>
+          <w:szCs w:val="28"/>
+          <w:lang w:val="es-ES"/>
+        </w:rPr>
+        <w:t>Lógica y Conexión:</w:t>
+      </w:r>
+      <w:r>
+        <w:rPr>
+          <w:sz w:val="28"/>
+          <w:szCs w:val="28"/>
+          <w:lang w:val="es-ES"/>
+        </w:rPr>
+        <w:t xml:space="preserve"> Verifica el nivel de amistad; si son amigos, pide al Gestor de Archivos los álbumes privados y públicos, si no, solo los públicos. Si se otorga un </w:t>
+      </w:r>
+      <w:proofErr w:type="spellStart"/>
+      <w:r>
+        <w:rPr>
+          <w:i/>
+          <w:iCs/>
+          <w:sz w:val="28"/>
+          <w:szCs w:val="28"/>
+          <w:lang w:val="es-ES"/>
+        </w:rPr>
+        <w:t>like</w:t>
+      </w:r>
+      <w:proofErr w:type="spellEnd"/>
+      <w:r>
+        <w:rPr>
+          <w:sz w:val="28"/>
+          <w:szCs w:val="28"/>
+          <w:lang w:val="es-ES"/>
+        </w:rPr>
+        <w:t xml:space="preserve">, modifica esa bandera específica del objeto foto y la </w:t>
+      </w:r>
+      <w:proofErr w:type="spellStart"/>
+      <w:r>
+        <w:rPr>
+          <w:sz w:val="28"/>
+          <w:szCs w:val="28"/>
+          <w:lang w:val="es-ES"/>
+        </w:rPr>
+        <w:t>sobreescribe</w:t>
+      </w:r>
+      <w:proofErr w:type="spellEnd"/>
+      <w:r>
+        <w:rPr>
+          <w:sz w:val="28"/>
+          <w:szCs w:val="28"/>
+          <w:lang w:val="es-ES"/>
+        </w:rPr>
+        <w:t xml:space="preserve"> mediante el Gestor de Archivos. </w:t>
+      </w:r>
+    </w:p>
+    <w:p>
+      <w:pPr>
+        <w:spacing w:after="0"/>
+        <w:rPr>
+          <w:sz w:val="28"/>
+          <w:szCs w:val="28"/>
+          <w:lang w:val="es-ES"/>
+        </w:rPr>
+      </w:pPr>
+    </w:p>
+    <w:p>
+      <w:pPr>
+        <w:spacing w:after="0"/>
+        <w:rPr>
+          <w:b/>
+          <w:bCs/>
+          <w:sz w:val="28"/>
+          <w:szCs w:val="28"/>
+          <w:lang w:val="en-US"/>
+        </w:rPr>
+      </w:pPr>
+      <w:r>
+        <w:rPr>
+          <w:b/>
+          <w:bCs/>
+          <w:sz w:val="28"/>
+          <w:szCs w:val="28"/>
+          <w:lang w:val="en-US"/>
+        </w:rPr>
+        <w:t xml:space="preserve">6. </w:t>
+      </w:r>
+      <w:proofErr w:type="spellStart"/>
+      <w:r>
+        <w:rPr>
+          <w:b/>
+          <w:bCs/>
+          <w:sz w:val="28"/>
+          <w:szCs w:val="28"/>
+          <w:lang w:val="en-US"/>
+        </w:rPr>
+        <w:t>Módulo</w:t>
+      </w:r>
+      <w:proofErr w:type="spellEnd"/>
+      <w:r>
+        <w:rPr>
+          <w:b/>
+          <w:bCs/>
+          <w:sz w:val="28"/>
+          <w:szCs w:val="28"/>
+          <w:lang w:val="en-US"/>
+        </w:rPr>
+        <w:t xml:space="preserve"> </w:t>
+      </w:r>
+      <w:proofErr w:type="spellStart"/>
+      <w:r>
+        <w:rPr>
+          <w:b/>
+          <w:bCs/>
+          <w:sz w:val="28"/>
+          <w:szCs w:val="28"/>
+          <w:lang w:val="en-US"/>
+        </w:rPr>
+        <w:t>Dinámico</w:t>
+      </w:r>
+      <w:proofErr w:type="spellEnd"/>
+      <w:r>
+        <w:rPr>
+          <w:b/>
+          <w:bCs/>
+          <w:sz w:val="28"/>
+          <w:szCs w:val="28"/>
+          <w:lang w:val="en-US"/>
+        </w:rPr>
+        <w:t xml:space="preserve">: </w:t>
+      </w:r>
+      <w:proofErr w:type="spellStart"/>
+      <w:r>
+        <w:rPr>
+          <w:b/>
+          <w:bCs/>
+          <w:sz w:val="28"/>
+          <w:szCs w:val="28"/>
+          <w:lang w:val="en-US"/>
+        </w:rPr>
+        <w:t>Mensajería</w:t>
+      </w:r>
+      <w:proofErr w:type="spellEnd"/>
+    </w:p>
+    <w:p>
+      <w:pPr>
+        <w:numPr>
+          <w:ilvl w:val="0"/>
+          <w:numId w:val="17"/>
+        </w:numPr>
+        <w:spacing w:after="0"/>
+        <w:rPr>
+          <w:sz w:val="28"/>
+          <w:szCs w:val="28"/>
+          <w:lang w:val="es-ES"/>
+        </w:rPr>
+      </w:pPr>
+      <w:r>
+        <w:rPr>
+          <w:b/>
+          <w:bCs/>
+          <w:sz w:val="28"/>
+          <w:szCs w:val="28"/>
+          <w:lang w:val="es-ES"/>
+        </w:rPr>
+        <w:t>Qué recibe:</w:t>
+      </w:r>
+      <w:r>
+        <w:rPr>
+          <w:sz w:val="28"/>
+          <w:szCs w:val="28"/>
+          <w:lang w:val="es-ES"/>
+        </w:rPr>
+        <w:t xml:space="preserve"> Textos (máximo 512 caracteres), el ID del destinatario y fechas límite (inicio y fin para el filtrado). </w:t>
+      </w:r>
+    </w:p>
+    <w:p>
+      <w:pPr>
+        <w:numPr>
+          <w:ilvl w:val="0"/>
+          <w:numId w:val="17"/>
+        </w:numPr>
+        <w:spacing w:after="0"/>
+        <w:rPr>
+          <w:sz w:val="28"/>
+          <w:szCs w:val="28"/>
+          <w:lang w:val="es-ES"/>
+        </w:rPr>
+      </w:pPr>
+      <w:r>
+        <w:rPr>
+          <w:b/>
+          <w:bCs/>
+          <w:sz w:val="28"/>
+          <w:szCs w:val="28"/>
+          <w:lang w:val="es-ES"/>
+        </w:rPr>
+        <w:t>Qué retorna:</w:t>
+      </w:r>
+      <w:r>
+        <w:rPr>
+          <w:sz w:val="28"/>
+          <w:szCs w:val="28"/>
+          <w:lang w:val="es-ES"/>
+        </w:rPr>
+        <w:t xml:space="preserve"> Historiales de chat listados cronológicamente. </w:t>
+      </w:r>
+    </w:p>
+    <w:p>
+      <w:pPr>
+        <w:numPr>
+          <w:ilvl w:val="0"/>
+          <w:numId w:val="17"/>
+        </w:numPr>
+        <w:spacing w:after="0"/>
+        <w:rPr>
+          <w:sz w:val="28"/>
+          <w:szCs w:val="28"/>
+          <w:lang w:val="es-ES"/>
+        </w:rPr>
+      </w:pPr>
+      <w:r>
+        <w:rPr>
+          <w:b/>
+          <w:bCs/>
+          <w:sz w:val="28"/>
+          <w:szCs w:val="28"/>
+          <w:lang w:val="es-ES"/>
+        </w:rPr>
+        <w:t>Lógica y Conexión:</w:t>
+      </w:r>
+      <w:r>
+        <w:rPr>
+          <w:sz w:val="28"/>
+          <w:szCs w:val="28"/>
+          <w:lang w:val="es-ES"/>
+        </w:rPr>
+        <w:t xml:space="preserve"> Para evitar sobrecargar el perfil principal, este módulo tiene su propia gestión aislada. Para buscar mensajes antiguos, recibe el rango de fechas e implementa la "sobrecarga de operadores" (usa símbolos matemáticos como &lt;= o &gt;= para comparar fechas complejas de forma limpia y directa) y retorna solo lo que coincida. </w:t>
+      </w:r>
+    </w:p>
+    <w:p>
+      <w:pPr>
+        <w:spacing w:after="0"/>
+        <w:rPr>
+          <w:sz w:val="28"/>
+          <w:szCs w:val="28"/>
+          <w:lang w:val="es-ES"/>
+        </w:rPr>
+      </w:pPr>
+    </w:p>
+    <w:p>
+      <w:pPr>
+        <w:spacing w:after="0"/>
+        <w:rPr>
+          <w:b/>
+          <w:bCs/>
+          <w:sz w:val="28"/>
+          <w:szCs w:val="28"/>
+          <w:lang w:val="es-ES"/>
+        </w:rPr>
+      </w:pPr>
+      <w:r>
+        <w:rPr>
+          <w:b/>
+          <w:bCs/>
+          <w:sz w:val="28"/>
+          <w:szCs w:val="28"/>
+          <w:lang w:val="es-ES"/>
+        </w:rPr>
+        <w:t>7. Módulo Monitor de Recursos (</w:t>
+      </w:r>
+      <w:proofErr w:type="spellStart"/>
+      <w:r>
+        <w:rPr>
+          <w:sz w:val="28"/>
+          <w:szCs w:val="28"/>
+          <w:lang w:val="es-ES"/>
+        </w:rPr>
+        <w:t>monitor_recursos</w:t>
+      </w:r>
+      <w:proofErr w:type="spellEnd"/>
+      <w:r>
+        <w:rPr>
+          <w:b/>
+          <w:bCs/>
+          <w:sz w:val="28"/>
+          <w:szCs w:val="28"/>
+          <w:lang w:val="es-ES"/>
+        </w:rPr>
+        <w:t>)</w:t>
+      </w:r>
+    </w:p>
+    <w:p>
+      <w:pPr>
+        <w:numPr>
+          <w:ilvl w:val="0"/>
+          <w:numId w:val="18"/>
+        </w:numPr>
+        <w:spacing w:after="0"/>
+        <w:rPr>
+          <w:sz w:val="28"/>
+          <w:szCs w:val="28"/>
+          <w:lang w:val="es-ES"/>
+        </w:rPr>
+      </w:pPr>
+      <w:r>
+        <w:rPr>
+          <w:b/>
+          <w:bCs/>
+          <w:sz w:val="28"/>
+          <w:szCs w:val="28"/>
+          <w:lang w:val="es-ES"/>
+        </w:rPr>
+        <w:t>Qué recibe:</w:t>
+      </w:r>
+      <w:r>
+        <w:rPr>
+          <w:sz w:val="28"/>
+          <w:szCs w:val="28"/>
+          <w:lang w:val="es-ES"/>
+        </w:rPr>
+        <w:t xml:space="preserve"> Señales o </w:t>
+      </w:r>
+      <w:r>
+        <w:rPr>
+          <w:sz w:val="28"/>
+          <w:szCs w:val="28"/>
+          <w:lang w:val="es-ES"/>
+        </w:rPr>
+        <w:t>aviso, notificación, pulso,</w:t>
+      </w:r>
+      <w:r>
+        <w:rPr>
+          <w:sz w:val="28"/>
+          <w:szCs w:val="28"/>
+          <w:lang w:val="es-ES"/>
+        </w:rPr>
+        <w:t xml:space="preserve"> al </w:t>
+      </w:r>
+      <w:proofErr w:type="gramStart"/>
+      <w:r>
+        <w:rPr>
+          <w:sz w:val="28"/>
+          <w:szCs w:val="28"/>
+          <w:lang w:val="es-ES"/>
+        </w:rPr>
+        <w:t xml:space="preserve">terminar </w:t>
+      </w:r>
+      <w:r>
+        <w:rPr>
+          <w:sz w:val="28"/>
+          <w:szCs w:val="28"/>
+          <w:lang w:val="es-ES"/>
+        </w:rPr>
+        <w:t xml:space="preserve"> cada</w:t>
+      </w:r>
+      <w:proofErr w:type="gramEnd"/>
+      <w:r>
+        <w:rPr>
+          <w:sz w:val="28"/>
+          <w:szCs w:val="28"/>
+          <w:lang w:val="es-ES"/>
+        </w:rPr>
+        <w:t xml:space="preserve"> proceso de los módulos anteriores. </w:t>
+      </w:r>
+    </w:p>
+    <w:p>
+      <w:pPr>
+        <w:numPr>
+          <w:ilvl w:val="0"/>
+          <w:numId w:val="18"/>
+        </w:numPr>
+        <w:spacing w:after="0"/>
+        <w:rPr>
+          <w:sz w:val="28"/>
+          <w:szCs w:val="28"/>
+          <w:lang w:val="es-ES"/>
+        </w:rPr>
+      </w:pPr>
+      <w:r>
+        <w:rPr>
+          <w:b/>
+          <w:bCs/>
+          <w:sz w:val="28"/>
+          <w:szCs w:val="28"/>
+          <w:lang w:val="es-ES"/>
+        </w:rPr>
+        <w:t>Qué retorna:</w:t>
+      </w:r>
+      <w:r>
+        <w:rPr>
+          <w:sz w:val="28"/>
+          <w:szCs w:val="28"/>
+          <w:lang w:val="es-ES"/>
+        </w:rPr>
+        <w:t xml:space="preserve"> Un reporte impreso en la parte inferior</w:t>
+      </w:r>
+      <w:r>
+        <w:rPr>
+          <w:sz w:val="28"/>
+          <w:szCs w:val="28"/>
+          <w:lang w:val="es-ES"/>
+        </w:rPr>
+        <w:t xml:space="preserve"> del todo, con bastante espaciado,</w:t>
+      </w:r>
+      <w:r>
+        <w:rPr>
+          <w:sz w:val="28"/>
+          <w:szCs w:val="28"/>
+          <w:lang w:val="es-ES"/>
+        </w:rPr>
+        <w:t xml:space="preserve"> de la consola con la memoria gastada y las iteraciones realizadas. </w:t>
+      </w:r>
+    </w:p>
+    <w:p>
+      <w:pPr>
+        <w:numPr>
+          <w:ilvl w:val="0"/>
+          <w:numId w:val="18"/>
+        </w:numPr>
+        <w:spacing w:after="0"/>
+        <w:rPr>
+          <w:sz w:val="28"/>
+          <w:szCs w:val="28"/>
+          <w:lang w:val="es-ES"/>
+        </w:rPr>
+      </w:pPr>
+      <w:r>
+        <w:rPr>
+          <w:b/>
+          <w:bCs/>
+          <w:sz w:val="28"/>
+          <w:szCs w:val="28"/>
+          <w:lang w:val="es-ES"/>
+        </w:rPr>
+        <w:t>Lógica y Conexión:</w:t>
+      </w:r>
+      <w:r>
+        <w:rPr>
+          <w:sz w:val="28"/>
+          <w:szCs w:val="28"/>
+          <w:lang w:val="es-ES"/>
+        </w:rPr>
+        <w:t xml:space="preserve"> Es un contador global y silencioso. Vive en la carpeta centro. Se conecta con el </w:t>
+      </w:r>
+      <w:proofErr w:type="spellStart"/>
+      <w:r>
+        <w:rPr>
+          <w:sz w:val="28"/>
+          <w:szCs w:val="28"/>
+          <w:lang w:val="es-ES"/>
+        </w:rPr>
+        <w:t>main</w:t>
+      </w:r>
+      <w:proofErr w:type="spellEnd"/>
+      <w:r>
+        <w:rPr>
+          <w:sz w:val="28"/>
+          <w:szCs w:val="28"/>
+          <w:lang w:val="es-ES"/>
+        </w:rPr>
+        <w:t xml:space="preserve"> para que antes de terminar </w:t>
+      </w:r>
+      <w:r>
+        <w:rPr>
+          <w:sz w:val="28"/>
+          <w:szCs w:val="28"/>
+          <w:lang w:val="es-ES"/>
+        </w:rPr>
+        <w:lastRenderedPageBreak/>
+        <w:t xml:space="preserve">cualquier acción </w:t>
+      </w:r>
+      <w:r>
+        <w:rPr>
+          <w:sz w:val="28"/>
+          <w:szCs w:val="28"/>
+          <w:lang w:val="es-ES"/>
+        </w:rPr>
+        <w:t>el</w:t>
+      </w:r>
+      <w:r>
+        <w:rPr>
+          <w:sz w:val="28"/>
+          <w:szCs w:val="28"/>
+          <w:lang w:val="es-ES"/>
+        </w:rPr>
+        <w:t xml:space="preserve"> usuario (enviar un mensaje, dar un </w:t>
+      </w:r>
+      <w:proofErr w:type="spellStart"/>
+      <w:r>
+        <w:rPr>
+          <w:sz w:val="28"/>
+          <w:szCs w:val="28"/>
+          <w:lang w:val="es-ES"/>
+        </w:rPr>
+        <w:t>like</w:t>
+      </w:r>
+      <w:proofErr w:type="spellEnd"/>
+      <w:r>
+        <w:rPr>
+          <w:sz w:val="28"/>
+          <w:szCs w:val="28"/>
+          <w:lang w:val="es-ES"/>
+        </w:rPr>
+        <w:t xml:space="preserve">), el monitor limpie la pantalla actualice sus sumadores y muestre el rendimiento exacto del sistema </w:t>
+      </w:r>
+    </w:p>
+    <w:p>
+      <w:pPr>
+        <w:spacing w:after="0"/>
+        <w:rPr>
+          <w:sz w:val="28"/>
+          <w:szCs w:val="28"/>
+          <w:lang w:val="es-ES"/>
+        </w:rPr>
+      </w:pPr>
+    </w:p>
+    <w:p>
+      <w:pPr>
+        <w:spacing w:after="0"/>
+        <w:rPr>
+          <w:b/>
+          <w:bCs/>
+          <w:sz w:val="28"/>
+          <w:szCs w:val="28"/>
+          <w:lang w:val="es-ES"/>
+        </w:rPr>
+      </w:pPr>
+      <w:r>
+        <w:rPr>
+          <w:b/>
+          <w:bCs/>
+          <w:sz w:val="28"/>
+          <w:szCs w:val="28"/>
+          <w:lang w:val="es-ES"/>
+        </w:rPr>
+        <w:t>Estrategia de Trabajo en Equipo</w:t>
+      </w:r>
+    </w:p>
+    <w:p>
+      <w:pPr>
+        <w:spacing w:after="0"/>
+        <w:rPr>
+          <w:sz w:val="28"/>
+          <w:szCs w:val="28"/>
+          <w:lang w:val="es-ES"/>
+        </w:rPr>
+      </w:pPr>
+      <w:r>
+        <w:rPr>
+          <w:sz w:val="28"/>
+          <w:szCs w:val="28"/>
+          <w:lang w:val="es-ES"/>
+        </w:rPr>
+        <w:t>Dado este esquema, pueden dividirse el trabajo sin chocar:</w:t>
+      </w:r>
+    </w:p>
+    <w:p>
+      <w:pPr>
+        <w:spacing w:after="0"/>
+        <w:rPr>
+          <w:sz w:val="28"/>
+          <w:szCs w:val="28"/>
+          <w:lang w:val="es-ES"/>
+        </w:rPr>
+      </w:pPr>
+      <w:r>
+        <w:rPr>
+          <w:sz w:val="28"/>
+          <w:szCs w:val="28"/>
+          <w:lang w:val="es-ES"/>
+        </w:rPr>
+        <w:br/>
+      </w:r>
+    </w:p>
+    <w:p>
+      <w:pPr>
+        <w:numPr>
+          <w:ilvl w:val="0"/>
+          <w:numId w:val="19"/>
+        </w:numPr>
+        <w:spacing w:after="0"/>
+        <w:rPr>
+          <w:sz w:val="28"/>
+          <w:szCs w:val="28"/>
+          <w:lang w:val="es-ES"/>
+        </w:rPr>
+      </w:pPr>
+      <w:r>
+        <w:rPr>
+          <w:b/>
+          <w:bCs/>
+          <w:sz w:val="28"/>
+          <w:szCs w:val="28"/>
+          <w:lang w:val="es-ES"/>
+        </w:rPr>
+        <w:t>Juan Solarte:</w:t>
+      </w:r>
+      <w:r>
+        <w:rPr>
+          <w:sz w:val="28"/>
+          <w:szCs w:val="28"/>
+          <w:lang w:val="es-ES"/>
+        </w:rPr>
+        <w:t xml:space="preserve"> enfocar</w:t>
+      </w:r>
+      <w:r>
+        <w:rPr>
+          <w:sz w:val="28"/>
+          <w:szCs w:val="28"/>
+          <w:lang w:val="es-ES"/>
+        </w:rPr>
+        <w:t>s</w:t>
+      </w:r>
+      <w:r>
+        <w:rPr>
+          <w:sz w:val="28"/>
+          <w:szCs w:val="28"/>
+          <w:lang w:val="es-ES"/>
+        </w:rPr>
+        <w:t xml:space="preserve">e en construir toda la lógica del </w:t>
+      </w:r>
+      <w:r>
+        <w:rPr>
+          <w:b/>
+          <w:bCs/>
+          <w:sz w:val="28"/>
+          <w:szCs w:val="28"/>
+          <w:lang w:val="es-ES"/>
+        </w:rPr>
+        <w:t>Módulo de Mensajería</w:t>
+      </w:r>
+      <w:r>
+        <w:rPr>
+          <w:sz w:val="28"/>
+          <w:szCs w:val="28"/>
+          <w:lang w:val="es-ES"/>
+        </w:rPr>
+        <w:t xml:space="preserve"> y </w:t>
+      </w:r>
+      <w:r>
+        <w:rPr>
+          <w:b/>
+          <w:bCs/>
+          <w:sz w:val="28"/>
+          <w:szCs w:val="28"/>
+          <w:lang w:val="es-ES"/>
+        </w:rPr>
+        <w:t>Gestión de Amistades</w:t>
+      </w:r>
+      <w:r>
+        <w:rPr>
+          <w:sz w:val="28"/>
+          <w:szCs w:val="28"/>
+          <w:lang w:val="es-ES"/>
+        </w:rPr>
+        <w:t xml:space="preserve"> en la carpeta </w:t>
+      </w:r>
+      <w:proofErr w:type="spellStart"/>
+      <w:r>
+        <w:rPr>
+          <w:sz w:val="28"/>
+          <w:szCs w:val="28"/>
+          <w:lang w:val="es-ES"/>
+        </w:rPr>
+        <w:t>módulos_dinámicos</w:t>
+      </w:r>
+      <w:proofErr w:type="spellEnd"/>
+      <w:r>
+        <w:rPr>
+          <w:sz w:val="28"/>
+          <w:szCs w:val="28"/>
+          <w:lang w:val="es-ES"/>
+        </w:rPr>
+        <w:t>.</w:t>
+      </w:r>
+    </w:p>
+    <w:p>
+      <w:pPr>
+        <w:numPr>
+          <w:ilvl w:val="0"/>
+          <w:numId w:val="19"/>
+        </w:numPr>
+        <w:spacing w:after="0"/>
+        <w:rPr>
+          <w:sz w:val="28"/>
+          <w:szCs w:val="28"/>
+          <w:lang w:val="es-ES"/>
+        </w:rPr>
+      </w:pPr>
+      <w:r>
+        <w:rPr>
+          <w:b/>
+          <w:bCs/>
+          <w:sz w:val="28"/>
+          <w:szCs w:val="28"/>
+          <w:lang w:val="es-ES"/>
+        </w:rPr>
+        <w:t>Daniel Mosquera:</w:t>
+      </w:r>
+      <w:r>
+        <w:rPr>
+          <w:sz w:val="28"/>
+          <w:szCs w:val="28"/>
+          <w:lang w:val="es-ES"/>
+        </w:rPr>
+        <w:t xml:space="preserve"> estar en otra rama armando los cimientos en la carpeta centro (diseñando el gestor_archivos.cpp, estructuras_base.cpp y el monitor_recursos.cpp).</w:t>
+      </w:r>
+    </w:p>
+    <w:p>
+      <w:pPr>
+        <w:numPr>
+          <w:ilvl w:val="0"/>
+          <w:numId w:val="19"/>
+        </w:numPr>
+        <w:spacing w:after="0"/>
+        <w:rPr>
+          <w:sz w:val="28"/>
+          <w:szCs w:val="28"/>
+          <w:lang w:val="es-ES"/>
+        </w:rPr>
+      </w:pPr>
+      <w:r>
+        <w:rPr>
+          <w:sz w:val="28"/>
+          <w:szCs w:val="28"/>
+          <w:lang w:val="es-ES"/>
+        </w:rPr>
+        <w:t>ambos se conectan en el main.cpp, simplemente se encarga de invocar las funciones macro.</w:t>
+      </w:r>
+    </w:p>
+    <w:p>
+      <w:pPr>
+        <w:spacing w:after="0"/>
+        <w:rPr>
+          <w:sz w:val="28"/>
+          <w:szCs w:val="28"/>
+          <w:lang w:val="es-ES"/>
+        </w:rPr>
+      </w:pPr>
+    </w:p>
+    <w:p>
+      <w:pPr>
+        <w:spacing w:after="0"/>
+        <w:rPr>
+          <w:sz w:val="28"/>
+          <w:szCs w:val="28"/>
+          <w:lang w:val="es-ES"/>
+        </w:rPr>
+      </w:pPr>
+    </w:p>
+    <w:p>
+      <w:pPr>
+        <w:spacing w:after="0"/>
+        <w:rPr>
+          <w:sz w:val="28"/>
+          <w:szCs w:val="28"/>
+          <w:lang w:val="es-ES"/>
+        </w:rPr>
+      </w:pPr>
+      <w:r>
+        <w:rPr>
+          <w:sz w:val="28"/>
+          <w:szCs w:val="28"/>
+          <w:lang w:val="es-ES"/>
+        </w:rPr>
+        <w:t>/</w:t>
+      </w:r>
+      <w:proofErr w:type="spellStart"/>
+      <w:r>
+        <w:rPr>
+          <w:sz w:val="28"/>
+          <w:szCs w:val="28"/>
+          <w:lang w:val="es-ES"/>
+        </w:rPr>
+        <w:t>UdeABook_Proyecto</w:t>
+      </w:r>
+      <w:proofErr w:type="spellEnd"/>
+    </w:p>
+    <w:p>
+      <w:pPr>
+        <w:spacing w:after="0"/>
+        <w:rPr>
+          <w:sz w:val="28"/>
+          <w:szCs w:val="28"/>
+          <w:lang w:val="es-ES"/>
+        </w:rPr>
+      </w:pPr>
+      <w:r>
+        <w:rPr>
+          <w:sz w:val="28"/>
+          <w:szCs w:val="28"/>
+          <w:lang w:val="es-ES"/>
+        </w:rPr>
+        <w:t>│</w:t>
+      </w:r>
+    </w:p>
+    <w:p>
+      <w:pPr>
+        <w:spacing w:after="0"/>
+        <w:rPr>
+          <w:sz w:val="28"/>
+          <w:szCs w:val="28"/>
+          <w:lang w:val="es-ES"/>
+        </w:rPr>
+      </w:pPr>
+      <w:r>
+        <w:rPr>
+          <w:rFonts w:ascii="MS Gothic" w:eastAsia="MS Gothic" w:hAnsi="MS Gothic" w:cs="MS Gothic" w:hint="eastAsia"/>
+          <w:sz w:val="28"/>
+          <w:szCs w:val="28"/>
+          <w:lang w:val="es-ES"/>
+        </w:rPr>
+        <w:t>├</w:t>
+      </w:r>
+      <w:r>
+        <w:rPr>
+          <w:rFonts w:ascii="Aptos" w:hAnsi="Aptos" w:cs="Aptos"/>
+          <w:sz w:val="28"/>
+          <w:szCs w:val="28"/>
+          <w:lang w:val="es-ES"/>
+        </w:rPr>
+        <w:t>──</w:t>
+      </w:r>
+      <w:r>
+        <w:rPr>
+          <w:sz w:val="28"/>
+          <w:szCs w:val="28"/>
+          <w:lang w:val="es-ES"/>
+        </w:rPr>
+        <w:t xml:space="preserve"> /centro</w:t>
+      </w:r>
+    </w:p>
+    <w:p>
+      <w:pPr>
+        <w:spacing w:after="0"/>
+        <w:rPr>
+          <w:sz w:val="28"/>
+          <w:szCs w:val="28"/>
+          <w:lang w:val="es-ES"/>
+        </w:rPr>
+      </w:pPr>
+      <w:r>
+        <w:rPr>
+          <w:sz w:val="28"/>
+          <w:szCs w:val="28"/>
+          <w:lang w:val="es-ES"/>
+        </w:rPr>
+        <w:t xml:space="preserve">│    </w:t>
+      </w:r>
+      <w:r>
+        <w:rPr>
+          <w:rFonts w:ascii="MS Gothic" w:eastAsia="MS Gothic" w:hAnsi="MS Gothic" w:cs="MS Gothic" w:hint="eastAsia"/>
+          <w:sz w:val="28"/>
+          <w:szCs w:val="28"/>
+          <w:lang w:val="es-ES"/>
+        </w:rPr>
+        <w:t>├</w:t>
+      </w:r>
+      <w:r>
+        <w:rPr>
+          <w:rFonts w:ascii="Aptos" w:hAnsi="Aptos" w:cs="Aptos"/>
+          <w:sz w:val="28"/>
+          <w:szCs w:val="28"/>
+          <w:lang w:val="es-ES"/>
+        </w:rPr>
+        <w:t>──</w:t>
+      </w:r>
+      <w:r>
+        <w:rPr>
+          <w:sz w:val="28"/>
+          <w:szCs w:val="28"/>
+          <w:lang w:val="es-ES"/>
+        </w:rPr>
+        <w:t xml:space="preserve"> </w:t>
+      </w:r>
+      <w:proofErr w:type="spellStart"/>
+      <w:r>
+        <w:rPr>
+          <w:sz w:val="28"/>
+          <w:szCs w:val="28"/>
+          <w:lang w:val="es-ES"/>
+        </w:rPr>
+        <w:t>estructuras_base.</w:t>
+      </w:r>
+      <w:proofErr w:type="gramStart"/>
+      <w:r>
+        <w:rPr>
+          <w:sz w:val="28"/>
+          <w:szCs w:val="28"/>
+          <w:lang w:val="es-ES"/>
+        </w:rPr>
+        <w:t>h</w:t>
+      </w:r>
+      <w:proofErr w:type="spellEnd"/>
+      <w:r>
+        <w:rPr>
+          <w:sz w:val="28"/>
+          <w:szCs w:val="28"/>
+          <w:lang w:val="es-ES"/>
+        </w:rPr>
+        <w:t xml:space="preserve">  y</w:t>
+      </w:r>
+      <w:proofErr w:type="gramEnd"/>
+      <w:r>
+        <w:rPr>
+          <w:sz w:val="28"/>
+          <w:szCs w:val="28"/>
+          <w:lang w:val="es-ES"/>
+        </w:rPr>
+        <w:t xml:space="preserve"> .</w:t>
+      </w:r>
+      <w:proofErr w:type="spellStart"/>
+      <w:r>
+        <w:rPr>
+          <w:sz w:val="28"/>
+          <w:szCs w:val="28"/>
+          <w:lang w:val="es-ES"/>
+        </w:rPr>
+        <w:t>cpp</w:t>
+      </w:r>
+      <w:proofErr w:type="spellEnd"/>
+    </w:p>
+    <w:p>
+      <w:pPr>
+        <w:spacing w:after="0"/>
+        <w:rPr>
+          <w:sz w:val="28"/>
+          <w:szCs w:val="28"/>
+          <w:lang w:val="es-ES"/>
+        </w:rPr>
+      </w:pPr>
+      <w:r>
+        <w:rPr>
+          <w:sz w:val="28"/>
+          <w:szCs w:val="28"/>
+          <w:lang w:val="es-ES"/>
+        </w:rPr>
+        <w:t xml:space="preserve">│    </w:t>
+      </w:r>
+      <w:r>
+        <w:rPr>
+          <w:rFonts w:ascii="MS Gothic" w:eastAsia="MS Gothic" w:hAnsi="MS Gothic" w:cs="MS Gothic" w:hint="eastAsia"/>
+          <w:sz w:val="28"/>
+          <w:szCs w:val="28"/>
+          <w:lang w:val="es-ES"/>
+        </w:rPr>
+        <w:t>├</w:t>
+      </w:r>
+      <w:r>
+        <w:rPr>
+          <w:rFonts w:ascii="Aptos" w:hAnsi="Aptos" w:cs="Aptos"/>
+          <w:sz w:val="28"/>
+          <w:szCs w:val="28"/>
+          <w:lang w:val="es-ES"/>
+        </w:rPr>
+        <w:t>──</w:t>
+      </w:r>
+      <w:r>
+        <w:rPr>
+          <w:sz w:val="28"/>
+          <w:szCs w:val="28"/>
+          <w:lang w:val="es-ES"/>
+        </w:rPr>
+        <w:t xml:space="preserve"> </w:t>
+      </w:r>
+      <w:proofErr w:type="spellStart"/>
+      <w:r>
+        <w:rPr>
+          <w:sz w:val="28"/>
+          <w:szCs w:val="28"/>
+          <w:lang w:val="es-ES"/>
+        </w:rPr>
+        <w:t>gestor_archivos.h</w:t>
+      </w:r>
+      <w:proofErr w:type="spellEnd"/>
+      <w:r>
+        <w:rPr>
+          <w:sz w:val="28"/>
+          <w:szCs w:val="28"/>
+          <w:lang w:val="es-ES"/>
+        </w:rPr>
+        <w:t xml:space="preserve">   y .</w:t>
+      </w:r>
+      <w:proofErr w:type="spellStart"/>
+      <w:proofErr w:type="gramStart"/>
+      <w:r>
+        <w:rPr>
+          <w:sz w:val="28"/>
+          <w:szCs w:val="28"/>
+          <w:lang w:val="es-ES"/>
+        </w:rPr>
+        <w:t>cpp</w:t>
+      </w:r>
+      <w:proofErr w:type="spellEnd"/>
+      <w:r>
+        <w:rPr>
+          <w:sz w:val="28"/>
+          <w:szCs w:val="28"/>
+          <w:lang w:val="es-ES"/>
+        </w:rPr>
+        <w:t xml:space="preserve">  &lt;</w:t>
+      </w:r>
+      <w:proofErr w:type="gramEnd"/>
+      <w:r>
+        <w:rPr>
+          <w:sz w:val="28"/>
+          <w:szCs w:val="28"/>
+          <w:lang w:val="es-ES"/>
+        </w:rPr>
+        <w:t xml:space="preserve">-- </w:t>
+      </w:r>
+      <w:r>
+        <w:rPr>
+          <w:rFonts w:ascii="Aptos" w:hAnsi="Aptos" w:cs="Aptos"/>
+          <w:sz w:val="28"/>
+          <w:szCs w:val="28"/>
+          <w:lang w:val="es-ES"/>
+        </w:rPr>
+        <w:t>¡</w:t>
+      </w:r>
+      <w:r>
+        <w:rPr>
+          <w:sz w:val="28"/>
+          <w:szCs w:val="28"/>
+          <w:lang w:val="es-ES"/>
+        </w:rPr>
+        <w:t>Aqu</w:t>
+      </w:r>
+      <w:r>
+        <w:rPr>
+          <w:rFonts w:ascii="Aptos" w:hAnsi="Aptos" w:cs="Aptos"/>
+          <w:sz w:val="28"/>
+          <w:szCs w:val="28"/>
+          <w:lang w:val="es-ES"/>
+        </w:rPr>
+        <w:t>í</w:t>
+      </w:r>
+      <w:r>
+        <w:rPr>
+          <w:sz w:val="28"/>
+          <w:szCs w:val="28"/>
+          <w:lang w:val="es-ES"/>
+        </w:rPr>
+        <w:t xml:space="preserve"> inicia Daniel!</w:t>
+      </w:r>
+    </w:p>
+    <w:p>
+      <w:pPr>
+        <w:spacing w:after="0"/>
+        <w:rPr>
+          <w:sz w:val="28"/>
+          <w:szCs w:val="28"/>
+          <w:lang w:val="es-ES"/>
+        </w:rPr>
+      </w:pPr>
+      <w:r>
+        <w:rPr>
+          <w:sz w:val="28"/>
+          <w:szCs w:val="28"/>
+          <w:lang w:val="es-ES"/>
+        </w:rPr>
+        <w:t xml:space="preserve">│    └── </w:t>
+      </w:r>
+      <w:proofErr w:type="spellStart"/>
+      <w:r>
+        <w:rPr>
+          <w:sz w:val="28"/>
+          <w:szCs w:val="28"/>
+          <w:lang w:val="es-ES"/>
+        </w:rPr>
+        <w:t>monitor_recursos.</w:t>
+      </w:r>
+      <w:proofErr w:type="gramStart"/>
+      <w:r>
+        <w:rPr>
+          <w:sz w:val="28"/>
+          <w:szCs w:val="28"/>
+          <w:lang w:val="es-ES"/>
+        </w:rPr>
+        <w:t>h</w:t>
+      </w:r>
+      <w:proofErr w:type="spellEnd"/>
+      <w:r>
+        <w:rPr>
+          <w:sz w:val="28"/>
+          <w:szCs w:val="28"/>
+          <w:lang w:val="es-ES"/>
+        </w:rPr>
+        <w:t xml:space="preserve">  y</w:t>
+      </w:r>
+      <w:proofErr w:type="gramEnd"/>
+      <w:r>
+        <w:rPr>
+          <w:sz w:val="28"/>
+          <w:szCs w:val="28"/>
+          <w:lang w:val="es-ES"/>
+        </w:rPr>
+        <w:t xml:space="preserve"> .</w:t>
+      </w:r>
+      <w:proofErr w:type="spellStart"/>
+      <w:r>
+        <w:rPr>
+          <w:sz w:val="28"/>
+          <w:szCs w:val="28"/>
+          <w:lang w:val="es-ES"/>
+        </w:rPr>
+        <w:t>cpp</w:t>
+      </w:r>
+      <w:proofErr w:type="spellEnd"/>
+    </w:p>
+    <w:p>
+      <w:pPr>
+        <w:spacing w:after="0"/>
+        <w:rPr>
+          <w:sz w:val="28"/>
+          <w:szCs w:val="28"/>
+          <w:lang w:val="es-ES"/>
+        </w:rPr>
+      </w:pPr>
+      <w:r>
+        <w:rPr>
+          <w:sz w:val="28"/>
+          <w:szCs w:val="28"/>
+          <w:lang w:val="es-ES"/>
+        </w:rPr>
+        <w:t>│</w:t>
+      </w:r>
+    </w:p>
+    <w:p>
+      <w:pPr>
+        <w:spacing w:after="0"/>
+        <w:rPr>
+          <w:sz w:val="28"/>
+          <w:szCs w:val="28"/>
+          <w:lang w:val="es-ES"/>
+        </w:rPr>
+      </w:pPr>
+      <w:r>
+        <w:rPr>
+          <w:rFonts w:ascii="MS Gothic" w:eastAsia="MS Gothic" w:hAnsi="MS Gothic" w:cs="MS Gothic" w:hint="eastAsia"/>
+          <w:sz w:val="28"/>
+          <w:szCs w:val="28"/>
+          <w:lang w:val="es-ES"/>
+        </w:rPr>
+        <w:t>├</w:t>
+      </w:r>
+      <w:r>
+        <w:rPr>
+          <w:rFonts w:ascii="Aptos" w:hAnsi="Aptos" w:cs="Aptos"/>
+          <w:sz w:val="28"/>
+          <w:szCs w:val="28"/>
+          <w:lang w:val="es-ES"/>
+        </w:rPr>
+        <w:t>──</w:t>
+      </w:r>
+      <w:r>
+        <w:rPr>
+          <w:sz w:val="28"/>
+          <w:szCs w:val="28"/>
+          <w:lang w:val="es-ES"/>
+        </w:rPr>
+        <w:t xml:space="preserve"> /</w:t>
+      </w:r>
+      <w:proofErr w:type="spellStart"/>
+      <w:r>
+        <w:rPr>
+          <w:sz w:val="28"/>
+          <w:szCs w:val="28"/>
+          <w:lang w:val="es-ES"/>
+        </w:rPr>
+        <w:t>modulos_dinamicos</w:t>
+      </w:r>
+      <w:proofErr w:type="spellEnd"/>
+    </w:p>
+    <w:p>
+      <w:pPr>
+        <w:spacing w:after="0"/>
+        <w:rPr>
+          <w:sz w:val="28"/>
+          <w:szCs w:val="28"/>
+          <w:lang w:val="es-ES"/>
+        </w:rPr>
+      </w:pPr>
+      <w:r>
+        <w:rPr>
+          <w:sz w:val="28"/>
+          <w:szCs w:val="28"/>
+          <w:lang w:val="es-ES"/>
+        </w:rPr>
+        <w:t xml:space="preserve">│    </w:t>
+      </w:r>
+      <w:r>
+        <w:rPr>
+          <w:rFonts w:ascii="MS Gothic" w:eastAsia="MS Gothic" w:hAnsi="MS Gothic" w:cs="MS Gothic" w:hint="eastAsia"/>
+          <w:sz w:val="28"/>
+          <w:szCs w:val="28"/>
+          <w:lang w:val="es-ES"/>
+        </w:rPr>
+        <w:t>├</w:t>
+      </w:r>
+      <w:r>
+        <w:rPr>
+          <w:rFonts w:ascii="Aptos" w:hAnsi="Aptos" w:cs="Aptos"/>
+          <w:sz w:val="28"/>
+          <w:szCs w:val="28"/>
+          <w:lang w:val="es-ES"/>
+        </w:rPr>
+        <w:t>──</w:t>
+      </w:r>
+      <w:r>
+        <w:rPr>
+          <w:sz w:val="28"/>
+          <w:szCs w:val="28"/>
+          <w:lang w:val="es-ES"/>
+        </w:rPr>
+        <w:t xml:space="preserve"> </w:t>
+      </w:r>
+      <w:proofErr w:type="spellStart"/>
+      <w:r>
+        <w:rPr>
+          <w:sz w:val="28"/>
+          <w:szCs w:val="28"/>
+          <w:lang w:val="es-ES"/>
+        </w:rPr>
+        <w:t>autenticacion.h</w:t>
+      </w:r>
+      <w:proofErr w:type="spellEnd"/>
+      <w:r>
+        <w:rPr>
+          <w:sz w:val="28"/>
+          <w:szCs w:val="28"/>
+          <w:lang w:val="es-ES"/>
+        </w:rPr>
+        <w:t xml:space="preserve">     y .</w:t>
+      </w:r>
+      <w:proofErr w:type="spellStart"/>
+      <w:r>
+        <w:rPr>
+          <w:sz w:val="28"/>
+          <w:szCs w:val="28"/>
+          <w:lang w:val="es-ES"/>
+        </w:rPr>
+        <w:t>cpp</w:t>
+      </w:r>
+      <w:proofErr w:type="spellEnd"/>
+    </w:p>
+    <w:p>
+      <w:pPr>
+        <w:spacing w:after="0"/>
+        <w:rPr>
+          <w:sz w:val="28"/>
+          <w:szCs w:val="28"/>
+          <w:lang w:val="es-ES"/>
+        </w:rPr>
+      </w:pPr>
+      <w:r>
+        <w:rPr>
+          <w:sz w:val="28"/>
+          <w:szCs w:val="28"/>
+          <w:lang w:val="es-ES"/>
+        </w:rPr>
+        <w:t xml:space="preserve">│    </w:t>
+      </w:r>
+      <w:r>
+        <w:rPr>
+          <w:rFonts w:ascii="MS Gothic" w:eastAsia="MS Gothic" w:hAnsi="MS Gothic" w:cs="MS Gothic" w:hint="eastAsia"/>
+          <w:sz w:val="28"/>
+          <w:szCs w:val="28"/>
+          <w:lang w:val="es-ES"/>
+        </w:rPr>
+        <w:t>├</w:t>
+      </w:r>
+      <w:r>
+        <w:rPr>
+          <w:rFonts w:ascii="Aptos" w:hAnsi="Aptos" w:cs="Aptos"/>
+          <w:sz w:val="28"/>
+          <w:szCs w:val="28"/>
+          <w:lang w:val="es-ES"/>
+        </w:rPr>
+        <w:t>──</w:t>
+      </w:r>
+      <w:r>
+        <w:rPr>
+          <w:sz w:val="28"/>
+          <w:szCs w:val="28"/>
+          <w:lang w:val="es-ES"/>
+        </w:rPr>
+        <w:t xml:space="preserve"> </w:t>
+      </w:r>
+      <w:proofErr w:type="spellStart"/>
+      <w:r>
+        <w:rPr>
+          <w:sz w:val="28"/>
+          <w:szCs w:val="28"/>
+          <w:lang w:val="es-ES"/>
+        </w:rPr>
+        <w:t>admin_amistades.h</w:t>
+      </w:r>
+      <w:proofErr w:type="spellEnd"/>
+      <w:r>
+        <w:rPr>
+          <w:sz w:val="28"/>
+          <w:szCs w:val="28"/>
+          <w:lang w:val="es-ES"/>
+        </w:rPr>
+        <w:t xml:space="preserve">   y .</w:t>
+      </w:r>
+      <w:proofErr w:type="spellStart"/>
+      <w:r>
+        <w:rPr>
+          <w:sz w:val="28"/>
+          <w:szCs w:val="28"/>
+          <w:lang w:val="es-ES"/>
+        </w:rPr>
+        <w:t>cpp</w:t>
+      </w:r>
+      <w:proofErr w:type="spellEnd"/>
+    </w:p>
+    <w:p>
+      <w:pPr>
+        <w:spacing w:after="0"/>
+        <w:rPr>
+          <w:sz w:val="28"/>
+          <w:szCs w:val="28"/>
+          <w:lang w:val="es-ES"/>
+        </w:rPr>
+      </w:pPr>
+      <w:r>
+        <w:rPr>
+          <w:sz w:val="28"/>
+          <w:szCs w:val="28"/>
+          <w:lang w:val="es-ES"/>
+        </w:rPr>
+        <w:t xml:space="preserve">│    </w:t>
+      </w:r>
+      <w:r>
+        <w:rPr>
+          <w:rFonts w:ascii="MS Gothic" w:eastAsia="MS Gothic" w:hAnsi="MS Gothic" w:cs="MS Gothic" w:hint="eastAsia"/>
+          <w:sz w:val="28"/>
+          <w:szCs w:val="28"/>
+          <w:lang w:val="es-ES"/>
+        </w:rPr>
+        <w:t>├</w:t>
+      </w:r>
+      <w:r>
+        <w:rPr>
+          <w:rFonts w:ascii="Aptos" w:hAnsi="Aptos" w:cs="Aptos"/>
+          <w:sz w:val="28"/>
+          <w:szCs w:val="28"/>
+          <w:lang w:val="es-ES"/>
+        </w:rPr>
+        <w:t>──</w:t>
+      </w:r>
+      <w:r>
+        <w:rPr>
+          <w:sz w:val="28"/>
+          <w:szCs w:val="28"/>
+          <w:lang w:val="es-ES"/>
+        </w:rPr>
+        <w:t xml:space="preserve"> </w:t>
+      </w:r>
+      <w:proofErr w:type="spellStart"/>
+      <w:r>
+        <w:rPr>
+          <w:sz w:val="28"/>
+          <w:szCs w:val="28"/>
+          <w:lang w:val="es-ES"/>
+        </w:rPr>
+        <w:t>visor_perfiles.h</w:t>
+      </w:r>
+      <w:proofErr w:type="spellEnd"/>
+      <w:r>
+        <w:rPr>
+          <w:sz w:val="28"/>
+          <w:szCs w:val="28"/>
+          <w:lang w:val="es-ES"/>
+        </w:rPr>
+        <w:t xml:space="preserve">    y .</w:t>
+      </w:r>
+      <w:proofErr w:type="spellStart"/>
+      <w:r>
+        <w:rPr>
+          <w:sz w:val="28"/>
+          <w:szCs w:val="28"/>
+          <w:lang w:val="es-ES"/>
+        </w:rPr>
+        <w:t>cpp</w:t>
+      </w:r>
+      <w:proofErr w:type="spellEnd"/>
+    </w:p>
+    <w:p>
+      <w:pPr>
+        <w:spacing w:after="0"/>
+        <w:rPr>
+          <w:sz w:val="28"/>
+          <w:szCs w:val="28"/>
+          <w:lang w:val="es-ES"/>
+        </w:rPr>
+      </w:pPr>
+      <w:r>
+        <w:rPr>
+          <w:sz w:val="28"/>
+          <w:szCs w:val="28"/>
+          <w:lang w:val="es-ES"/>
+        </w:rPr>
+        <w:t xml:space="preserve">│    └── </w:t>
+      </w:r>
+      <w:proofErr w:type="spellStart"/>
+      <w:r>
+        <w:rPr>
+          <w:sz w:val="28"/>
+          <w:szCs w:val="28"/>
+          <w:lang w:val="es-ES"/>
+        </w:rPr>
+        <w:t>gestor_mensajes.h</w:t>
+      </w:r>
+      <w:proofErr w:type="spellEnd"/>
+      <w:r>
+        <w:rPr>
+          <w:sz w:val="28"/>
+          <w:szCs w:val="28"/>
+          <w:lang w:val="es-ES"/>
+        </w:rPr>
+        <w:t xml:space="preserve">   y .</w:t>
+      </w:r>
+      <w:proofErr w:type="spellStart"/>
+      <w:proofErr w:type="gramStart"/>
+      <w:r>
+        <w:rPr>
+          <w:sz w:val="28"/>
+          <w:szCs w:val="28"/>
+          <w:lang w:val="es-ES"/>
+        </w:rPr>
+        <w:t>cpp</w:t>
+      </w:r>
+      <w:proofErr w:type="spellEnd"/>
+      <w:r>
+        <w:rPr>
+          <w:sz w:val="28"/>
+          <w:szCs w:val="28"/>
+          <w:lang w:val="es-ES"/>
+        </w:rPr>
+        <w:t xml:space="preserve">  &lt;</w:t>
+      </w:r>
+      <w:proofErr w:type="gramEnd"/>
+      <w:r>
+        <w:rPr>
+          <w:sz w:val="28"/>
+          <w:szCs w:val="28"/>
+          <w:lang w:val="es-ES"/>
+        </w:rPr>
+        <w:t>-- ¡Aquí iniciará Solarte!</w:t>
+      </w:r>
+    </w:p>
+    <w:p>
+      <w:pPr>
+        <w:spacing w:after="0"/>
+        <w:rPr>
+          <w:sz w:val="28"/>
+          <w:szCs w:val="28"/>
+          <w:lang w:val="es-ES"/>
+        </w:rPr>
+      </w:pPr>
+      <w:r>
+        <w:rPr>
+          <w:sz w:val="28"/>
+          <w:szCs w:val="28"/>
+          <w:lang w:val="es-ES"/>
+        </w:rPr>
+        <w:t>│</w:t>
+      </w:r>
+    </w:p>
+    <w:p>
+      <w:pPr>
+        <w:spacing w:after="0"/>
+        <w:rPr>
+          <w:sz w:val="28"/>
+          <w:szCs w:val="28"/>
+          <w:lang w:val="es-ES"/>
+        </w:rPr>
+      </w:pPr>
+      <w:r>
+        <w:rPr>
+          <w:sz w:val="28"/>
+          <w:szCs w:val="28"/>
+          <w:lang w:val="es-ES"/>
+        </w:rPr>
+        <w:t>└── main.cpp</w:t>
+      </w:r>
+    </w:p>
+    <w:p>
+      <w:pPr>
+        <w:spacing w:after="0"/>
+        <w:rPr>
+          <w:sz w:val="28"/>
+          <w:szCs w:val="28"/>
+          <w:lang w:val="es-ES"/>
+        </w:rPr>
+      </w:pPr>
+      <w:r>
+        <w:rPr>
+          <w:sz w:val="28"/>
+          <w:szCs w:val="28"/>
+          <w:lang w:val="es-ES"/>
+        </w:rPr>
+        <w:lastRenderedPageBreak/>
+        <w:t>Inicio De Codificación, documentación:</w:t>
+      </w:r>
+    </w:p>
+    <w:p>
+      <w:pPr>
+        <w:spacing w:after="0"/>
+        <w:rPr>
+          <w:sz w:val="28"/>
+          <w:szCs w:val="28"/>
+          <w:lang w:val="es-ES"/>
+        </w:rPr>
+      </w:pPr>
+    </w:p>
+    <w:p>
+      <w:pPr>
+        <w:spacing w:after="0"/>
+        <w:rPr>
+          <w:sz w:val="28"/>
+          <w:szCs w:val="28"/>
+          <w:lang w:val="es-ES"/>
+        </w:rPr>
+      </w:pPr>
+    </w:p>
     <w:sectPr>
       <w:pgSz w:w="12240" w:h="15840"/>
       <w:pgMar w:top="1417" w:right="1701" w:bottom="1417" w:left="1701" w:header="708" w:footer="708" w:gutter="0"/>
@@ -1373,6 +4231,304 @@
 <file path=word/numbering.xml><?xml version="1.0" encoding="utf-8"?>
 <w:numbering xmlns:wpc="http://schemas.microsoft.com/office/word/2010/wordprocessingCanvas" xmlns:cx="http://schemas.microsoft.com/office/drawing/2014/chartex" xmlns:cx1="http://schemas.microsoft.com/office/drawing/2015/9/8/chartex" xmlns:cx2="http://schemas.microsoft.com/office/drawing/2015/10/21/chartex" xmlns:cx3="http://schemas.microsoft.com/office/drawing/2016/5/9/chartex" xmlns:cx4="http://schemas.microsoft.com/office/drawing/2016/5/10/chartex" xmlns:cx5="http://schemas.microsoft.com/office/drawing/2016/5/11/chartex" xmlns:cx6="http://schemas.microsoft.com/office/drawing/2016/5/12/chartex" xmlns:cx7="http://schemas.microsoft.com/office/drawing/2016/5/13/chartex" xmlns:cx8="http://schemas.microsoft.com/office/drawing/2016/5/14/chartex" xmlns:mc="http://schemas.openxmlformats.org/markup-compatibility/2006" xmlns:aink="http://schemas.microsoft.com/office/drawing/2016/ink" xmlns:am3d="http://schemas.microsoft.com/office/drawing/2017/model3d" xmlns:o="urn:schemas-microsoft-com:office:office" xmlns:oel="http://schemas.microsoft.com/office/2019/extlst" xmlns:r="http://schemas.openxmlformats.org/officeDocument/2006/relationships" xmlns:m="http://schemas.openxmlformats.org/officeDocument/2006/math" xmlns:v="urn:schemas-microsoft-com:vml" xmlns:wp14="http://schemas.microsoft.com/office/word/2010/wordprocessingDrawing" xmlns:wp="http://schemas.openxmlformats.org/drawingml/2006/wordprocessingDrawing" xmlns:w10="urn:schemas-microsoft-com:office:word" xmlns:w="http://schemas.openxmlformats.org/wordprocessingml/2006/main" xmlns:w14="http://schemas.microsoft.com/office/word/2010/wordml" xmlns:w15="http://schemas.microsoft.com/office/word/2012/wordml" xmlns:w16cex="http://schemas.microsoft.com/office/word/2018/wordml/cex" xmlns:w16cid="http://schemas.microsoft.com/office/word/2016/wordml/cid" xmlns:w16="http://schemas.microsoft.com/office/word/2018/wordml" xmlns:w16du="http://schemas.microsoft.com/office/word/2023/wordml/word16du" xmlns:w16sdtdh="http://schemas.microsoft.com/office/word/2020/wordml/sdtdatahash" xmlns:w16sdtfl="http://schemas.microsoft.com/office/word/2024/wordml/sdtformatlock" xmlns:w16se="http://schemas.microsoft.com/office/word/2015/wordml/symex" xmlns:wpg="http://schemas.microsoft.com/office/word/2010/wordprocessingGroup" xmlns:wpi="http://schemas.microsoft.com/office/word/2010/wordprocessingInk" xmlns:wne="http://schemas.microsoft.com/office/word/2006/wordml" xmlns:wps="http://schemas.microsoft.com/office/word/2010/wordprocessingShape" mc:Ignorable="w14 w15 w16se w16cid w16 w16cex w16sdtdh w16sdtfl w16du wp14">
   <w:abstractNum w:abstractNumId="0" w15:restartNumberingAfterBreak="0">
+    <w:nsid w:val="06B577EA"/>
+    <w:multiLevelType w:val="multilevel"/>
+    <w:tmpl w:val="617ADEBE"/>
+    <w:lvl w:ilvl="0">
+      <w:start w:val="1"/>
+      <w:numFmt w:val="bullet"/>
+      <w:lvlText w:val=""/>
+      <w:lvlJc w:val="left"/>
+      <w:pPr>
+        <w:tabs>
+          <w:tab w:val="num" w:pos="720"/>
+        </w:tabs>
+        <w:ind w:left="720" w:hanging="360"/>
+      </w:pPr>
+      <w:rPr>
+        <w:rFonts w:ascii="Symbol" w:hAnsi="Symbol" w:hint="default"/>
+        <w:sz w:val="20"/>
+      </w:rPr>
+    </w:lvl>
+    <w:lvl w:ilvl="1">
+      <w:start w:val="1"/>
+      <w:numFmt w:val="bullet"/>
+      <w:lvlText w:val="o"/>
+      <w:lvlJc w:val="left"/>
+      <w:pPr>
+        <w:tabs>
+          <w:tab w:val="num" w:pos="1440"/>
+        </w:tabs>
+        <w:ind w:left="1440" w:hanging="360"/>
+      </w:pPr>
+      <w:rPr>
+        <w:rFonts w:ascii="Courier New" w:hAnsi="Courier New" w:hint="default"/>
+        <w:sz w:val="20"/>
+      </w:rPr>
+    </w:lvl>
+    <w:lvl w:ilvl="2" w:tentative="1">
+      <w:start w:val="1"/>
+      <w:numFmt w:val="bullet"/>
+      <w:lvlText w:val=""/>
+      <w:lvlJc w:val="left"/>
+      <w:pPr>
+        <w:tabs>
+          <w:tab w:val="num" w:pos="2160"/>
+        </w:tabs>
+        <w:ind w:left="2160" w:hanging="360"/>
+      </w:pPr>
+      <w:rPr>
+        <w:rFonts w:ascii="Wingdings" w:hAnsi="Wingdings" w:hint="default"/>
+        <w:sz w:val="20"/>
+      </w:rPr>
+    </w:lvl>
+    <w:lvl w:ilvl="3" w:tentative="1">
+      <w:start w:val="1"/>
+      <w:numFmt w:val="bullet"/>
+      <w:lvlText w:val=""/>
+      <w:lvlJc w:val="left"/>
+      <w:pPr>
+        <w:tabs>
+          <w:tab w:val="num" w:pos="2880"/>
+        </w:tabs>
+        <w:ind w:left="2880" w:hanging="360"/>
+      </w:pPr>
+      <w:rPr>
+        <w:rFonts w:ascii="Wingdings" w:hAnsi="Wingdings" w:hint="default"/>
+        <w:sz w:val="20"/>
+      </w:rPr>
+    </w:lvl>
+    <w:lvl w:ilvl="4" w:tentative="1">
+      <w:start w:val="1"/>
+      <w:numFmt w:val="bullet"/>
+      <w:lvlText w:val=""/>
+      <w:lvlJc w:val="left"/>
+      <w:pPr>
+        <w:tabs>
+          <w:tab w:val="num" w:pos="3600"/>
+        </w:tabs>
+        <w:ind w:left="3600" w:hanging="360"/>
+      </w:pPr>
+      <w:rPr>
+        <w:rFonts w:ascii="Wingdings" w:hAnsi="Wingdings" w:hint="default"/>
+        <w:sz w:val="20"/>
+      </w:rPr>
+    </w:lvl>
+    <w:lvl w:ilvl="5" w:tentative="1">
+      <w:start w:val="1"/>
+      <w:numFmt w:val="bullet"/>
+      <w:lvlText w:val=""/>
+      <w:lvlJc w:val="left"/>
+      <w:pPr>
+        <w:tabs>
+          <w:tab w:val="num" w:pos="4320"/>
+        </w:tabs>
+        <w:ind w:left="4320" w:hanging="360"/>
+      </w:pPr>
+      <w:rPr>
+        <w:rFonts w:ascii="Wingdings" w:hAnsi="Wingdings" w:hint="default"/>
+        <w:sz w:val="20"/>
+      </w:rPr>
+    </w:lvl>
+    <w:lvl w:ilvl="6" w:tentative="1">
+      <w:start w:val="1"/>
+      <w:numFmt w:val="bullet"/>
+      <w:lvlText w:val=""/>
+      <w:lvlJc w:val="left"/>
+      <w:pPr>
+        <w:tabs>
+          <w:tab w:val="num" w:pos="5040"/>
+        </w:tabs>
+        <w:ind w:left="5040" w:hanging="360"/>
+      </w:pPr>
+      <w:rPr>
+        <w:rFonts w:ascii="Wingdings" w:hAnsi="Wingdings" w:hint="default"/>
+        <w:sz w:val="20"/>
+      </w:rPr>
+    </w:lvl>
+    <w:lvl w:ilvl="7" w:tentative="1">
+      <w:start w:val="1"/>
+      <w:numFmt w:val="bullet"/>
+      <w:lvlText w:val=""/>
+      <w:lvlJc w:val="left"/>
+      <w:pPr>
+        <w:tabs>
+          <w:tab w:val="num" w:pos="5760"/>
+        </w:tabs>
+        <w:ind w:left="5760" w:hanging="360"/>
+      </w:pPr>
+      <w:rPr>
+        <w:rFonts w:ascii="Wingdings" w:hAnsi="Wingdings" w:hint="default"/>
+        <w:sz w:val="20"/>
+      </w:rPr>
+    </w:lvl>
+    <w:lvl w:ilvl="8" w:tentative="1">
+      <w:start w:val="1"/>
+      <w:numFmt w:val="bullet"/>
+      <w:lvlText w:val=""/>
+      <w:lvlJc w:val="left"/>
+      <w:pPr>
+        <w:tabs>
+          <w:tab w:val="num" w:pos="6480"/>
+        </w:tabs>
+        <w:ind w:left="6480" w:hanging="360"/>
+      </w:pPr>
+      <w:rPr>
+        <w:rFonts w:ascii="Wingdings" w:hAnsi="Wingdings" w:hint="default"/>
+        <w:sz w:val="20"/>
+      </w:rPr>
+    </w:lvl>
+  </w:abstractNum>
+  <w:abstractNum w:abstractNumId="1" w15:restartNumberingAfterBreak="0">
+    <w:nsid w:val="0C2A5143"/>
+    <w:multiLevelType w:val="multilevel"/>
+    <w:tmpl w:val="71625E74"/>
+    <w:lvl w:ilvl="0">
+      <w:start w:val="1"/>
+      <w:numFmt w:val="bullet"/>
+      <w:lvlText w:val=""/>
+      <w:lvlJc w:val="left"/>
+      <w:pPr>
+        <w:tabs>
+          <w:tab w:val="num" w:pos="720"/>
+        </w:tabs>
+        <w:ind w:left="720" w:hanging="360"/>
+      </w:pPr>
+      <w:rPr>
+        <w:rFonts w:ascii="Symbol" w:hAnsi="Symbol" w:hint="default"/>
+        <w:sz w:val="20"/>
+      </w:rPr>
+    </w:lvl>
+    <w:lvl w:ilvl="1" w:tentative="1">
+      <w:start w:val="1"/>
+      <w:numFmt w:val="bullet"/>
+      <w:lvlText w:val="o"/>
+      <w:lvlJc w:val="left"/>
+      <w:pPr>
+        <w:tabs>
+          <w:tab w:val="num" w:pos="1440"/>
+        </w:tabs>
+        <w:ind w:left="1440" w:hanging="360"/>
+      </w:pPr>
+      <w:rPr>
+        <w:rFonts w:ascii="Courier New" w:hAnsi="Courier New" w:hint="default"/>
+        <w:sz w:val="20"/>
+      </w:rPr>
+    </w:lvl>
+    <w:lvl w:ilvl="2" w:tentative="1">
+      <w:start w:val="1"/>
+      <w:numFmt w:val="bullet"/>
+      <w:lvlText w:val=""/>
+      <w:lvlJc w:val="left"/>
+      <w:pPr>
+        <w:tabs>
+          <w:tab w:val="num" w:pos="2160"/>
+        </w:tabs>
+        <w:ind w:left="2160" w:hanging="360"/>
+      </w:pPr>
+      <w:rPr>
+        <w:rFonts w:ascii="Wingdings" w:hAnsi="Wingdings" w:hint="default"/>
+        <w:sz w:val="20"/>
+      </w:rPr>
+    </w:lvl>
+    <w:lvl w:ilvl="3" w:tentative="1">
+      <w:start w:val="1"/>
+      <w:numFmt w:val="bullet"/>
+      <w:lvlText w:val=""/>
+      <w:lvlJc w:val="left"/>
+      <w:pPr>
+        <w:tabs>
+          <w:tab w:val="num" w:pos="2880"/>
+        </w:tabs>
+        <w:ind w:left="2880" w:hanging="360"/>
+      </w:pPr>
+      <w:rPr>
+        <w:rFonts w:ascii="Wingdings" w:hAnsi="Wingdings" w:hint="default"/>
+        <w:sz w:val="20"/>
+      </w:rPr>
+    </w:lvl>
+    <w:lvl w:ilvl="4" w:tentative="1">
+      <w:start w:val="1"/>
+      <w:numFmt w:val="bullet"/>
+      <w:lvlText w:val=""/>
+      <w:lvlJc w:val="left"/>
+      <w:pPr>
+        <w:tabs>
+          <w:tab w:val="num" w:pos="3600"/>
+        </w:tabs>
+        <w:ind w:left="3600" w:hanging="360"/>
+      </w:pPr>
+      <w:rPr>
+        <w:rFonts w:ascii="Wingdings" w:hAnsi="Wingdings" w:hint="default"/>
+        <w:sz w:val="20"/>
+      </w:rPr>
+    </w:lvl>
+    <w:lvl w:ilvl="5" w:tentative="1">
+      <w:start w:val="1"/>
+      <w:numFmt w:val="bullet"/>
+      <w:lvlText w:val=""/>
+      <w:lvlJc w:val="left"/>
+      <w:pPr>
+        <w:tabs>
+          <w:tab w:val="num" w:pos="4320"/>
+        </w:tabs>
+        <w:ind w:left="4320" w:hanging="360"/>
+      </w:pPr>
+      <w:rPr>
+        <w:rFonts w:ascii="Wingdings" w:hAnsi="Wingdings" w:hint="default"/>
+        <w:sz w:val="20"/>
+      </w:rPr>
+    </w:lvl>
+    <w:lvl w:ilvl="6" w:tentative="1">
+      <w:start w:val="1"/>
+      <w:numFmt w:val="bullet"/>
+      <w:lvlText w:val=""/>
+      <w:lvlJc w:val="left"/>
+      <w:pPr>
+        <w:tabs>
+          <w:tab w:val="num" w:pos="5040"/>
+        </w:tabs>
+        <w:ind w:left="5040" w:hanging="360"/>
+      </w:pPr>
+      <w:rPr>
+        <w:rFonts w:ascii="Wingdings" w:hAnsi="Wingdings" w:hint="default"/>
+        <w:sz w:val="20"/>
+      </w:rPr>
+    </w:lvl>
+    <w:lvl w:ilvl="7" w:tentative="1">
+      <w:start w:val="1"/>
+      <w:numFmt w:val="bullet"/>
+      <w:lvlText w:val=""/>
+      <w:lvlJc w:val="left"/>
+      <w:pPr>
+        <w:tabs>
+          <w:tab w:val="num" w:pos="5760"/>
+        </w:tabs>
+        <w:ind w:left="5760" w:hanging="360"/>
+      </w:pPr>
+      <w:rPr>
+        <w:rFonts w:ascii="Wingdings" w:hAnsi="Wingdings" w:hint="default"/>
+        <w:sz w:val="20"/>
+      </w:rPr>
+    </w:lvl>
+    <w:lvl w:ilvl="8" w:tentative="1">
+      <w:start w:val="1"/>
+      <w:numFmt w:val="bullet"/>
+      <w:lvlText w:val=""/>
+      <w:lvlJc w:val="left"/>
+      <w:pPr>
+        <w:tabs>
+          <w:tab w:val="num" w:pos="6480"/>
+        </w:tabs>
+        <w:ind w:left="6480" w:hanging="360"/>
+      </w:pPr>
+      <w:rPr>
+        <w:rFonts w:ascii="Wingdings" w:hAnsi="Wingdings" w:hint="default"/>
+        <w:sz w:val="20"/>
+      </w:rPr>
+    </w:lvl>
+  </w:abstractNum>
+  <w:abstractNum w:abstractNumId="2" w15:restartNumberingAfterBreak="0">
     <w:nsid w:val="18E71B46"/>
     <w:multiLevelType w:val="multilevel"/>
     <w:tmpl w:val="19A640C4"/>
@@ -1521,7 +4677,305 @@
       </w:rPr>
     </w:lvl>
   </w:abstractNum>
-  <w:abstractNum w:abstractNumId="1" w15:restartNumberingAfterBreak="0">
+  <w:abstractNum w:abstractNumId="3" w15:restartNumberingAfterBreak="0">
+    <w:nsid w:val="2342463C"/>
+    <w:multiLevelType w:val="multilevel"/>
+    <w:tmpl w:val="73C01272"/>
+    <w:lvl w:ilvl="0">
+      <w:start w:val="1"/>
+      <w:numFmt w:val="bullet"/>
+      <w:lvlText w:val=""/>
+      <w:lvlJc w:val="left"/>
+      <w:pPr>
+        <w:tabs>
+          <w:tab w:val="num" w:pos="720"/>
+        </w:tabs>
+        <w:ind w:left="720" w:hanging="360"/>
+      </w:pPr>
+      <w:rPr>
+        <w:rFonts w:ascii="Symbol" w:hAnsi="Symbol" w:hint="default"/>
+        <w:sz w:val="20"/>
+      </w:rPr>
+    </w:lvl>
+    <w:lvl w:ilvl="1" w:tentative="1">
+      <w:start w:val="1"/>
+      <w:numFmt w:val="bullet"/>
+      <w:lvlText w:val="o"/>
+      <w:lvlJc w:val="left"/>
+      <w:pPr>
+        <w:tabs>
+          <w:tab w:val="num" w:pos="1440"/>
+        </w:tabs>
+        <w:ind w:left="1440" w:hanging="360"/>
+      </w:pPr>
+      <w:rPr>
+        <w:rFonts w:ascii="Courier New" w:hAnsi="Courier New" w:hint="default"/>
+        <w:sz w:val="20"/>
+      </w:rPr>
+    </w:lvl>
+    <w:lvl w:ilvl="2" w:tentative="1">
+      <w:start w:val="1"/>
+      <w:numFmt w:val="bullet"/>
+      <w:lvlText w:val=""/>
+      <w:lvlJc w:val="left"/>
+      <w:pPr>
+        <w:tabs>
+          <w:tab w:val="num" w:pos="2160"/>
+        </w:tabs>
+        <w:ind w:left="2160" w:hanging="360"/>
+      </w:pPr>
+      <w:rPr>
+        <w:rFonts w:ascii="Wingdings" w:hAnsi="Wingdings" w:hint="default"/>
+        <w:sz w:val="20"/>
+      </w:rPr>
+    </w:lvl>
+    <w:lvl w:ilvl="3" w:tentative="1">
+      <w:start w:val="1"/>
+      <w:numFmt w:val="bullet"/>
+      <w:lvlText w:val=""/>
+      <w:lvlJc w:val="left"/>
+      <w:pPr>
+        <w:tabs>
+          <w:tab w:val="num" w:pos="2880"/>
+        </w:tabs>
+        <w:ind w:left="2880" w:hanging="360"/>
+      </w:pPr>
+      <w:rPr>
+        <w:rFonts w:ascii="Wingdings" w:hAnsi="Wingdings" w:hint="default"/>
+        <w:sz w:val="20"/>
+      </w:rPr>
+    </w:lvl>
+    <w:lvl w:ilvl="4" w:tentative="1">
+      <w:start w:val="1"/>
+      <w:numFmt w:val="bullet"/>
+      <w:lvlText w:val=""/>
+      <w:lvlJc w:val="left"/>
+      <w:pPr>
+        <w:tabs>
+          <w:tab w:val="num" w:pos="3600"/>
+        </w:tabs>
+        <w:ind w:left="3600" w:hanging="360"/>
+      </w:pPr>
+      <w:rPr>
+        <w:rFonts w:ascii="Wingdings" w:hAnsi="Wingdings" w:hint="default"/>
+        <w:sz w:val="20"/>
+      </w:rPr>
+    </w:lvl>
+    <w:lvl w:ilvl="5" w:tentative="1">
+      <w:start w:val="1"/>
+      <w:numFmt w:val="bullet"/>
+      <w:lvlText w:val=""/>
+      <w:lvlJc w:val="left"/>
+      <w:pPr>
+        <w:tabs>
+          <w:tab w:val="num" w:pos="4320"/>
+        </w:tabs>
+        <w:ind w:left="4320" w:hanging="360"/>
+      </w:pPr>
+      <w:rPr>
+        <w:rFonts w:ascii="Wingdings" w:hAnsi="Wingdings" w:hint="default"/>
+        <w:sz w:val="20"/>
+      </w:rPr>
+    </w:lvl>
+    <w:lvl w:ilvl="6" w:tentative="1">
+      <w:start w:val="1"/>
+      <w:numFmt w:val="bullet"/>
+      <w:lvlText w:val=""/>
+      <w:lvlJc w:val="left"/>
+      <w:pPr>
+        <w:tabs>
+          <w:tab w:val="num" w:pos="5040"/>
+        </w:tabs>
+        <w:ind w:left="5040" w:hanging="360"/>
+      </w:pPr>
+      <w:rPr>
+        <w:rFonts w:ascii="Wingdings" w:hAnsi="Wingdings" w:hint="default"/>
+        <w:sz w:val="20"/>
+      </w:rPr>
+    </w:lvl>
+    <w:lvl w:ilvl="7" w:tentative="1">
+      <w:start w:val="1"/>
+      <w:numFmt w:val="bullet"/>
+      <w:lvlText w:val=""/>
+      <w:lvlJc w:val="left"/>
+      <w:pPr>
+        <w:tabs>
+          <w:tab w:val="num" w:pos="5760"/>
+        </w:tabs>
+        <w:ind w:left="5760" w:hanging="360"/>
+      </w:pPr>
+      <w:rPr>
+        <w:rFonts w:ascii="Wingdings" w:hAnsi="Wingdings" w:hint="default"/>
+        <w:sz w:val="20"/>
+      </w:rPr>
+    </w:lvl>
+    <w:lvl w:ilvl="8" w:tentative="1">
+      <w:start w:val="1"/>
+      <w:numFmt w:val="bullet"/>
+      <w:lvlText w:val=""/>
+      <w:lvlJc w:val="left"/>
+      <w:pPr>
+        <w:tabs>
+          <w:tab w:val="num" w:pos="6480"/>
+        </w:tabs>
+        <w:ind w:left="6480" w:hanging="360"/>
+      </w:pPr>
+      <w:rPr>
+        <w:rFonts w:ascii="Wingdings" w:hAnsi="Wingdings" w:hint="default"/>
+        <w:sz w:val="20"/>
+      </w:rPr>
+    </w:lvl>
+  </w:abstractNum>
+  <w:abstractNum w:abstractNumId="4" w15:restartNumberingAfterBreak="0">
+    <w:nsid w:val="28D11D4C"/>
+    <w:multiLevelType w:val="multilevel"/>
+    <w:tmpl w:val="2DEC1902"/>
+    <w:lvl w:ilvl="0">
+      <w:start w:val="1"/>
+      <w:numFmt w:val="bullet"/>
+      <w:lvlText w:val=""/>
+      <w:lvlJc w:val="left"/>
+      <w:pPr>
+        <w:tabs>
+          <w:tab w:val="num" w:pos="720"/>
+        </w:tabs>
+        <w:ind w:left="720" w:hanging="360"/>
+      </w:pPr>
+      <w:rPr>
+        <w:rFonts w:ascii="Symbol" w:hAnsi="Symbol" w:hint="default"/>
+        <w:sz w:val="20"/>
+      </w:rPr>
+    </w:lvl>
+    <w:lvl w:ilvl="1" w:tentative="1">
+      <w:start w:val="1"/>
+      <w:numFmt w:val="bullet"/>
+      <w:lvlText w:val="o"/>
+      <w:lvlJc w:val="left"/>
+      <w:pPr>
+        <w:tabs>
+          <w:tab w:val="num" w:pos="1440"/>
+        </w:tabs>
+        <w:ind w:left="1440" w:hanging="360"/>
+      </w:pPr>
+      <w:rPr>
+        <w:rFonts w:ascii="Courier New" w:hAnsi="Courier New" w:hint="default"/>
+        <w:sz w:val="20"/>
+      </w:rPr>
+    </w:lvl>
+    <w:lvl w:ilvl="2" w:tentative="1">
+      <w:start w:val="1"/>
+      <w:numFmt w:val="bullet"/>
+      <w:lvlText w:val=""/>
+      <w:lvlJc w:val="left"/>
+      <w:pPr>
+        <w:tabs>
+          <w:tab w:val="num" w:pos="2160"/>
+        </w:tabs>
+        <w:ind w:left="2160" w:hanging="360"/>
+      </w:pPr>
+      <w:rPr>
+        <w:rFonts w:ascii="Wingdings" w:hAnsi="Wingdings" w:hint="default"/>
+        <w:sz w:val="20"/>
+      </w:rPr>
+    </w:lvl>
+    <w:lvl w:ilvl="3" w:tentative="1">
+      <w:start w:val="1"/>
+      <w:numFmt w:val="bullet"/>
+      <w:lvlText w:val=""/>
+      <w:lvlJc w:val="left"/>
+      <w:pPr>
+        <w:tabs>
+          <w:tab w:val="num" w:pos="2880"/>
+        </w:tabs>
+        <w:ind w:left="2880" w:hanging="360"/>
+      </w:pPr>
+      <w:rPr>
+        <w:rFonts w:ascii="Wingdings" w:hAnsi="Wingdings" w:hint="default"/>
+        <w:sz w:val="20"/>
+      </w:rPr>
+    </w:lvl>
+    <w:lvl w:ilvl="4" w:tentative="1">
+      <w:start w:val="1"/>
+      <w:numFmt w:val="bullet"/>
+      <w:lvlText w:val=""/>
+      <w:lvlJc w:val="left"/>
+      <w:pPr>
+        <w:tabs>
+          <w:tab w:val="num" w:pos="3600"/>
+        </w:tabs>
+        <w:ind w:left="3600" w:hanging="360"/>
+      </w:pPr>
+      <w:rPr>
+        <w:rFonts w:ascii="Wingdings" w:hAnsi="Wingdings" w:hint="default"/>
+        <w:sz w:val="20"/>
+      </w:rPr>
+    </w:lvl>
+    <w:lvl w:ilvl="5" w:tentative="1">
+      <w:start w:val="1"/>
+      <w:numFmt w:val="bullet"/>
+      <w:lvlText w:val=""/>
+      <w:lvlJc w:val="left"/>
+      <w:pPr>
+        <w:tabs>
+          <w:tab w:val="num" w:pos="4320"/>
+        </w:tabs>
+        <w:ind w:left="4320" w:hanging="360"/>
+      </w:pPr>
+      <w:rPr>
+        <w:rFonts w:ascii="Wingdings" w:hAnsi="Wingdings" w:hint="default"/>
+        <w:sz w:val="20"/>
+      </w:rPr>
+    </w:lvl>
+    <w:lvl w:ilvl="6" w:tentative="1">
+      <w:start w:val="1"/>
+      <w:numFmt w:val="bullet"/>
+      <w:lvlText w:val=""/>
+      <w:lvlJc w:val="left"/>
+      <w:pPr>
+        <w:tabs>
+          <w:tab w:val="num" w:pos="5040"/>
+        </w:tabs>
+        <w:ind w:left="5040" w:hanging="360"/>
+      </w:pPr>
+      <w:rPr>
+        <w:rFonts w:ascii="Wingdings" w:hAnsi="Wingdings" w:hint="default"/>
+        <w:sz w:val="20"/>
+      </w:rPr>
+    </w:lvl>
+    <w:lvl w:ilvl="7" w:tentative="1">
+      <w:start w:val="1"/>
+      <w:numFmt w:val="bullet"/>
+      <w:lvlText w:val=""/>
+      <w:lvlJc w:val="left"/>
+      <w:pPr>
+        <w:tabs>
+          <w:tab w:val="num" w:pos="5760"/>
+        </w:tabs>
+        <w:ind w:left="5760" w:hanging="360"/>
+      </w:pPr>
+      <w:rPr>
+        <w:rFonts w:ascii="Wingdings" w:hAnsi="Wingdings" w:hint="default"/>
+        <w:sz w:val="20"/>
+      </w:rPr>
+    </w:lvl>
+    <w:lvl w:ilvl="8" w:tentative="1">
+      <w:start w:val="1"/>
+      <w:numFmt w:val="bullet"/>
+      <w:lvlText w:val=""/>
+      <w:lvlJc w:val="left"/>
+      <w:pPr>
+        <w:tabs>
+          <w:tab w:val="num" w:pos="6480"/>
+        </w:tabs>
+        <w:ind w:left="6480" w:hanging="360"/>
+      </w:pPr>
+      <w:rPr>
+        <w:rFonts w:ascii="Wingdings" w:hAnsi="Wingdings" w:hint="default"/>
+        <w:sz w:val="20"/>
+      </w:rPr>
+    </w:lvl>
+  </w:abstractNum>
+  <w:abstractNum w:abstractNumId="5" w15:restartNumberingAfterBreak="0">
     <w:nsid w:val="3F0C013E"/>
     <w:multiLevelType w:val="hybridMultilevel"/>
     <w:tmpl w:val="A706069E"/>
@@ -1610,7 +5064,156 @@
       </w:pPr>
     </w:lvl>
   </w:abstractNum>
-  <w:abstractNum w:abstractNumId="2" w15:restartNumberingAfterBreak="0">
+  <w:abstractNum w:abstractNumId="6" w15:restartNumberingAfterBreak="0">
+    <w:nsid w:val="428C3367"/>
+    <w:multiLevelType w:val="multilevel"/>
+    <w:tmpl w:val="474A4062"/>
+    <w:lvl w:ilvl="0">
+      <w:start w:val="1"/>
+      <w:numFmt w:val="bullet"/>
+      <w:lvlText w:val=""/>
+      <w:lvlJc w:val="left"/>
+      <w:pPr>
+        <w:tabs>
+          <w:tab w:val="num" w:pos="720"/>
+        </w:tabs>
+        <w:ind w:left="720" w:hanging="360"/>
+      </w:pPr>
+      <w:rPr>
+        <w:rFonts w:ascii="Symbol" w:hAnsi="Symbol" w:hint="default"/>
+        <w:sz w:val="20"/>
+      </w:rPr>
+    </w:lvl>
+    <w:lvl w:ilvl="1" w:tentative="1">
+      <w:start w:val="1"/>
+      <w:numFmt w:val="bullet"/>
+      <w:lvlText w:val="o"/>
+      <w:lvlJc w:val="left"/>
+      <w:pPr>
+        <w:tabs>
+          <w:tab w:val="num" w:pos="1440"/>
+        </w:tabs>
+        <w:ind w:left="1440" w:hanging="360"/>
+      </w:pPr>
+      <w:rPr>
+        <w:rFonts w:ascii="Courier New" w:hAnsi="Courier New" w:hint="default"/>
+        <w:sz w:val="20"/>
+      </w:rPr>
+    </w:lvl>
+    <w:lvl w:ilvl="2" w:tentative="1">
+      <w:start w:val="1"/>
+      <w:numFmt w:val="bullet"/>
+      <w:lvlText w:val=""/>
+      <w:lvlJc w:val="left"/>
+      <w:pPr>
+        <w:tabs>
+          <w:tab w:val="num" w:pos="2160"/>
+        </w:tabs>
+        <w:ind w:left="2160" w:hanging="360"/>
+      </w:pPr>
+      <w:rPr>
+        <w:rFonts w:ascii="Wingdings" w:hAnsi="Wingdings" w:hint="default"/>
+        <w:sz w:val="20"/>
+      </w:rPr>
+    </w:lvl>
+    <w:lvl w:ilvl="3" w:tentative="1">
+      <w:start w:val="1"/>
+      <w:numFmt w:val="bullet"/>
+      <w:lvlText w:val=""/>
+      <w:lvlJc w:val="left"/>
+      <w:pPr>
+        <w:tabs>
+          <w:tab w:val="num" w:pos="2880"/>
+        </w:tabs>
+        <w:ind w:left="2880" w:hanging="360"/>
+      </w:pPr>
+      <w:rPr>
+        <w:rFonts w:ascii="Wingdings" w:hAnsi="Wingdings" w:hint="default"/>
+        <w:sz w:val="20"/>
+      </w:rPr>
+    </w:lvl>
+    <w:lvl w:ilvl="4" w:tentative="1">
+      <w:start w:val="1"/>
+      <w:numFmt w:val="bullet"/>
+      <w:lvlText w:val=""/>
+      <w:lvlJc w:val="left"/>
+      <w:pPr>
+        <w:tabs>
+          <w:tab w:val="num" w:pos="3600"/>
+        </w:tabs>
+        <w:ind w:left="3600" w:hanging="360"/>
+      </w:pPr>
+      <w:rPr>
+        <w:rFonts w:ascii="Wingdings" w:hAnsi="Wingdings" w:hint="default"/>
+        <w:sz w:val="20"/>
+      </w:rPr>
+    </w:lvl>
+    <w:lvl w:ilvl="5" w:tentative="1">
+      <w:start w:val="1"/>
+      <w:numFmt w:val="bullet"/>
+      <w:lvlText w:val=""/>
+      <w:lvlJc w:val="left"/>
+      <w:pPr>
+        <w:tabs>
+          <w:tab w:val="num" w:pos="4320"/>
+        </w:tabs>
+        <w:ind w:left="4320" w:hanging="360"/>
+      </w:pPr>
+      <w:rPr>
+        <w:rFonts w:ascii="Wingdings" w:hAnsi="Wingdings" w:hint="default"/>
+        <w:sz w:val="20"/>
+      </w:rPr>
+    </w:lvl>
+    <w:lvl w:ilvl="6" w:tentative="1">
+      <w:start w:val="1"/>
+      <w:numFmt w:val="bullet"/>
+      <w:lvlText w:val=""/>
+      <w:lvlJc w:val="left"/>
+      <w:pPr>
+        <w:tabs>
+          <w:tab w:val="num" w:pos="5040"/>
+        </w:tabs>
+        <w:ind w:left="5040" w:hanging="360"/>
+      </w:pPr>
+      <w:rPr>
+        <w:rFonts w:ascii="Wingdings" w:hAnsi="Wingdings" w:hint="default"/>
+        <w:sz w:val="20"/>
+      </w:rPr>
+    </w:lvl>
+    <w:lvl w:ilvl="7" w:tentative="1">
+      <w:start w:val="1"/>
+      <w:numFmt w:val="bullet"/>
+      <w:lvlText w:val=""/>
+      <w:lvlJc w:val="left"/>
+      <w:pPr>
+        <w:tabs>
+          <w:tab w:val="num" w:pos="5760"/>
+        </w:tabs>
+        <w:ind w:left="5760" w:hanging="360"/>
+      </w:pPr>
+      <w:rPr>
+        <w:rFonts w:ascii="Wingdings" w:hAnsi="Wingdings" w:hint="default"/>
+        <w:sz w:val="20"/>
+      </w:rPr>
+    </w:lvl>
+    <w:lvl w:ilvl="8" w:tentative="1">
+      <w:start w:val="1"/>
+      <w:numFmt w:val="bullet"/>
+      <w:lvlText w:val=""/>
+      <w:lvlJc w:val="left"/>
+      <w:pPr>
+        <w:tabs>
+          <w:tab w:val="num" w:pos="6480"/>
+        </w:tabs>
+        <w:ind w:left="6480" w:hanging="360"/>
+      </w:pPr>
+      <w:rPr>
+        <w:rFonts w:ascii="Wingdings" w:hAnsi="Wingdings" w:hint="default"/>
+        <w:sz w:val="20"/>
+      </w:rPr>
+    </w:lvl>
+  </w:abstractNum>
+  <w:abstractNum w:abstractNumId="7" w15:restartNumberingAfterBreak="0">
     <w:nsid w:val="4CFE0499"/>
     <w:multiLevelType w:val="hybridMultilevel"/>
     <w:tmpl w:val="91DC105C"/>
@@ -1699,7 +5302,156 @@
       </w:pPr>
     </w:lvl>
   </w:abstractNum>
-  <w:abstractNum w:abstractNumId="3" w15:restartNumberingAfterBreak="0">
+  <w:abstractNum w:abstractNumId="8" w15:restartNumberingAfterBreak="0">
+    <w:nsid w:val="5F687274"/>
+    <w:multiLevelType w:val="multilevel"/>
+    <w:tmpl w:val="4BB85720"/>
+    <w:lvl w:ilvl="0">
+      <w:start w:val="1"/>
+      <w:numFmt w:val="bullet"/>
+      <w:lvlText w:val=""/>
+      <w:lvlJc w:val="left"/>
+      <w:pPr>
+        <w:tabs>
+          <w:tab w:val="num" w:pos="720"/>
+        </w:tabs>
+        <w:ind w:left="720" w:hanging="360"/>
+      </w:pPr>
+      <w:rPr>
+        <w:rFonts w:ascii="Symbol" w:hAnsi="Symbol" w:hint="default"/>
+        <w:sz w:val="20"/>
+      </w:rPr>
+    </w:lvl>
+    <w:lvl w:ilvl="1" w:tentative="1">
+      <w:start w:val="1"/>
+      <w:numFmt w:val="bullet"/>
+      <w:lvlText w:val="o"/>
+      <w:lvlJc w:val="left"/>
+      <w:pPr>
+        <w:tabs>
+          <w:tab w:val="num" w:pos="1440"/>
+        </w:tabs>
+        <w:ind w:left="1440" w:hanging="360"/>
+      </w:pPr>
+      <w:rPr>
+        <w:rFonts w:ascii="Courier New" w:hAnsi="Courier New" w:hint="default"/>
+        <w:sz w:val="20"/>
+      </w:rPr>
+    </w:lvl>
+    <w:lvl w:ilvl="2" w:tentative="1">
+      <w:start w:val="1"/>
+      <w:numFmt w:val="bullet"/>
+      <w:lvlText w:val=""/>
+      <w:lvlJc w:val="left"/>
+      <w:pPr>
+        <w:tabs>
+          <w:tab w:val="num" w:pos="2160"/>
+        </w:tabs>
+        <w:ind w:left="2160" w:hanging="360"/>
+      </w:pPr>
+      <w:rPr>
+        <w:rFonts w:ascii="Wingdings" w:hAnsi="Wingdings" w:hint="default"/>
+        <w:sz w:val="20"/>
+      </w:rPr>
+    </w:lvl>
+    <w:lvl w:ilvl="3" w:tentative="1">
+      <w:start w:val="1"/>
+      <w:numFmt w:val="bullet"/>
+      <w:lvlText w:val=""/>
+      <w:lvlJc w:val="left"/>
+      <w:pPr>
+        <w:tabs>
+          <w:tab w:val="num" w:pos="2880"/>
+        </w:tabs>
+        <w:ind w:left="2880" w:hanging="360"/>
+      </w:pPr>
+      <w:rPr>
+        <w:rFonts w:ascii="Wingdings" w:hAnsi="Wingdings" w:hint="default"/>
+        <w:sz w:val="20"/>
+      </w:rPr>
+    </w:lvl>
+    <w:lvl w:ilvl="4" w:tentative="1">
+      <w:start w:val="1"/>
+      <w:numFmt w:val="bullet"/>
+      <w:lvlText w:val=""/>
+      <w:lvlJc w:val="left"/>
+      <w:pPr>
+        <w:tabs>
+          <w:tab w:val="num" w:pos="3600"/>
+        </w:tabs>
+        <w:ind w:left="3600" w:hanging="360"/>
+      </w:pPr>
+      <w:rPr>
+        <w:rFonts w:ascii="Wingdings" w:hAnsi="Wingdings" w:hint="default"/>
+        <w:sz w:val="20"/>
+      </w:rPr>
+    </w:lvl>
+    <w:lvl w:ilvl="5" w:tentative="1">
+      <w:start w:val="1"/>
+      <w:numFmt w:val="bullet"/>
+      <w:lvlText w:val=""/>
+      <w:lvlJc w:val="left"/>
+      <w:pPr>
+        <w:tabs>
+          <w:tab w:val="num" w:pos="4320"/>
+        </w:tabs>
+        <w:ind w:left="4320" w:hanging="360"/>
+      </w:pPr>
+      <w:rPr>
+        <w:rFonts w:ascii="Wingdings" w:hAnsi="Wingdings" w:hint="default"/>
+        <w:sz w:val="20"/>
+      </w:rPr>
+    </w:lvl>
+    <w:lvl w:ilvl="6" w:tentative="1">
+      <w:start w:val="1"/>
+      <w:numFmt w:val="bullet"/>
+      <w:lvlText w:val=""/>
+      <w:lvlJc w:val="left"/>
+      <w:pPr>
+        <w:tabs>
+          <w:tab w:val="num" w:pos="5040"/>
+        </w:tabs>
+        <w:ind w:left="5040" w:hanging="360"/>
+      </w:pPr>
+      <w:rPr>
+        <w:rFonts w:ascii="Wingdings" w:hAnsi="Wingdings" w:hint="default"/>
+        <w:sz w:val="20"/>
+      </w:rPr>
+    </w:lvl>
+    <w:lvl w:ilvl="7" w:tentative="1">
+      <w:start w:val="1"/>
+      <w:numFmt w:val="bullet"/>
+      <w:lvlText w:val=""/>
+      <w:lvlJc w:val="left"/>
+      <w:pPr>
+        <w:tabs>
+          <w:tab w:val="num" w:pos="5760"/>
+        </w:tabs>
+        <w:ind w:left="5760" w:hanging="360"/>
+      </w:pPr>
+      <w:rPr>
+        <w:rFonts w:ascii="Wingdings" w:hAnsi="Wingdings" w:hint="default"/>
+        <w:sz w:val="20"/>
+      </w:rPr>
+    </w:lvl>
+    <w:lvl w:ilvl="8" w:tentative="1">
+      <w:start w:val="1"/>
+      <w:numFmt w:val="bullet"/>
+      <w:lvlText w:val=""/>
+      <w:lvlJc w:val="left"/>
+      <w:pPr>
+        <w:tabs>
+          <w:tab w:val="num" w:pos="6480"/>
+        </w:tabs>
+        <w:ind w:left="6480" w:hanging="360"/>
+      </w:pPr>
+      <w:rPr>
+        <w:rFonts w:ascii="Wingdings" w:hAnsi="Wingdings" w:hint="default"/>
+        <w:sz w:val="20"/>
+      </w:rPr>
+    </w:lvl>
+  </w:abstractNum>
+  <w:abstractNum w:abstractNumId="9" w15:restartNumberingAfterBreak="0">
     <w:nsid w:val="6142616B"/>
     <w:multiLevelType w:val="multilevel"/>
     <w:tmpl w:val="258CF9A0"/>
@@ -1848,7 +5600,7 @@
       </w:rPr>
     </w:lvl>
   </w:abstractNum>
-  <w:abstractNum w:abstractNumId="4" w15:restartNumberingAfterBreak="0">
+  <w:abstractNum w:abstractNumId="10" w15:restartNumberingAfterBreak="0">
     <w:nsid w:val="615D0667"/>
     <w:multiLevelType w:val="hybridMultilevel"/>
     <w:tmpl w:val="9000C4A4"/>
@@ -1937,7 +5689,7 @@
       </w:pPr>
     </w:lvl>
   </w:abstractNum>
-  <w:abstractNum w:abstractNumId="5" w15:restartNumberingAfterBreak="0">
+  <w:abstractNum w:abstractNumId="11" w15:restartNumberingAfterBreak="0">
     <w:nsid w:val="616A6C17"/>
     <w:multiLevelType w:val="hybridMultilevel"/>
     <w:tmpl w:val="8F8EB438"/>
@@ -2026,7 +5778,7 @@
       </w:pPr>
     </w:lvl>
   </w:abstractNum>
-  <w:abstractNum w:abstractNumId="6" w15:restartNumberingAfterBreak="0">
+  <w:abstractNum w:abstractNumId="12" w15:restartNumberingAfterBreak="0">
     <w:nsid w:val="62E52EA8"/>
     <w:multiLevelType w:val="multilevel"/>
     <w:tmpl w:val="5074C0B8"/>
@@ -2175,7 +5927,305 @@
       </w:rPr>
     </w:lvl>
   </w:abstractNum>
-  <w:abstractNum w:abstractNumId="7" w15:restartNumberingAfterBreak="0">
+  <w:abstractNum w:abstractNumId="13" w15:restartNumberingAfterBreak="0">
+    <w:nsid w:val="64D63A8E"/>
+    <w:multiLevelType w:val="multilevel"/>
+    <w:tmpl w:val="542C7B8A"/>
+    <w:lvl w:ilvl="0">
+      <w:start w:val="1"/>
+      <w:numFmt w:val="bullet"/>
+      <w:lvlText w:val=""/>
+      <w:lvlJc w:val="left"/>
+      <w:pPr>
+        <w:tabs>
+          <w:tab w:val="num" w:pos="720"/>
+        </w:tabs>
+        <w:ind w:left="720" w:hanging="360"/>
+      </w:pPr>
+      <w:rPr>
+        <w:rFonts w:ascii="Symbol" w:hAnsi="Symbol" w:hint="default"/>
+        <w:sz w:val="20"/>
+      </w:rPr>
+    </w:lvl>
+    <w:lvl w:ilvl="1" w:tentative="1">
+      <w:start w:val="1"/>
+      <w:numFmt w:val="bullet"/>
+      <w:lvlText w:val="o"/>
+      <w:lvlJc w:val="left"/>
+      <w:pPr>
+        <w:tabs>
+          <w:tab w:val="num" w:pos="1440"/>
+        </w:tabs>
+        <w:ind w:left="1440" w:hanging="360"/>
+      </w:pPr>
+      <w:rPr>
+        <w:rFonts w:ascii="Courier New" w:hAnsi="Courier New" w:hint="default"/>
+        <w:sz w:val="20"/>
+      </w:rPr>
+    </w:lvl>
+    <w:lvl w:ilvl="2" w:tentative="1">
+      <w:start w:val="1"/>
+      <w:numFmt w:val="bullet"/>
+      <w:lvlText w:val=""/>
+      <w:lvlJc w:val="left"/>
+      <w:pPr>
+        <w:tabs>
+          <w:tab w:val="num" w:pos="2160"/>
+        </w:tabs>
+        <w:ind w:left="2160" w:hanging="360"/>
+      </w:pPr>
+      <w:rPr>
+        <w:rFonts w:ascii="Wingdings" w:hAnsi="Wingdings" w:hint="default"/>
+        <w:sz w:val="20"/>
+      </w:rPr>
+    </w:lvl>
+    <w:lvl w:ilvl="3" w:tentative="1">
+      <w:start w:val="1"/>
+      <w:numFmt w:val="bullet"/>
+      <w:lvlText w:val=""/>
+      <w:lvlJc w:val="left"/>
+      <w:pPr>
+        <w:tabs>
+          <w:tab w:val="num" w:pos="2880"/>
+        </w:tabs>
+        <w:ind w:left="2880" w:hanging="360"/>
+      </w:pPr>
+      <w:rPr>
+        <w:rFonts w:ascii="Wingdings" w:hAnsi="Wingdings" w:hint="default"/>
+        <w:sz w:val="20"/>
+      </w:rPr>
+    </w:lvl>
+    <w:lvl w:ilvl="4" w:tentative="1">
+      <w:start w:val="1"/>
+      <w:numFmt w:val="bullet"/>
+      <w:lvlText w:val=""/>
+      <w:lvlJc w:val="left"/>
+      <w:pPr>
+        <w:tabs>
+          <w:tab w:val="num" w:pos="3600"/>
+        </w:tabs>
+        <w:ind w:left="3600" w:hanging="360"/>
+      </w:pPr>
+      <w:rPr>
+        <w:rFonts w:ascii="Wingdings" w:hAnsi="Wingdings" w:hint="default"/>
+        <w:sz w:val="20"/>
+      </w:rPr>
+    </w:lvl>
+    <w:lvl w:ilvl="5" w:tentative="1">
+      <w:start w:val="1"/>
+      <w:numFmt w:val="bullet"/>
+      <w:lvlText w:val=""/>
+      <w:lvlJc w:val="left"/>
+      <w:pPr>
+        <w:tabs>
+          <w:tab w:val="num" w:pos="4320"/>
+        </w:tabs>
+        <w:ind w:left="4320" w:hanging="360"/>
+      </w:pPr>
+      <w:rPr>
+        <w:rFonts w:ascii="Wingdings" w:hAnsi="Wingdings" w:hint="default"/>
+        <w:sz w:val="20"/>
+      </w:rPr>
+    </w:lvl>
+    <w:lvl w:ilvl="6" w:tentative="1">
+      <w:start w:val="1"/>
+      <w:numFmt w:val="bullet"/>
+      <w:lvlText w:val=""/>
+      <w:lvlJc w:val="left"/>
+      <w:pPr>
+        <w:tabs>
+          <w:tab w:val="num" w:pos="5040"/>
+        </w:tabs>
+        <w:ind w:left="5040" w:hanging="360"/>
+      </w:pPr>
+      <w:rPr>
+        <w:rFonts w:ascii="Wingdings" w:hAnsi="Wingdings" w:hint="default"/>
+        <w:sz w:val="20"/>
+      </w:rPr>
+    </w:lvl>
+    <w:lvl w:ilvl="7" w:tentative="1">
+      <w:start w:val="1"/>
+      <w:numFmt w:val="bullet"/>
+      <w:lvlText w:val=""/>
+      <w:lvlJc w:val="left"/>
+      <w:pPr>
+        <w:tabs>
+          <w:tab w:val="num" w:pos="5760"/>
+        </w:tabs>
+        <w:ind w:left="5760" w:hanging="360"/>
+      </w:pPr>
+      <w:rPr>
+        <w:rFonts w:ascii="Wingdings" w:hAnsi="Wingdings" w:hint="default"/>
+        <w:sz w:val="20"/>
+      </w:rPr>
+    </w:lvl>
+    <w:lvl w:ilvl="8" w:tentative="1">
+      <w:start w:val="1"/>
+      <w:numFmt w:val="bullet"/>
+      <w:lvlText w:val=""/>
+      <w:lvlJc w:val="left"/>
+      <w:pPr>
+        <w:tabs>
+          <w:tab w:val="num" w:pos="6480"/>
+        </w:tabs>
+        <w:ind w:left="6480" w:hanging="360"/>
+      </w:pPr>
+      <w:rPr>
+        <w:rFonts w:ascii="Wingdings" w:hAnsi="Wingdings" w:hint="default"/>
+        <w:sz w:val="20"/>
+      </w:rPr>
+    </w:lvl>
+  </w:abstractNum>
+  <w:abstractNum w:abstractNumId="14" w15:restartNumberingAfterBreak="0">
+    <w:nsid w:val="6C6406F4"/>
+    <w:multiLevelType w:val="multilevel"/>
+    <w:tmpl w:val="DC960F50"/>
+    <w:lvl w:ilvl="0">
+      <w:start w:val="1"/>
+      <w:numFmt w:val="bullet"/>
+      <w:lvlText w:val=""/>
+      <w:lvlJc w:val="left"/>
+      <w:pPr>
+        <w:tabs>
+          <w:tab w:val="num" w:pos="720"/>
+        </w:tabs>
+        <w:ind w:left="720" w:hanging="360"/>
+      </w:pPr>
+      <w:rPr>
+        <w:rFonts w:ascii="Symbol" w:hAnsi="Symbol" w:hint="default"/>
+        <w:sz w:val="20"/>
+      </w:rPr>
+    </w:lvl>
+    <w:lvl w:ilvl="1" w:tentative="1">
+      <w:start w:val="1"/>
+      <w:numFmt w:val="bullet"/>
+      <w:lvlText w:val="o"/>
+      <w:lvlJc w:val="left"/>
+      <w:pPr>
+        <w:tabs>
+          <w:tab w:val="num" w:pos="1440"/>
+        </w:tabs>
+        <w:ind w:left="1440" w:hanging="360"/>
+      </w:pPr>
+      <w:rPr>
+        <w:rFonts w:ascii="Courier New" w:hAnsi="Courier New" w:hint="default"/>
+        <w:sz w:val="20"/>
+      </w:rPr>
+    </w:lvl>
+    <w:lvl w:ilvl="2" w:tentative="1">
+      <w:start w:val="1"/>
+      <w:numFmt w:val="bullet"/>
+      <w:lvlText w:val=""/>
+      <w:lvlJc w:val="left"/>
+      <w:pPr>
+        <w:tabs>
+          <w:tab w:val="num" w:pos="2160"/>
+        </w:tabs>
+        <w:ind w:left="2160" w:hanging="360"/>
+      </w:pPr>
+      <w:rPr>
+        <w:rFonts w:ascii="Wingdings" w:hAnsi="Wingdings" w:hint="default"/>
+        <w:sz w:val="20"/>
+      </w:rPr>
+    </w:lvl>
+    <w:lvl w:ilvl="3" w:tentative="1">
+      <w:start w:val="1"/>
+      <w:numFmt w:val="bullet"/>
+      <w:lvlText w:val=""/>
+      <w:lvlJc w:val="left"/>
+      <w:pPr>
+        <w:tabs>
+          <w:tab w:val="num" w:pos="2880"/>
+        </w:tabs>
+        <w:ind w:left="2880" w:hanging="360"/>
+      </w:pPr>
+      <w:rPr>
+        <w:rFonts w:ascii="Wingdings" w:hAnsi="Wingdings" w:hint="default"/>
+        <w:sz w:val="20"/>
+      </w:rPr>
+    </w:lvl>
+    <w:lvl w:ilvl="4" w:tentative="1">
+      <w:start w:val="1"/>
+      <w:numFmt w:val="bullet"/>
+      <w:lvlText w:val=""/>
+      <w:lvlJc w:val="left"/>
+      <w:pPr>
+        <w:tabs>
+          <w:tab w:val="num" w:pos="3600"/>
+        </w:tabs>
+        <w:ind w:left="3600" w:hanging="360"/>
+      </w:pPr>
+      <w:rPr>
+        <w:rFonts w:ascii="Wingdings" w:hAnsi="Wingdings" w:hint="default"/>
+        <w:sz w:val="20"/>
+      </w:rPr>
+    </w:lvl>
+    <w:lvl w:ilvl="5" w:tentative="1">
+      <w:start w:val="1"/>
+      <w:numFmt w:val="bullet"/>
+      <w:lvlText w:val=""/>
+      <w:lvlJc w:val="left"/>
+      <w:pPr>
+        <w:tabs>
+          <w:tab w:val="num" w:pos="4320"/>
+        </w:tabs>
+        <w:ind w:left="4320" w:hanging="360"/>
+      </w:pPr>
+      <w:rPr>
+        <w:rFonts w:ascii="Wingdings" w:hAnsi="Wingdings" w:hint="default"/>
+        <w:sz w:val="20"/>
+      </w:rPr>
+    </w:lvl>
+    <w:lvl w:ilvl="6" w:tentative="1">
+      <w:start w:val="1"/>
+      <w:numFmt w:val="bullet"/>
+      <w:lvlText w:val=""/>
+      <w:lvlJc w:val="left"/>
+      <w:pPr>
+        <w:tabs>
+          <w:tab w:val="num" w:pos="5040"/>
+        </w:tabs>
+        <w:ind w:left="5040" w:hanging="360"/>
+      </w:pPr>
+      <w:rPr>
+        <w:rFonts w:ascii="Wingdings" w:hAnsi="Wingdings" w:hint="default"/>
+        <w:sz w:val="20"/>
+      </w:rPr>
+    </w:lvl>
+    <w:lvl w:ilvl="7" w:tentative="1">
+      <w:start w:val="1"/>
+      <w:numFmt w:val="bullet"/>
+      <w:lvlText w:val=""/>
+      <w:lvlJc w:val="left"/>
+      <w:pPr>
+        <w:tabs>
+          <w:tab w:val="num" w:pos="5760"/>
+        </w:tabs>
+        <w:ind w:left="5760" w:hanging="360"/>
+      </w:pPr>
+      <w:rPr>
+        <w:rFonts w:ascii="Wingdings" w:hAnsi="Wingdings" w:hint="default"/>
+        <w:sz w:val="20"/>
+      </w:rPr>
+    </w:lvl>
+    <w:lvl w:ilvl="8" w:tentative="1">
+      <w:start w:val="1"/>
+      <w:numFmt w:val="bullet"/>
+      <w:lvlText w:val=""/>
+      <w:lvlJc w:val="left"/>
+      <w:pPr>
+        <w:tabs>
+          <w:tab w:val="num" w:pos="6480"/>
+        </w:tabs>
+        <w:ind w:left="6480" w:hanging="360"/>
+      </w:pPr>
+      <w:rPr>
+        <w:rFonts w:ascii="Wingdings" w:hAnsi="Wingdings" w:hint="default"/>
+        <w:sz w:val="20"/>
+      </w:rPr>
+    </w:lvl>
+  </w:abstractNum>
+  <w:abstractNum w:abstractNumId="15" w15:restartNumberingAfterBreak="0">
     <w:nsid w:val="6F5F5486"/>
     <w:multiLevelType w:val="multilevel"/>
     <w:tmpl w:val="DF925EC8"/>
@@ -2324,7 +6374,7 @@
       </w:rPr>
     </w:lvl>
   </w:abstractNum>
-  <w:abstractNum w:abstractNumId="8" w15:restartNumberingAfterBreak="0">
+  <w:abstractNum w:abstractNumId="16" w15:restartNumberingAfterBreak="0">
     <w:nsid w:val="76E2175C"/>
     <w:multiLevelType w:val="multilevel"/>
     <w:tmpl w:val="C25855FE"/>
@@ -2473,7 +6523,7 @@
       </w:rPr>
     </w:lvl>
   </w:abstractNum>
-  <w:abstractNum w:abstractNumId="9" w15:restartNumberingAfterBreak="0">
+  <w:abstractNum w:abstractNumId="17" w15:restartNumberingAfterBreak="0">
     <w:nsid w:val="79A90858"/>
     <w:multiLevelType w:val="multilevel"/>
     <w:tmpl w:val="6F7C4650"/>
@@ -2622,7 +6672,7 @@
       </w:rPr>
     </w:lvl>
   </w:abstractNum>
-  <w:abstractNum w:abstractNumId="10" w15:restartNumberingAfterBreak="0">
+  <w:abstractNum w:abstractNumId="18" w15:restartNumberingAfterBreak="0">
     <w:nsid w:val="7E7F3464"/>
     <w:multiLevelType w:val="hybridMultilevel"/>
     <w:tmpl w:val="E4F4E77C"/>
@@ -2712,37 +6762,61 @@
     </w:lvl>
   </w:abstractNum>
   <w:num w:numId="1" w16cid:durableId="1983191156">
+    <w:abstractNumId w:val="17"/>
+  </w:num>
+  <w:num w:numId="2" w16cid:durableId="1165901977">
+    <w:abstractNumId w:val="16"/>
+  </w:num>
+  <w:num w:numId="3" w16cid:durableId="200899774">
+    <w:abstractNumId w:val="11"/>
+  </w:num>
+  <w:num w:numId="4" w16cid:durableId="985087451">
+    <w:abstractNumId w:val="10"/>
+  </w:num>
+  <w:num w:numId="5" w16cid:durableId="1569462111">
+    <w:abstractNumId w:val="7"/>
+  </w:num>
+  <w:num w:numId="6" w16cid:durableId="895049046">
+    <w:abstractNumId w:val="18"/>
+  </w:num>
+  <w:num w:numId="7" w16cid:durableId="1824157321">
+    <w:abstractNumId w:val="5"/>
+  </w:num>
+  <w:num w:numId="8" w16cid:durableId="39014597">
+    <w:abstractNumId w:val="2"/>
+  </w:num>
+  <w:num w:numId="9" w16cid:durableId="78409640">
+    <w:abstractNumId w:val="12"/>
+  </w:num>
+  <w:num w:numId="10" w16cid:durableId="2102598756">
     <w:abstractNumId w:val="9"/>
   </w:num>
-  <w:num w:numId="2" w16cid:durableId="1165901977">
+  <w:num w:numId="11" w16cid:durableId="1429619284">
+    <w:abstractNumId w:val="15"/>
+  </w:num>
+  <w:num w:numId="12" w16cid:durableId="894046786">
+    <w:abstractNumId w:val="6"/>
+  </w:num>
+  <w:num w:numId="13" w16cid:durableId="1528103090">
+    <w:abstractNumId w:val="4"/>
+  </w:num>
+  <w:num w:numId="14" w16cid:durableId="13045550">
     <w:abstractNumId w:val="8"/>
   </w:num>
-  <w:num w:numId="3" w16cid:durableId="200899774">
-    <w:abstractNumId w:val="5"/>
+  <w:num w:numId="15" w16cid:durableId="1860968736">
+    <w:abstractNumId w:val="0"/>
   </w:num>
-  <w:num w:numId="4" w16cid:durableId="985087451">
-    <w:abstractNumId w:val="4"/>
-  </w:num>
-  <w:num w:numId="5" w16cid:durableId="1569462111">
-    <w:abstractNumId w:val="2"/>
-  </w:num>
-  <w:num w:numId="6" w16cid:durableId="895049046">
-    <w:abstractNumId w:val="10"/>
-  </w:num>
-  <w:num w:numId="7" w16cid:durableId="1824157321">
+  <w:num w:numId="16" w16cid:durableId="1952929990">
     <w:abstractNumId w:val="1"/>
   </w:num>
-  <w:num w:numId="8" w16cid:durableId="39014597">
-    <w:abstractNumId w:val="0"/>
+  <w:num w:numId="17" w16cid:durableId="1644584623">
+    <w:abstractNumId w:val="13"/>
   </w:num>
-  <w:num w:numId="9" w16cid:durableId="78409640">
-    <w:abstractNumId w:val="6"/>
-  </w:num>
-  <w:num w:numId="10" w16cid:durableId="2102598756">
+  <w:num w:numId="18" w16cid:durableId="1884711325">
     <w:abstractNumId w:val="3"/>
   </w:num>
-  <w:num w:numId="11" w16cid:durableId="1429619284">
-    <w:abstractNumId w:val="7"/>
+  <w:num w:numId="19" w16cid:durableId="1479346868">
+    <w:abstractNumId w:val="14"/>
   </w:num>
 </w:numbering>
 </file>
@@ -3350,6 +7424,7 @@
   <w:style w:type="character" w:default="1" w:styleId="Fuentedeprrafopredeter">
     <w:name w:val="Default Paragraph Font"/>
     <w:uiPriority w:val="1"/>
+    <w:semiHidden/>
     <w:unhideWhenUsed/>
   </w:style>
   <w:style w:type="table" w:default="1" w:styleId="Tablanormal">

</xml_diff>

<commit_message>
Actualizacion de informe incorporando gestorDeArchivos
</commit_message>
<xml_diff>
--- a/Informe/INFORME.docx
+++ b/Informe/INFORME.docx
@@ -687,15 +687,7 @@
       </w:r>
       <w:r>
         <w:lastRenderedPageBreak/>
-        <w:t xml:space="preserve">ceros y unos), la cual resulta ser la estructura matemática </w:t>
-      </w:r>
-      <w:proofErr w:type="gramStart"/>
-      <w:r>
-        <w:t>más óptima</w:t>
-      </w:r>
-      <w:proofErr w:type="gramEnd"/>
-      <w:r>
-        <w:t xml:space="preserve"> para cruzar e identificar rápidamente los amigos en común sin saturar el procesamiento.</w:t>
+        <w:t>ceros y unos), la cual resulta ser la estructura matemática más óptima para cruzar e identificar rápidamente los amigos en común sin saturar el procesamiento.</w:t>
       </w:r>
     </w:p>
     <w:p>
@@ -2609,16 +2601,7 @@
           <w:szCs w:val="28"/>
           <w:lang w:val="es-ES"/>
         </w:rPr>
-        <w:t xml:space="preserve"> El ID del amigo que se desea visitar y la acción a realizar (ver siguiente foto o </w:t>
-      </w:r>
-      <w:proofErr w:type="gramStart"/>
-      <w:r>
-        <w:rPr>
-          <w:sz w:val="28"/>
-          <w:szCs w:val="28"/>
-          <w:lang w:val="es-ES"/>
-        </w:rPr>
-        <w:t xml:space="preserve">dar </w:t>
+        <w:t xml:space="preserve"> El ID del amigo que se desea visitar y la acción a realizar (ver siguiente foto o dar </w:t>
       </w:r>
       <w:proofErr w:type="spellStart"/>
       <w:r>
@@ -2632,7 +2615,6 @@
         <w:t>like</w:t>
       </w:r>
       <w:proofErr w:type="spellEnd"/>
-      <w:proofErr w:type="gramEnd"/>
       <w:r>
         <w:rPr>
           <w:sz w:val="28"/>
@@ -3027,7 +3009,6 @@
         </w:rPr>
         <w:t xml:space="preserve"> al </w:t>
       </w:r>
-      <w:proofErr w:type="gramStart"/>
       <w:r>
         <w:rPr>
           <w:sz w:val="28"/>
@@ -3042,16 +3023,7 @@
           <w:szCs w:val="28"/>
           <w:lang w:val="es-ES"/>
         </w:rPr>
-        <w:t xml:space="preserve"> cada</w:t>
-      </w:r>
-      <w:proofErr w:type="gramEnd"/>
-      <w:r>
-        <w:rPr>
-          <w:sz w:val="28"/>
-          <w:szCs w:val="28"/>
-          <w:lang w:val="es-ES"/>
-        </w:rPr>
-        <w:t xml:space="preserve"> proceso de los módulos anteriores. </w:t>
+        <w:t xml:space="preserve"> cada proceso de los módulos anteriores. </w:t>
       </w:r>
     </w:p>
     <w:p>
@@ -3571,16 +3543,7 @@
           <w:szCs w:val="28"/>
           <w:lang w:val="es-ES"/>
         </w:rPr>
-        <w:t>estructuras_base.</w:t>
-      </w:r>
-      <w:proofErr w:type="gramStart"/>
-      <w:r>
-        <w:rPr>
-          <w:sz w:val="28"/>
-          <w:szCs w:val="28"/>
-          <w:lang w:val="es-ES"/>
-        </w:rPr>
-        <w:t>h</w:t>
+        <w:t>estructuras_base.h</w:t>
       </w:r>
       <w:proofErr w:type="spellEnd"/>
       <w:r>
@@ -3589,16 +3552,7 @@
           <w:szCs w:val="28"/>
           <w:lang w:val="es-ES"/>
         </w:rPr>
-        <w:t xml:space="preserve">  y</w:t>
-      </w:r>
-      <w:proofErr w:type="gramEnd"/>
-      <w:r>
-        <w:rPr>
-          <w:sz w:val="28"/>
-          <w:szCs w:val="28"/>
-          <w:lang w:val="es-ES"/>
-        </w:rPr>
-        <w:t xml:space="preserve"> .</w:t>
+        <w:t xml:space="preserve">  y .</w:t>
       </w:r>
       <w:proofErr w:type="spellStart"/>
       <w:r>
@@ -3673,7 +3627,6 @@
         <w:t xml:space="preserve">   y .</w:t>
       </w:r>
       <w:proofErr w:type="spellStart"/>
-      <w:proofErr w:type="gramStart"/>
       <w:r>
         <w:rPr>
           <w:sz w:val="28"/>
@@ -3689,16 +3642,7 @@
           <w:szCs w:val="28"/>
           <w:lang w:val="es-ES"/>
         </w:rPr>
-        <w:t xml:space="preserve">  &lt;</w:t>
-      </w:r>
-      <w:proofErr w:type="gramEnd"/>
-      <w:r>
-        <w:rPr>
-          <w:sz w:val="28"/>
-          <w:szCs w:val="28"/>
-          <w:lang w:val="es-ES"/>
-        </w:rPr>
-        <w:t xml:space="preserve">-- </w:t>
+        <w:t xml:space="preserve">  &lt;-- </w:t>
       </w:r>
       <w:r>
         <w:rPr>
@@ -3759,16 +3703,7 @@
           <w:szCs w:val="28"/>
           <w:lang w:val="es-ES"/>
         </w:rPr>
-        <w:t>monitor_recursos.</w:t>
-      </w:r>
-      <w:proofErr w:type="gramStart"/>
-      <w:r>
-        <w:rPr>
-          <w:sz w:val="28"/>
-          <w:szCs w:val="28"/>
-          <w:lang w:val="es-ES"/>
-        </w:rPr>
-        <w:t>h</w:t>
+        <w:t>monitor_recursos.h</w:t>
       </w:r>
       <w:proofErr w:type="spellEnd"/>
       <w:r>
@@ -3777,16 +3712,7 @@
           <w:szCs w:val="28"/>
           <w:lang w:val="es-ES"/>
         </w:rPr>
-        <w:t xml:space="preserve">  y</w:t>
-      </w:r>
-      <w:proofErr w:type="gramEnd"/>
-      <w:r>
-        <w:rPr>
-          <w:sz w:val="28"/>
-          <w:szCs w:val="28"/>
-          <w:lang w:val="es-ES"/>
-        </w:rPr>
-        <w:t xml:space="preserve"> .</w:t>
+        <w:t xml:space="preserve">  y .</w:t>
       </w:r>
       <w:proofErr w:type="spellStart"/>
       <w:r>
@@ -4115,7 +4041,6 @@
         <w:t xml:space="preserve">   y .</w:t>
       </w:r>
       <w:proofErr w:type="spellStart"/>
-      <w:proofErr w:type="gramStart"/>
       <w:r>
         <w:rPr>
           <w:sz w:val="28"/>
@@ -4131,16 +4056,7 @@
           <w:szCs w:val="28"/>
           <w:lang w:val="es-ES"/>
         </w:rPr>
-        <w:t xml:space="preserve">  &lt;</w:t>
-      </w:r>
-      <w:proofErr w:type="gramEnd"/>
-      <w:r>
-        <w:rPr>
-          <w:sz w:val="28"/>
-          <w:szCs w:val="28"/>
-          <w:lang w:val="es-ES"/>
-        </w:rPr>
-        <w:t>-- ¡Aquí iniciará Solarte!</w:t>
+        <w:t xml:space="preserve">  &lt;-- ¡Aquí iniciará Solarte!</w:t>
       </w:r>
     </w:p>
     <w:p>
@@ -4214,7 +4130,2926 @@
         <w:rPr>
           <w:sz w:val="28"/>
           <w:szCs w:val="28"/>
-          <w:lang w:val="es-ES"/>
+        </w:rPr>
+      </w:pPr>
+      <w:r>
+        <w:rPr>
+          <w:b/>
+          <w:bCs/>
+          <w:sz w:val="28"/>
+          <w:szCs w:val="28"/>
+        </w:rPr>
+        <w:t>Capa de Control (main.cpp)</w:t>
+      </w:r>
+      <w:r>
+        <w:rPr>
+          <w:sz w:val="28"/>
+          <w:szCs w:val="28"/>
+        </w:rPr>
+        <w:t xml:space="preserve"> – Orquestador del flujo, instancia los módulos y captura errores. </w:t>
+      </w:r>
+    </w:p>
+    <w:p>
+      <w:pPr>
+        <w:spacing w:after="0"/>
+        <w:rPr>
+          <w:sz w:val="28"/>
+          <w:szCs w:val="28"/>
+        </w:rPr>
+      </w:pPr>
+    </w:p>
+    <w:p>
+      <w:pPr>
+        <w:spacing w:after="0"/>
+        <w:rPr>
+          <w:sz w:val="28"/>
+          <w:szCs w:val="28"/>
+        </w:rPr>
+      </w:pPr>
+    </w:p>
+    <w:p>
+      <w:pPr>
+        <w:spacing w:after="0"/>
+        <w:rPr>
+          <w:b/>
+          <w:bCs/>
+          <w:sz w:val="28"/>
+          <w:szCs w:val="28"/>
+        </w:rPr>
+      </w:pPr>
+      <w:proofErr w:type="spellStart"/>
+      <w:r>
+        <w:rPr>
+          <w:b/>
+          <w:bCs/>
+          <w:sz w:val="28"/>
+          <w:szCs w:val="28"/>
+        </w:rPr>
+        <w:t>UsuarioLigero</w:t>
+      </w:r>
+      <w:proofErr w:type="spellEnd"/>
+      <w:r>
+        <w:rPr>
+          <w:b/>
+          <w:bCs/>
+          <w:sz w:val="28"/>
+          <w:szCs w:val="28"/>
+        </w:rPr>
+        <w:t xml:space="preserve"> (</w:t>
+      </w:r>
+      <w:proofErr w:type="spellStart"/>
+      <w:r>
+        <w:rPr>
+          <w:b/>
+          <w:bCs/>
+          <w:sz w:val="28"/>
+          <w:szCs w:val="28"/>
+        </w:rPr>
+        <w:t>core</w:t>
+      </w:r>
+      <w:proofErr w:type="spellEnd"/>
+      <w:r>
+        <w:rPr>
+          <w:b/>
+          <w:bCs/>
+          <w:sz w:val="28"/>
+          <w:szCs w:val="28"/>
+        </w:rPr>
+        <w:t>/</w:t>
+      </w:r>
+      <w:proofErr w:type="spellStart"/>
+      <w:r>
+        <w:rPr>
+          <w:b/>
+          <w:bCs/>
+          <w:sz w:val="28"/>
+          <w:szCs w:val="28"/>
+        </w:rPr>
+        <w:t>estructuras_base</w:t>
+      </w:r>
+      <w:proofErr w:type="spellEnd"/>
+      <w:r>
+        <w:rPr>
+          <w:b/>
+          <w:bCs/>
+          <w:sz w:val="28"/>
+          <w:szCs w:val="28"/>
+        </w:rPr>
+        <w:t>)</w:t>
+      </w:r>
+      <w:r>
+        <w:rPr>
+          <w:b/>
+          <w:bCs/>
+          <w:sz w:val="28"/>
+          <w:szCs w:val="28"/>
+        </w:rPr>
+        <w:t>:</w:t>
+      </w:r>
+    </w:p>
+    <w:tbl>
+      <w:tblPr>
+        <w:tblW w:w="8667" w:type="dxa"/>
+        <w:tblCellSpacing w:w="15" w:type="dxa"/>
+        <w:tblCellMar>
+          <w:top w:w="15" w:type="dxa"/>
+          <w:left w:w="15" w:type="dxa"/>
+          <w:bottom w:w="15" w:type="dxa"/>
+          <w:right w:w="15" w:type="dxa"/>
+        </w:tblCellMar>
+        <w:tblLook w:val="04A0" w:firstRow="1" w:lastRow="0" w:firstColumn="1" w:lastColumn="0" w:noHBand="0" w:noVBand="1"/>
+      </w:tblPr>
+      <w:tblGrid>
+        <w:gridCol w:w="3028"/>
+        <w:gridCol w:w="1946"/>
+        <w:gridCol w:w="3693"/>
+      </w:tblGrid>
+      <w:tr>
+        <w:trPr>
+          <w:trHeight w:val="272"/>
+          <w:tblHeader/>
+          <w:tblCellSpacing w:w="15" w:type="dxa"/>
+        </w:trPr>
+        <w:tc>
+          <w:tcPr>
+            <w:tcW w:w="0" w:type="auto"/>
+            <w:vAlign w:val="center"/>
+            <w:hideMark/>
+          </w:tcPr>
+          <w:p>
+            <w:pPr>
+              <w:spacing w:after="0"/>
+              <w:rPr>
+                <w:b/>
+                <w:bCs/>
+                <w:sz w:val="28"/>
+                <w:szCs w:val="28"/>
+              </w:rPr>
+            </w:pPr>
+            <w:r>
+              <w:rPr>
+                <w:b/>
+                <w:bCs/>
+                <w:sz w:val="28"/>
+                <w:szCs w:val="28"/>
+              </w:rPr>
+              <w:t>Elemento</w:t>
+            </w:r>
+          </w:p>
+        </w:tc>
+        <w:tc>
+          <w:tcPr>
+            <w:tcW w:w="0" w:type="auto"/>
+            <w:vAlign w:val="center"/>
+            <w:hideMark/>
+          </w:tcPr>
+          <w:p>
+            <w:pPr>
+              <w:spacing w:after="0"/>
+              <w:rPr>
+                <w:b/>
+                <w:bCs/>
+                <w:sz w:val="28"/>
+                <w:szCs w:val="28"/>
+              </w:rPr>
+            </w:pPr>
+            <w:r>
+              <w:rPr>
+                <w:b/>
+                <w:bCs/>
+                <w:sz w:val="28"/>
+                <w:szCs w:val="28"/>
+              </w:rPr>
+              <w:t>Propósito</w:t>
+            </w:r>
+          </w:p>
+        </w:tc>
+        <w:tc>
+          <w:tcPr>
+            <w:tcW w:w="3648" w:type="dxa"/>
+            <w:vAlign w:val="center"/>
+            <w:hideMark/>
+          </w:tcPr>
+          <w:p>
+            <w:pPr>
+              <w:spacing w:after="0"/>
+              <w:rPr>
+                <w:b/>
+                <w:bCs/>
+                <w:sz w:val="28"/>
+                <w:szCs w:val="28"/>
+              </w:rPr>
+            </w:pPr>
+            <w:r>
+              <w:rPr>
+                <w:b/>
+                <w:bCs/>
+                <w:sz w:val="28"/>
+                <w:szCs w:val="28"/>
+              </w:rPr>
+              <w:t>Comentario</w:t>
+            </w:r>
+          </w:p>
+        </w:tc>
+      </w:tr>
+      <w:tr>
+        <w:trPr>
+          <w:trHeight w:val="1123"/>
+          <w:tblCellSpacing w:w="15" w:type="dxa"/>
+        </w:trPr>
+        <w:tc>
+          <w:tcPr>
+            <w:tcW w:w="0" w:type="auto"/>
+            <w:vAlign w:val="center"/>
+            <w:hideMark/>
+          </w:tcPr>
+          <w:p>
+            <w:pPr>
+              <w:spacing w:after="0"/>
+              <w:rPr>
+                <w:sz w:val="28"/>
+                <w:szCs w:val="28"/>
+              </w:rPr>
+            </w:pPr>
+            <w:r>
+              <w:rPr>
+                <w:sz w:val="28"/>
+                <w:szCs w:val="28"/>
+              </w:rPr>
+              <w:t xml:space="preserve">Atributos </w:t>
+            </w:r>
+            <w:proofErr w:type="spellStart"/>
+            <w:r>
+              <w:rPr>
+                <w:sz w:val="28"/>
+                <w:szCs w:val="28"/>
+              </w:rPr>
+              <w:t>char</w:t>
+            </w:r>
+            <w:proofErr w:type="spellEnd"/>
+            <w:r>
+              <w:rPr>
+                <w:sz w:val="28"/>
+                <w:szCs w:val="28"/>
+              </w:rPr>
+              <w:t xml:space="preserve">* </w:t>
+            </w:r>
+            <w:proofErr w:type="spellStart"/>
+            <w:r>
+              <w:rPr>
+                <w:sz w:val="28"/>
+                <w:szCs w:val="28"/>
+              </w:rPr>
+              <w:t>idUsuario</w:t>
+            </w:r>
+            <w:proofErr w:type="spellEnd"/>
+            <w:r>
+              <w:rPr>
+                <w:sz w:val="28"/>
+                <w:szCs w:val="28"/>
+              </w:rPr>
+              <w:t xml:space="preserve">, </w:t>
+            </w:r>
+            <w:proofErr w:type="spellStart"/>
+            <w:r>
+              <w:rPr>
+                <w:sz w:val="28"/>
+                <w:szCs w:val="28"/>
+              </w:rPr>
+              <w:t>char</w:t>
+            </w:r>
+            <w:proofErr w:type="spellEnd"/>
+            <w:r>
+              <w:rPr>
+                <w:sz w:val="28"/>
+                <w:szCs w:val="28"/>
+              </w:rPr>
+              <w:t xml:space="preserve">* </w:t>
+            </w:r>
+            <w:proofErr w:type="spellStart"/>
+            <w:r>
+              <w:rPr>
+                <w:sz w:val="28"/>
+                <w:szCs w:val="28"/>
+              </w:rPr>
+              <w:t>contrasena</w:t>
+            </w:r>
+            <w:proofErr w:type="spellEnd"/>
+            <w:r>
+              <w:rPr>
+                <w:sz w:val="28"/>
+                <w:szCs w:val="28"/>
+              </w:rPr>
+              <w:t xml:space="preserve">, </w:t>
+            </w:r>
+            <w:proofErr w:type="spellStart"/>
+            <w:r>
+              <w:rPr>
+                <w:sz w:val="28"/>
+                <w:szCs w:val="28"/>
+              </w:rPr>
+              <w:t>char</w:t>
+            </w:r>
+            <w:proofErr w:type="spellEnd"/>
+            <w:r>
+              <w:rPr>
+                <w:sz w:val="28"/>
+                <w:szCs w:val="28"/>
+              </w:rPr>
+              <w:t xml:space="preserve">* </w:t>
+            </w:r>
+            <w:proofErr w:type="spellStart"/>
+            <w:r>
+              <w:rPr>
+                <w:sz w:val="28"/>
+                <w:szCs w:val="28"/>
+              </w:rPr>
+              <w:t>nombreUsuario</w:t>
+            </w:r>
+            <w:proofErr w:type="spellEnd"/>
+          </w:p>
+        </w:tc>
+        <w:tc>
+          <w:tcPr>
+            <w:tcW w:w="0" w:type="auto"/>
+            <w:vAlign w:val="center"/>
+            <w:hideMark/>
+          </w:tcPr>
+          <w:p>
+            <w:pPr>
+              <w:spacing w:after="0"/>
+              <w:rPr>
+                <w:sz w:val="28"/>
+                <w:szCs w:val="28"/>
+              </w:rPr>
+            </w:pPr>
+            <w:r>
+              <w:rPr>
+                <w:sz w:val="28"/>
+                <w:szCs w:val="28"/>
+              </w:rPr>
+              <w:t>Almacenan datos del usuario como C</w:t>
+            </w:r>
+            <w:r>
+              <w:rPr>
+                <w:sz w:val="28"/>
+                <w:szCs w:val="28"/>
+              </w:rPr>
+              <w:noBreakHyphen/>
+            </w:r>
+            <w:proofErr w:type="spellStart"/>
+            <w:r>
+              <w:rPr>
+                <w:sz w:val="28"/>
+                <w:szCs w:val="28"/>
+              </w:rPr>
+              <w:t>strings</w:t>
+            </w:r>
+            <w:proofErr w:type="spellEnd"/>
+            <w:r>
+              <w:rPr>
+                <w:sz w:val="28"/>
+                <w:szCs w:val="28"/>
+              </w:rPr>
+              <w:t>.</w:t>
+            </w:r>
+          </w:p>
+        </w:tc>
+        <w:tc>
+          <w:tcPr>
+            <w:tcW w:w="3648" w:type="dxa"/>
+            <w:vAlign w:val="center"/>
+            <w:hideMark/>
+          </w:tcPr>
+          <w:p>
+            <w:pPr>
+              <w:spacing w:after="0"/>
+              <w:rPr>
+                <w:sz w:val="28"/>
+                <w:szCs w:val="28"/>
+              </w:rPr>
+            </w:pPr>
+            <w:r>
+              <w:rPr>
+                <w:sz w:val="28"/>
+                <w:szCs w:val="28"/>
+              </w:rPr>
+              <w:t xml:space="preserve">Se inicializan a </w:t>
+            </w:r>
+            <w:proofErr w:type="spellStart"/>
+            <w:r>
+              <w:rPr>
+                <w:sz w:val="28"/>
+                <w:szCs w:val="28"/>
+              </w:rPr>
+              <w:t>nullptr</w:t>
+            </w:r>
+            <w:proofErr w:type="spellEnd"/>
+            <w:r>
+              <w:rPr>
+                <w:sz w:val="28"/>
+                <w:szCs w:val="28"/>
+              </w:rPr>
+              <w:t xml:space="preserve"> (puntero nulo).</w:t>
+            </w:r>
+          </w:p>
+        </w:tc>
+      </w:tr>
+      <w:tr>
+        <w:trPr>
+          <w:trHeight w:val="1123"/>
+          <w:tblCellSpacing w:w="15" w:type="dxa"/>
+        </w:trPr>
+        <w:tc>
+          <w:tcPr>
+            <w:tcW w:w="0" w:type="auto"/>
+            <w:vAlign w:val="center"/>
+            <w:hideMark/>
+          </w:tcPr>
+          <w:p>
+            <w:pPr>
+              <w:spacing w:after="0"/>
+              <w:rPr>
+                <w:sz w:val="28"/>
+                <w:szCs w:val="28"/>
+              </w:rPr>
+            </w:pPr>
+            <w:r>
+              <w:rPr>
+                <w:sz w:val="28"/>
+                <w:szCs w:val="28"/>
+              </w:rPr>
+              <w:t xml:space="preserve">Constructor por defecto </w:t>
+            </w:r>
+            <w:proofErr w:type="spellStart"/>
+            <w:r>
+              <w:rPr>
+                <w:sz w:val="28"/>
+                <w:szCs w:val="28"/>
+              </w:rPr>
+              <w:t>UsuarioLigero</w:t>
+            </w:r>
+            <w:proofErr w:type="spellEnd"/>
+            <w:r>
+              <w:rPr>
+                <w:sz w:val="28"/>
+                <w:szCs w:val="28"/>
+              </w:rPr>
+              <w:t>()</w:t>
+            </w:r>
+          </w:p>
+        </w:tc>
+        <w:tc>
+          <w:tcPr>
+            <w:tcW w:w="0" w:type="auto"/>
+            <w:vAlign w:val="center"/>
+            <w:hideMark/>
+          </w:tcPr>
+          <w:p>
+            <w:pPr>
+              <w:spacing w:after="0"/>
+              <w:rPr>
+                <w:sz w:val="28"/>
+                <w:szCs w:val="28"/>
+              </w:rPr>
+            </w:pPr>
+            <w:r>
+              <w:rPr>
+                <w:sz w:val="28"/>
+                <w:szCs w:val="28"/>
+              </w:rPr>
+              <w:t xml:space="preserve">Asigna </w:t>
+            </w:r>
+            <w:proofErr w:type="spellStart"/>
+            <w:r>
+              <w:rPr>
+                <w:sz w:val="28"/>
+                <w:szCs w:val="28"/>
+              </w:rPr>
+              <w:t>nullptr</w:t>
+            </w:r>
+            <w:proofErr w:type="spellEnd"/>
+            <w:r>
+              <w:rPr>
+                <w:sz w:val="28"/>
+                <w:szCs w:val="28"/>
+              </w:rPr>
+              <w:t xml:space="preserve"> a los tres punteros.</w:t>
+            </w:r>
+          </w:p>
+        </w:tc>
+        <w:tc>
+          <w:tcPr>
+            <w:tcW w:w="3648" w:type="dxa"/>
+            <w:vAlign w:val="center"/>
+            <w:hideMark/>
+          </w:tcPr>
+          <w:p>
+            <w:pPr>
+              <w:spacing w:after="0"/>
+              <w:rPr>
+                <w:sz w:val="28"/>
+                <w:szCs w:val="28"/>
+              </w:rPr>
+            </w:pPr>
+            <w:r>
+              <w:rPr>
+                <w:sz w:val="28"/>
+                <w:szCs w:val="28"/>
+              </w:rPr>
+              <w:t xml:space="preserve">Necesario porque new </w:t>
+            </w:r>
+            <w:proofErr w:type="spellStart"/>
+            <w:r>
+              <w:rPr>
+                <w:sz w:val="28"/>
+                <w:szCs w:val="28"/>
+              </w:rPr>
+              <w:t>UsuarioLigero</w:t>
+            </w:r>
+            <w:proofErr w:type="spellEnd"/>
+            <w:r>
+              <w:rPr>
+                <w:sz w:val="28"/>
+                <w:szCs w:val="28"/>
+              </w:rPr>
+              <w:t>[n] llama a este constructor para cada casillero.</w:t>
+            </w:r>
+          </w:p>
+        </w:tc>
+      </w:tr>
+      <w:tr>
+        <w:trPr>
+          <w:trHeight w:val="1123"/>
+          <w:tblCellSpacing w:w="15" w:type="dxa"/>
+        </w:trPr>
+        <w:tc>
+          <w:tcPr>
+            <w:tcW w:w="0" w:type="auto"/>
+            <w:vAlign w:val="center"/>
+            <w:hideMark/>
+          </w:tcPr>
+          <w:p>
+            <w:pPr>
+              <w:spacing w:after="0"/>
+              <w:rPr>
+                <w:sz w:val="28"/>
+                <w:szCs w:val="28"/>
+              </w:rPr>
+            </w:pPr>
+            <w:r>
+              <w:rPr>
+                <w:sz w:val="28"/>
+                <w:szCs w:val="28"/>
+              </w:rPr>
+              <w:t xml:space="preserve">Constructor de copia </w:t>
+            </w:r>
+            <w:proofErr w:type="spellStart"/>
+            <w:r>
+              <w:rPr>
+                <w:sz w:val="28"/>
+                <w:szCs w:val="28"/>
+              </w:rPr>
+              <w:t>UsuarioLigero</w:t>
+            </w:r>
+            <w:proofErr w:type="spellEnd"/>
+            <w:r>
+              <w:rPr>
+                <w:sz w:val="28"/>
+                <w:szCs w:val="28"/>
+              </w:rPr>
+              <w:t>(</w:t>
+            </w:r>
+            <w:proofErr w:type="spellStart"/>
+            <w:r>
+              <w:rPr>
+                <w:sz w:val="28"/>
+                <w:szCs w:val="28"/>
+              </w:rPr>
+              <w:t>const</w:t>
+            </w:r>
+            <w:proofErr w:type="spellEnd"/>
+            <w:r>
+              <w:rPr>
+                <w:sz w:val="28"/>
+                <w:szCs w:val="28"/>
+              </w:rPr>
+              <w:t xml:space="preserve"> </w:t>
+            </w:r>
+            <w:proofErr w:type="spellStart"/>
+            <w:r>
+              <w:rPr>
+                <w:sz w:val="28"/>
+                <w:szCs w:val="28"/>
+              </w:rPr>
+              <w:t>UsuarioLigero</w:t>
+            </w:r>
+            <w:proofErr w:type="spellEnd"/>
+            <w:r>
+              <w:rPr>
+                <w:sz w:val="28"/>
+                <w:szCs w:val="28"/>
+              </w:rPr>
+              <w:t>&amp; otro)</w:t>
+            </w:r>
+          </w:p>
+        </w:tc>
+        <w:tc>
+          <w:tcPr>
+            <w:tcW w:w="0" w:type="auto"/>
+            <w:vAlign w:val="center"/>
+            <w:hideMark/>
+          </w:tcPr>
+          <w:p>
+            <w:pPr>
+              <w:spacing w:after="0"/>
+              <w:rPr>
+                <w:sz w:val="28"/>
+                <w:szCs w:val="28"/>
+              </w:rPr>
+            </w:pPr>
+            <w:r>
+              <w:rPr>
+                <w:sz w:val="28"/>
+                <w:szCs w:val="28"/>
+              </w:rPr>
+              <w:t xml:space="preserve">Crea copias profundas usando </w:t>
+            </w:r>
+            <w:proofErr w:type="spellStart"/>
+            <w:r>
+              <w:rPr>
+                <w:sz w:val="28"/>
+                <w:szCs w:val="28"/>
+              </w:rPr>
+              <w:t>copiarTexto</w:t>
+            </w:r>
+            <w:proofErr w:type="spellEnd"/>
+            <w:r>
+              <w:rPr>
+                <w:sz w:val="28"/>
+                <w:szCs w:val="28"/>
+              </w:rPr>
+              <w:t>.</w:t>
+            </w:r>
+          </w:p>
+        </w:tc>
+        <w:tc>
+          <w:tcPr>
+            <w:tcW w:w="3648" w:type="dxa"/>
+            <w:vAlign w:val="center"/>
+            <w:hideMark/>
+          </w:tcPr>
+          <w:p>
+            <w:pPr>
+              <w:spacing w:after="0"/>
+              <w:rPr>
+                <w:sz w:val="28"/>
+                <w:szCs w:val="28"/>
+              </w:rPr>
+            </w:pPr>
+            <w:r>
+              <w:rPr>
+                <w:sz w:val="28"/>
+                <w:szCs w:val="28"/>
+              </w:rPr>
+              <w:t>Evita doble free al compartir memoria.</w:t>
+            </w:r>
+          </w:p>
+        </w:tc>
+      </w:tr>
+      <w:tr>
+        <w:trPr>
+          <w:trHeight w:val="838"/>
+          <w:tblCellSpacing w:w="15" w:type="dxa"/>
+        </w:trPr>
+        <w:tc>
+          <w:tcPr>
+            <w:tcW w:w="0" w:type="auto"/>
+            <w:vAlign w:val="center"/>
+            <w:hideMark/>
+          </w:tcPr>
+          <w:p>
+            <w:pPr>
+              <w:spacing w:after="0"/>
+              <w:rPr>
+                <w:sz w:val="28"/>
+                <w:szCs w:val="28"/>
+              </w:rPr>
+            </w:pPr>
+            <w:r>
+              <w:rPr>
+                <w:sz w:val="28"/>
+                <w:szCs w:val="28"/>
+              </w:rPr>
+              <w:t>Destructor ~</w:t>
+            </w:r>
+            <w:proofErr w:type="spellStart"/>
+            <w:r>
+              <w:rPr>
+                <w:sz w:val="28"/>
+                <w:szCs w:val="28"/>
+              </w:rPr>
+              <w:t>UsuarioLigero</w:t>
+            </w:r>
+            <w:proofErr w:type="spellEnd"/>
+            <w:r>
+              <w:rPr>
+                <w:sz w:val="28"/>
+                <w:szCs w:val="28"/>
+              </w:rPr>
+              <w:t>()</w:t>
+            </w:r>
+          </w:p>
+        </w:tc>
+        <w:tc>
+          <w:tcPr>
+            <w:tcW w:w="0" w:type="auto"/>
+            <w:vAlign w:val="center"/>
+            <w:hideMark/>
+          </w:tcPr>
+          <w:p>
+            <w:pPr>
+              <w:spacing w:after="0"/>
+              <w:rPr>
+                <w:sz w:val="28"/>
+                <w:szCs w:val="28"/>
+              </w:rPr>
+            </w:pPr>
+            <w:proofErr w:type="spellStart"/>
+            <w:r>
+              <w:rPr>
+                <w:sz w:val="28"/>
+                <w:szCs w:val="28"/>
+              </w:rPr>
+              <w:t>delete</w:t>
+            </w:r>
+            <w:proofErr w:type="spellEnd"/>
+            <w:r>
+              <w:rPr>
+                <w:sz w:val="28"/>
+                <w:szCs w:val="28"/>
+              </w:rPr>
+              <w:t>[] de cada campo.</w:t>
+            </w:r>
+          </w:p>
+        </w:tc>
+        <w:tc>
+          <w:tcPr>
+            <w:tcW w:w="3648" w:type="dxa"/>
+            <w:vAlign w:val="center"/>
+            <w:hideMark/>
+          </w:tcPr>
+          <w:p>
+            <w:pPr>
+              <w:spacing w:after="0"/>
+              <w:rPr>
+                <w:sz w:val="28"/>
+                <w:szCs w:val="28"/>
+              </w:rPr>
+            </w:pPr>
+            <w:r>
+              <w:rPr>
+                <w:sz w:val="28"/>
+                <w:szCs w:val="28"/>
+              </w:rPr>
+              <w:t xml:space="preserve">Libera la memoria adquirida por los </w:t>
+            </w:r>
+            <w:proofErr w:type="spellStart"/>
+            <w:r>
+              <w:rPr>
+                <w:sz w:val="28"/>
+                <w:szCs w:val="28"/>
+              </w:rPr>
+              <w:t>setters</w:t>
+            </w:r>
+            <w:proofErr w:type="spellEnd"/>
+            <w:r>
+              <w:rPr>
+                <w:sz w:val="28"/>
+                <w:szCs w:val="28"/>
+              </w:rPr>
+              <w:t xml:space="preserve"> o el constructor de copia.</w:t>
+            </w:r>
+          </w:p>
+        </w:tc>
+      </w:tr>
+      <w:tr>
+        <w:trPr>
+          <w:trHeight w:val="1405"/>
+          <w:tblCellSpacing w:w="15" w:type="dxa"/>
+        </w:trPr>
+        <w:tc>
+          <w:tcPr>
+            <w:tcW w:w="0" w:type="auto"/>
+            <w:vAlign w:val="center"/>
+            <w:hideMark/>
+          </w:tcPr>
+          <w:p>
+            <w:pPr>
+              <w:spacing w:after="0"/>
+              <w:rPr>
+                <w:sz w:val="28"/>
+                <w:szCs w:val="28"/>
+              </w:rPr>
+            </w:pPr>
+            <w:r>
+              <w:rPr>
+                <w:sz w:val="28"/>
+                <w:szCs w:val="28"/>
+              </w:rPr>
+              <w:t>Setters (</w:t>
+            </w:r>
+            <w:proofErr w:type="spellStart"/>
+            <w:r>
+              <w:rPr>
+                <w:sz w:val="28"/>
+                <w:szCs w:val="28"/>
+              </w:rPr>
+              <w:t>setIdUsuario</w:t>
+            </w:r>
+            <w:proofErr w:type="spellEnd"/>
+            <w:r>
+              <w:rPr>
+                <w:sz w:val="28"/>
+                <w:szCs w:val="28"/>
+              </w:rPr>
+              <w:t xml:space="preserve">, </w:t>
+            </w:r>
+            <w:proofErr w:type="spellStart"/>
+            <w:r>
+              <w:rPr>
+                <w:sz w:val="28"/>
+                <w:szCs w:val="28"/>
+              </w:rPr>
+              <w:t>setContrasena</w:t>
+            </w:r>
+            <w:proofErr w:type="spellEnd"/>
+            <w:r>
+              <w:rPr>
+                <w:sz w:val="28"/>
+                <w:szCs w:val="28"/>
+              </w:rPr>
+              <w:t xml:space="preserve">, </w:t>
+            </w:r>
+            <w:proofErr w:type="spellStart"/>
+            <w:r>
+              <w:rPr>
+                <w:sz w:val="28"/>
+                <w:szCs w:val="28"/>
+              </w:rPr>
+              <w:t>setNombreUsuario</w:t>
+            </w:r>
+            <w:proofErr w:type="spellEnd"/>
+            <w:r>
+              <w:rPr>
+                <w:sz w:val="28"/>
+                <w:szCs w:val="28"/>
+              </w:rPr>
+              <w:t>)</w:t>
+            </w:r>
+          </w:p>
+        </w:tc>
+        <w:tc>
+          <w:tcPr>
+            <w:tcW w:w="0" w:type="auto"/>
+            <w:vAlign w:val="center"/>
+            <w:hideMark/>
+          </w:tcPr>
+          <w:p>
+            <w:pPr>
+              <w:spacing w:after="0"/>
+              <w:rPr>
+                <w:sz w:val="28"/>
+                <w:szCs w:val="28"/>
+              </w:rPr>
+            </w:pPr>
+            <w:r>
+              <w:rPr>
+                <w:sz w:val="28"/>
+                <w:szCs w:val="28"/>
+              </w:rPr>
+              <w:t xml:space="preserve">Llaman a </w:t>
+            </w:r>
+            <w:proofErr w:type="spellStart"/>
+            <w:r>
+              <w:rPr>
+                <w:sz w:val="28"/>
+                <w:szCs w:val="28"/>
+              </w:rPr>
+              <w:t>copiarTexto</w:t>
+            </w:r>
+            <w:proofErr w:type="spellEnd"/>
+            <w:r>
+              <w:rPr>
+                <w:sz w:val="28"/>
+                <w:szCs w:val="28"/>
+              </w:rPr>
+              <w:t xml:space="preserve"> para reemplazar el contenido.</w:t>
+            </w:r>
+          </w:p>
+        </w:tc>
+        <w:tc>
+          <w:tcPr>
+            <w:tcW w:w="3648" w:type="dxa"/>
+            <w:vAlign w:val="center"/>
+            <w:hideMark/>
+          </w:tcPr>
+          <w:p>
+            <w:pPr>
+              <w:spacing w:after="0"/>
+              <w:rPr>
+                <w:sz w:val="28"/>
+                <w:szCs w:val="28"/>
+              </w:rPr>
+            </w:pPr>
+            <w:proofErr w:type="spellStart"/>
+            <w:r>
+              <w:rPr>
+                <w:sz w:val="28"/>
+                <w:szCs w:val="28"/>
+              </w:rPr>
+              <w:t>copiarTexto</w:t>
+            </w:r>
+            <w:proofErr w:type="spellEnd"/>
+            <w:r>
+              <w:rPr>
+                <w:sz w:val="28"/>
+                <w:szCs w:val="28"/>
+              </w:rPr>
+              <w:t xml:space="preserve"> libera la memoria previa y copia carácter a carácter.</w:t>
+            </w:r>
+          </w:p>
+        </w:tc>
+      </w:tr>
+      <w:tr>
+        <w:trPr>
+          <w:trHeight w:val="26"/>
+          <w:tblCellSpacing w:w="15" w:type="dxa"/>
+        </w:trPr>
+        <w:tc>
+          <w:tcPr>
+            <w:tcW w:w="0" w:type="auto"/>
+            <w:vAlign w:val="center"/>
+            <w:hideMark/>
+          </w:tcPr>
+          <w:p>
+            <w:pPr>
+              <w:spacing w:after="0"/>
+              <w:rPr>
+                <w:sz w:val="28"/>
+                <w:szCs w:val="28"/>
+              </w:rPr>
+            </w:pPr>
+            <w:proofErr w:type="spellStart"/>
+            <w:r>
+              <w:rPr>
+                <w:sz w:val="28"/>
+                <w:szCs w:val="28"/>
+              </w:rPr>
+              <w:t>Getters</w:t>
+            </w:r>
+            <w:proofErr w:type="spellEnd"/>
+            <w:r>
+              <w:rPr>
+                <w:sz w:val="28"/>
+                <w:szCs w:val="28"/>
+              </w:rPr>
+              <w:t xml:space="preserve"> (</w:t>
+            </w:r>
+            <w:proofErr w:type="spellStart"/>
+            <w:r>
+              <w:rPr>
+                <w:sz w:val="28"/>
+                <w:szCs w:val="28"/>
+              </w:rPr>
+              <w:t>getIdUsuario</w:t>
+            </w:r>
+            <w:proofErr w:type="spellEnd"/>
+            <w:r>
+              <w:rPr>
+                <w:sz w:val="28"/>
+                <w:szCs w:val="28"/>
+              </w:rPr>
+              <w:t xml:space="preserve">, </w:t>
+            </w:r>
+            <w:proofErr w:type="spellStart"/>
+            <w:r>
+              <w:rPr>
+                <w:sz w:val="28"/>
+                <w:szCs w:val="28"/>
+              </w:rPr>
+              <w:t>getContrasena</w:t>
+            </w:r>
+            <w:proofErr w:type="spellEnd"/>
+            <w:r>
+              <w:rPr>
+                <w:sz w:val="28"/>
+                <w:szCs w:val="28"/>
+              </w:rPr>
+              <w:t xml:space="preserve">, </w:t>
+            </w:r>
+            <w:proofErr w:type="spellStart"/>
+            <w:r>
+              <w:rPr>
+                <w:sz w:val="28"/>
+                <w:szCs w:val="28"/>
+              </w:rPr>
+              <w:t>getNombreUsuario</w:t>
+            </w:r>
+            <w:proofErr w:type="spellEnd"/>
+            <w:r>
+              <w:rPr>
+                <w:sz w:val="28"/>
+                <w:szCs w:val="28"/>
+              </w:rPr>
+              <w:t>)</w:t>
+            </w:r>
+          </w:p>
+        </w:tc>
+        <w:tc>
+          <w:tcPr>
+            <w:tcW w:w="0" w:type="auto"/>
+            <w:vAlign w:val="center"/>
+            <w:hideMark/>
+          </w:tcPr>
+          <w:p>
+            <w:pPr>
+              <w:spacing w:after="0"/>
+              <w:rPr>
+                <w:sz w:val="28"/>
+                <w:szCs w:val="28"/>
+              </w:rPr>
+            </w:pPr>
+            <w:r>
+              <w:rPr>
+                <w:sz w:val="28"/>
+                <w:szCs w:val="28"/>
+              </w:rPr>
+              <w:t xml:space="preserve">Devuelven </w:t>
+            </w:r>
+            <w:proofErr w:type="spellStart"/>
+            <w:r>
+              <w:rPr>
+                <w:sz w:val="28"/>
+                <w:szCs w:val="28"/>
+              </w:rPr>
+              <w:t>const</w:t>
+            </w:r>
+            <w:proofErr w:type="spellEnd"/>
+            <w:r>
+              <w:rPr>
+                <w:sz w:val="28"/>
+                <w:szCs w:val="28"/>
+              </w:rPr>
+              <w:t xml:space="preserve"> </w:t>
+            </w:r>
+            <w:proofErr w:type="spellStart"/>
+            <w:r>
+              <w:rPr>
+                <w:sz w:val="28"/>
+                <w:szCs w:val="28"/>
+              </w:rPr>
+              <w:t>char</w:t>
+            </w:r>
+            <w:proofErr w:type="spellEnd"/>
+            <w:r>
+              <w:rPr>
+                <w:sz w:val="28"/>
+                <w:szCs w:val="28"/>
+              </w:rPr>
+              <w:t>*.</w:t>
+            </w:r>
+          </w:p>
+        </w:tc>
+        <w:tc>
+          <w:tcPr>
+            <w:tcW w:w="3648" w:type="dxa"/>
+            <w:vAlign w:val="center"/>
+            <w:hideMark/>
+          </w:tcPr>
+          <w:p>
+            <w:pPr>
+              <w:spacing w:after="0"/>
+              <w:rPr>
+                <w:sz w:val="28"/>
+                <w:szCs w:val="28"/>
+              </w:rPr>
+            </w:pPr>
+            <w:r>
+              <w:rPr>
+                <w:sz w:val="28"/>
+                <w:szCs w:val="28"/>
+              </w:rPr>
+              <w:t xml:space="preserve">Equivalente a </w:t>
+            </w:r>
+            <w:proofErr w:type="spellStart"/>
+            <w:r>
+              <w:rPr>
+                <w:sz w:val="28"/>
+                <w:szCs w:val="28"/>
+              </w:rPr>
+              <w:t>usuario.getContrasena</w:t>
+            </w:r>
+            <w:proofErr w:type="spellEnd"/>
+            <w:r>
+              <w:rPr>
+                <w:sz w:val="28"/>
+                <w:szCs w:val="28"/>
+              </w:rPr>
+              <w:t>() en JavaScript.</w:t>
+            </w:r>
+          </w:p>
+        </w:tc>
+      </w:tr>
+    </w:tbl>
+    <w:p>
+      <w:pPr>
+        <w:spacing w:after="0"/>
+        <w:rPr>
+          <w:b/>
+          <w:bCs/>
+          <w:sz w:val="28"/>
+          <w:szCs w:val="28"/>
+        </w:rPr>
+      </w:pPr>
+      <w:proofErr w:type="spellStart"/>
+      <w:r>
+        <w:rPr>
+          <w:b/>
+          <w:bCs/>
+          <w:sz w:val="28"/>
+          <w:szCs w:val="28"/>
+        </w:rPr>
+        <w:lastRenderedPageBreak/>
+        <w:t>copiarTexto</w:t>
+      </w:r>
+      <w:proofErr w:type="spellEnd"/>
+      <w:r>
+        <w:rPr>
+          <w:b/>
+          <w:bCs/>
+          <w:sz w:val="28"/>
+          <w:szCs w:val="28"/>
+        </w:rPr>
+        <w:t xml:space="preserve"> (función estática interna) </w:t>
+      </w:r>
+      <w:r>
+        <w:rPr>
+          <w:b/>
+          <w:bCs/>
+          <w:sz w:val="28"/>
+          <w:szCs w:val="28"/>
+        </w:rPr>
+        <w:t>qué hace?</w:t>
+      </w:r>
+      <w:r>
+        <w:rPr>
+          <w:b/>
+          <w:bCs/>
+          <w:sz w:val="28"/>
+          <w:szCs w:val="28"/>
+        </w:rPr>
+        <w:t>:</w:t>
+      </w:r>
+    </w:p>
+    <w:p>
+      <w:pPr>
+        <w:numPr>
+          <w:ilvl w:val="0"/>
+          <w:numId w:val="20"/>
+        </w:numPr>
+        <w:spacing w:after="0"/>
+        <w:rPr>
+          <w:sz w:val="28"/>
+          <w:szCs w:val="28"/>
+        </w:rPr>
+      </w:pPr>
+      <w:proofErr w:type="spellStart"/>
+      <w:r>
+        <w:rPr>
+          <w:sz w:val="28"/>
+          <w:szCs w:val="28"/>
+        </w:rPr>
+        <w:t>delete</w:t>
+      </w:r>
+      <w:proofErr w:type="spellEnd"/>
+      <w:r>
+        <w:rPr>
+          <w:sz w:val="28"/>
+          <w:szCs w:val="28"/>
+        </w:rPr>
+        <w:t>[] destino – limpia la zona anterior.</w:t>
+      </w:r>
+    </w:p>
+    <w:p>
+      <w:pPr>
+        <w:numPr>
+          <w:ilvl w:val="0"/>
+          <w:numId w:val="20"/>
+        </w:numPr>
+        <w:spacing w:after="0"/>
+        <w:rPr>
+          <w:sz w:val="28"/>
+          <w:szCs w:val="28"/>
+        </w:rPr>
+      </w:pPr>
+      <w:r>
+        <w:rPr>
+          <w:sz w:val="28"/>
+          <w:szCs w:val="28"/>
+        </w:rPr>
+        <w:t>Recorre la cadena hasta \0 para obtener la longitud.</w:t>
+      </w:r>
+    </w:p>
+    <w:p>
+      <w:pPr>
+        <w:numPr>
+          <w:ilvl w:val="0"/>
+          <w:numId w:val="20"/>
+        </w:numPr>
+        <w:spacing w:after="0"/>
+        <w:rPr>
+          <w:sz w:val="28"/>
+          <w:szCs w:val="28"/>
+        </w:rPr>
+      </w:pPr>
+      <w:r>
+        <w:rPr>
+          <w:sz w:val="28"/>
+          <w:szCs w:val="28"/>
+        </w:rPr>
+        <w:t xml:space="preserve">Reserva new </w:t>
+      </w:r>
+      <w:proofErr w:type="spellStart"/>
+      <w:r>
+        <w:rPr>
+          <w:sz w:val="28"/>
+          <w:szCs w:val="28"/>
+        </w:rPr>
+        <w:t>char</w:t>
+      </w:r>
+      <w:proofErr w:type="spellEnd"/>
+      <w:r>
+        <w:rPr>
+          <w:sz w:val="28"/>
+          <w:szCs w:val="28"/>
+        </w:rPr>
+        <w:t>[longitud+1] y copia los bytes, colocando \0 al final.</w:t>
+      </w:r>
+    </w:p>
+    <w:p>
+      <w:pPr>
+        <w:spacing w:after="0"/>
+        <w:rPr>
+          <w:b/>
+          <w:bCs/>
+          <w:sz w:val="28"/>
+          <w:szCs w:val="28"/>
+        </w:rPr>
+      </w:pPr>
+      <w:proofErr w:type="spellStart"/>
+      <w:r>
+        <w:rPr>
+          <w:b/>
+          <w:bCs/>
+          <w:sz w:val="28"/>
+          <w:szCs w:val="28"/>
+        </w:rPr>
+        <w:t>GestorArchivos</w:t>
+      </w:r>
+      <w:proofErr w:type="spellEnd"/>
+      <w:r>
+        <w:rPr>
+          <w:b/>
+          <w:bCs/>
+          <w:sz w:val="28"/>
+          <w:szCs w:val="28"/>
+        </w:rPr>
+        <w:t xml:space="preserve"> (</w:t>
+      </w:r>
+      <w:proofErr w:type="spellStart"/>
+      <w:r>
+        <w:rPr>
+          <w:b/>
+          <w:bCs/>
+          <w:sz w:val="28"/>
+          <w:szCs w:val="28"/>
+        </w:rPr>
+        <w:t>core</w:t>
+      </w:r>
+      <w:proofErr w:type="spellEnd"/>
+      <w:r>
+        <w:rPr>
+          <w:b/>
+          <w:bCs/>
+          <w:sz w:val="28"/>
+          <w:szCs w:val="28"/>
+        </w:rPr>
+        <w:t>/</w:t>
+      </w:r>
+      <w:proofErr w:type="spellStart"/>
+      <w:r>
+        <w:rPr>
+          <w:b/>
+          <w:bCs/>
+          <w:sz w:val="28"/>
+          <w:szCs w:val="28"/>
+        </w:rPr>
+        <w:t>gestor_archivos</w:t>
+      </w:r>
+      <w:proofErr w:type="spellEnd"/>
+      <w:r>
+        <w:rPr>
+          <w:b/>
+          <w:bCs/>
+          <w:sz w:val="28"/>
+          <w:szCs w:val="28"/>
+        </w:rPr>
+        <w:t>)</w:t>
+      </w:r>
+    </w:p>
+    <w:p>
+      <w:pPr>
+        <w:spacing w:after="0"/>
+        <w:rPr>
+          <w:b/>
+          <w:bCs/>
+          <w:sz w:val="28"/>
+          <w:szCs w:val="28"/>
+        </w:rPr>
+      </w:pPr>
+      <w:r>
+        <w:rPr>
+          <w:b/>
+          <w:bCs/>
+          <w:sz w:val="28"/>
+          <w:szCs w:val="28"/>
+        </w:rPr>
+        <w:t>Flujo de carga (</w:t>
+      </w:r>
+      <w:proofErr w:type="spellStart"/>
+      <w:r>
+        <w:rPr>
+          <w:b/>
+          <w:bCs/>
+          <w:sz w:val="28"/>
+          <w:szCs w:val="28"/>
+        </w:rPr>
+        <w:t>cargarIndiceUsuarios</w:t>
+      </w:r>
+      <w:proofErr w:type="spellEnd"/>
+      <w:r>
+        <w:rPr>
+          <w:b/>
+          <w:bCs/>
+          <w:sz w:val="28"/>
+          <w:szCs w:val="28"/>
+        </w:rPr>
+        <w:t>)</w:t>
+      </w:r>
+    </w:p>
+    <w:p>
+      <w:pPr>
+        <w:numPr>
+          <w:ilvl w:val="0"/>
+          <w:numId w:val="21"/>
+        </w:numPr>
+        <w:spacing w:after="0"/>
+        <w:rPr>
+          <w:sz w:val="28"/>
+          <w:szCs w:val="28"/>
+        </w:rPr>
+      </w:pPr>
+      <w:r>
+        <w:rPr>
+          <w:sz w:val="28"/>
+          <w:szCs w:val="28"/>
+        </w:rPr>
+        <w:t xml:space="preserve">Abrir archivo </w:t>
+      </w:r>
+      <w:proofErr w:type="spellStart"/>
+      <w:r>
+        <w:rPr>
+          <w:sz w:val="28"/>
+          <w:szCs w:val="28"/>
+        </w:rPr>
+        <w:t>ifstream</w:t>
+      </w:r>
+      <w:proofErr w:type="spellEnd"/>
+      <w:r>
+        <w:rPr>
+          <w:sz w:val="28"/>
+          <w:szCs w:val="28"/>
+        </w:rPr>
+        <w:t xml:space="preserve"> </w:t>
+      </w:r>
+      <w:proofErr w:type="spellStart"/>
+      <w:r>
+        <w:rPr>
+          <w:sz w:val="28"/>
+          <w:szCs w:val="28"/>
+        </w:rPr>
+        <w:t>archivoLectura</w:t>
+      </w:r>
+      <w:proofErr w:type="spellEnd"/>
+      <w:r>
+        <w:rPr>
+          <w:sz w:val="28"/>
+          <w:szCs w:val="28"/>
+        </w:rPr>
+        <w:t>(</w:t>
+      </w:r>
+      <w:proofErr w:type="spellStart"/>
+      <w:r>
+        <w:rPr>
+          <w:sz w:val="28"/>
+          <w:szCs w:val="28"/>
+        </w:rPr>
+        <w:t>rutaArchivo</w:t>
+      </w:r>
+      <w:proofErr w:type="spellEnd"/>
+      <w:r>
+        <w:rPr>
+          <w:sz w:val="28"/>
+          <w:szCs w:val="28"/>
+        </w:rPr>
+        <w:t>);.</w:t>
+      </w:r>
+    </w:p>
+    <w:p>
+      <w:pPr>
+        <w:numPr>
+          <w:ilvl w:val="0"/>
+          <w:numId w:val="21"/>
+        </w:numPr>
+        <w:spacing w:after="0"/>
+        <w:rPr>
+          <w:sz w:val="28"/>
+          <w:szCs w:val="28"/>
+        </w:rPr>
+      </w:pPr>
+      <w:r>
+        <w:rPr>
+          <w:sz w:val="28"/>
+          <w:szCs w:val="28"/>
+        </w:rPr>
+        <w:t xml:space="preserve">Leer total de usuarios con </w:t>
+      </w:r>
+      <w:proofErr w:type="spellStart"/>
+      <w:r>
+        <w:rPr>
+          <w:sz w:val="28"/>
+          <w:szCs w:val="28"/>
+        </w:rPr>
+        <w:t>archivoLectura</w:t>
+      </w:r>
+      <w:proofErr w:type="spellEnd"/>
+      <w:r>
+        <w:rPr>
+          <w:sz w:val="28"/>
+          <w:szCs w:val="28"/>
+        </w:rPr>
+        <w:t xml:space="preserve"> &gt;&gt; </w:t>
+      </w:r>
+      <w:proofErr w:type="spellStart"/>
+      <w:r>
+        <w:rPr>
+          <w:sz w:val="28"/>
+          <w:szCs w:val="28"/>
+        </w:rPr>
+        <w:t>this</w:t>
+      </w:r>
+      <w:proofErr w:type="spellEnd"/>
+      <w:r>
+        <w:rPr>
+          <w:sz w:val="28"/>
+          <w:szCs w:val="28"/>
+        </w:rPr>
+        <w:t>-&gt;</w:t>
+      </w:r>
+      <w:proofErr w:type="spellStart"/>
+      <w:r>
+        <w:rPr>
+          <w:sz w:val="28"/>
+          <w:szCs w:val="28"/>
+        </w:rPr>
+        <w:t>totalUsuarios</w:t>
+      </w:r>
+      <w:proofErr w:type="spellEnd"/>
+      <w:r>
+        <w:rPr>
+          <w:sz w:val="28"/>
+          <w:szCs w:val="28"/>
+        </w:rPr>
+        <w:t xml:space="preserve">;. </w:t>
+      </w:r>
+    </w:p>
+    <w:p>
+      <w:pPr>
+        <w:numPr>
+          <w:ilvl w:val="1"/>
+          <w:numId w:val="21"/>
+        </w:numPr>
+        <w:spacing w:after="0"/>
+        <w:rPr>
+          <w:sz w:val="28"/>
+          <w:szCs w:val="28"/>
+        </w:rPr>
+      </w:pPr>
+      <w:proofErr w:type="spellStart"/>
+      <w:r>
+        <w:rPr>
+          <w:sz w:val="28"/>
+          <w:szCs w:val="28"/>
+        </w:rPr>
+        <w:t>operator</w:t>
+      </w:r>
+      <w:proofErr w:type="spellEnd"/>
+      <w:r>
+        <w:rPr>
+          <w:sz w:val="28"/>
+          <w:szCs w:val="28"/>
+        </w:rPr>
+        <w:t>&gt;&gt; extrae el número pero no consume el salto de línea (\n).</w:t>
+      </w:r>
+    </w:p>
+    <w:p>
+      <w:pPr>
+        <w:numPr>
+          <w:ilvl w:val="0"/>
+          <w:numId w:val="21"/>
+        </w:numPr>
+        <w:spacing w:after="0"/>
+        <w:rPr>
+          <w:sz w:val="28"/>
+          <w:szCs w:val="28"/>
+        </w:rPr>
+      </w:pPr>
+      <w:proofErr w:type="spellStart"/>
+      <w:r>
+        <w:rPr>
+          <w:sz w:val="28"/>
+          <w:szCs w:val="28"/>
+        </w:rPr>
+        <w:t>archivoLectura.ignore</w:t>
+      </w:r>
+      <w:proofErr w:type="spellEnd"/>
+      <w:r>
+        <w:rPr>
+          <w:sz w:val="28"/>
+          <w:szCs w:val="28"/>
+        </w:rPr>
+        <w:t xml:space="preserve">(); – consume ese \n para que la siguiente </w:t>
+      </w:r>
+      <w:proofErr w:type="spellStart"/>
+      <w:r>
+        <w:rPr>
+          <w:sz w:val="28"/>
+          <w:szCs w:val="28"/>
+        </w:rPr>
+        <w:t>getline</w:t>
+      </w:r>
+      <w:proofErr w:type="spellEnd"/>
+      <w:r>
+        <w:rPr>
+          <w:sz w:val="28"/>
+          <w:szCs w:val="28"/>
+        </w:rPr>
+        <w:t xml:space="preserve"> empiece en la primera línea real de datos. </w:t>
+      </w:r>
+    </w:p>
+    <w:p>
+      <w:pPr>
+        <w:numPr>
+          <w:ilvl w:val="1"/>
+          <w:numId w:val="21"/>
+        </w:numPr>
+        <w:spacing w:after="0"/>
+        <w:rPr>
+          <w:sz w:val="28"/>
+          <w:szCs w:val="28"/>
+        </w:rPr>
+      </w:pPr>
+      <w:r>
+        <w:rPr>
+          <w:sz w:val="28"/>
+          <w:szCs w:val="28"/>
+        </w:rPr>
+        <w:t xml:space="preserve">Sin ignore() la primera </w:t>
+      </w:r>
+      <w:proofErr w:type="spellStart"/>
+      <w:r>
+        <w:rPr>
+          <w:sz w:val="28"/>
+          <w:szCs w:val="28"/>
+        </w:rPr>
+        <w:t>getline</w:t>
+      </w:r>
+      <w:proofErr w:type="spellEnd"/>
+      <w:r>
+        <w:rPr>
+          <w:sz w:val="28"/>
+          <w:szCs w:val="28"/>
+        </w:rPr>
+        <w:t xml:space="preserve"> devolvería una cadena vacía y desfasaría todo el índice.</w:t>
+      </w:r>
+    </w:p>
+    <w:p>
+      <w:pPr>
+        <w:numPr>
+          <w:ilvl w:val="0"/>
+          <w:numId w:val="21"/>
+        </w:numPr>
+        <w:spacing w:after="0"/>
+        <w:rPr>
+          <w:sz w:val="28"/>
+          <w:szCs w:val="28"/>
+        </w:rPr>
+      </w:pPr>
+      <w:r>
+        <w:rPr>
+          <w:sz w:val="28"/>
+          <w:szCs w:val="28"/>
+        </w:rPr>
+        <w:t xml:space="preserve">Reservar memoria: </w:t>
+      </w:r>
+      <w:proofErr w:type="spellStart"/>
+      <w:r>
+        <w:rPr>
+          <w:sz w:val="28"/>
+          <w:szCs w:val="28"/>
+        </w:rPr>
+        <w:t>arregloUsuariosLigeros</w:t>
+      </w:r>
+      <w:proofErr w:type="spellEnd"/>
+      <w:r>
+        <w:rPr>
+          <w:sz w:val="28"/>
+          <w:szCs w:val="28"/>
+        </w:rPr>
+        <w:t xml:space="preserve"> = new </w:t>
+      </w:r>
+      <w:proofErr w:type="spellStart"/>
+      <w:r>
+        <w:rPr>
+          <w:sz w:val="28"/>
+          <w:szCs w:val="28"/>
+        </w:rPr>
+        <w:t>UsuarioLigero</w:t>
+      </w:r>
+      <w:proofErr w:type="spellEnd"/>
+      <w:r>
+        <w:rPr>
+          <w:sz w:val="28"/>
+          <w:szCs w:val="28"/>
+        </w:rPr>
+        <w:t>[</w:t>
+      </w:r>
+      <w:proofErr w:type="spellStart"/>
+      <w:r>
+        <w:rPr>
+          <w:sz w:val="28"/>
+          <w:szCs w:val="28"/>
+        </w:rPr>
+        <w:t>totalUsuarios</w:t>
+      </w:r>
+      <w:proofErr w:type="spellEnd"/>
+      <w:r>
+        <w:rPr>
+          <w:sz w:val="28"/>
+          <w:szCs w:val="28"/>
+        </w:rPr>
+        <w:t>];.</w:t>
+      </w:r>
+    </w:p>
+    <w:p>
+      <w:pPr>
+        <w:numPr>
+          <w:ilvl w:val="0"/>
+          <w:numId w:val="21"/>
+        </w:numPr>
+        <w:spacing w:after="0"/>
+        <w:rPr>
+          <w:sz w:val="28"/>
+          <w:szCs w:val="28"/>
+        </w:rPr>
+      </w:pPr>
+      <w:r>
+        <w:rPr>
+          <w:sz w:val="28"/>
+          <w:szCs w:val="28"/>
+        </w:rPr>
+        <w:t xml:space="preserve">Iterar con </w:t>
+      </w:r>
+      <w:proofErr w:type="spellStart"/>
+      <w:r>
+        <w:rPr>
+          <w:sz w:val="28"/>
+          <w:szCs w:val="28"/>
+        </w:rPr>
+        <w:t>while</w:t>
+      </w:r>
+      <w:proofErr w:type="spellEnd"/>
+      <w:r>
+        <w:rPr>
+          <w:sz w:val="28"/>
+          <w:szCs w:val="28"/>
+        </w:rPr>
+        <w:t xml:space="preserve"> (explorador &lt; </w:t>
+      </w:r>
+      <w:proofErr w:type="spellStart"/>
+      <w:r>
+        <w:rPr>
+          <w:sz w:val="28"/>
+          <w:szCs w:val="28"/>
+        </w:rPr>
+        <w:t>totalUsuarios</w:t>
+      </w:r>
+      <w:proofErr w:type="spellEnd"/>
+      <w:r>
+        <w:rPr>
+          <w:sz w:val="28"/>
+          <w:szCs w:val="28"/>
+        </w:rPr>
+        <w:t xml:space="preserve">): </w:t>
+      </w:r>
+    </w:p>
+    <w:p>
+      <w:pPr>
+        <w:numPr>
+          <w:ilvl w:val="1"/>
+          <w:numId w:val="21"/>
+        </w:numPr>
+        <w:spacing w:after="0"/>
+        <w:rPr>
+          <w:sz w:val="28"/>
+          <w:szCs w:val="28"/>
+        </w:rPr>
+      </w:pPr>
+      <w:proofErr w:type="spellStart"/>
+      <w:r>
+        <w:rPr>
+          <w:sz w:val="28"/>
+          <w:szCs w:val="28"/>
+        </w:rPr>
+        <w:t>getline</w:t>
+      </w:r>
+      <w:proofErr w:type="spellEnd"/>
+      <w:r>
+        <w:rPr>
+          <w:sz w:val="28"/>
+          <w:szCs w:val="28"/>
+        </w:rPr>
+        <w:t xml:space="preserve"> lee una línea completa, por ejemplo 1001;pass123;daniel mosquera.</w:t>
+      </w:r>
+    </w:p>
+    <w:p>
+      <w:pPr>
+        <w:numPr>
+          <w:ilvl w:val="1"/>
+          <w:numId w:val="21"/>
+        </w:numPr>
+        <w:spacing w:after="0"/>
+        <w:rPr>
+          <w:sz w:val="28"/>
+          <w:szCs w:val="28"/>
+        </w:rPr>
+      </w:pPr>
+      <w:proofErr w:type="spellStart"/>
+      <w:r>
+        <w:rPr>
+          <w:sz w:val="28"/>
+          <w:szCs w:val="28"/>
+        </w:rPr>
+        <w:t>extraerCampo</w:t>
+      </w:r>
+      <w:proofErr w:type="spellEnd"/>
+      <w:r>
+        <w:rPr>
+          <w:sz w:val="28"/>
+          <w:szCs w:val="28"/>
+        </w:rPr>
+        <w:t xml:space="preserve"> separa los campos usando ; → devuelve punteros temporales (</w:t>
+      </w:r>
+      <w:proofErr w:type="spellStart"/>
+      <w:r>
+        <w:rPr>
+          <w:sz w:val="28"/>
+          <w:szCs w:val="28"/>
+        </w:rPr>
+        <w:t>char</w:t>
+      </w:r>
+      <w:proofErr w:type="spellEnd"/>
+      <w:r>
+        <w:rPr>
+          <w:sz w:val="28"/>
+          <w:szCs w:val="28"/>
+        </w:rPr>
+        <w:t>*).</w:t>
+      </w:r>
+    </w:p>
+    <w:p>
+      <w:pPr>
+        <w:numPr>
+          <w:ilvl w:val="1"/>
+          <w:numId w:val="21"/>
+        </w:numPr>
+        <w:spacing w:after="0"/>
+        <w:rPr>
+          <w:sz w:val="28"/>
+          <w:szCs w:val="28"/>
+        </w:rPr>
+      </w:pPr>
+      <w:r>
+        <w:rPr>
+          <w:sz w:val="28"/>
+          <w:szCs w:val="28"/>
+        </w:rPr>
+        <w:t xml:space="preserve">Cada campo se pasa a los </w:t>
+      </w:r>
+      <w:proofErr w:type="spellStart"/>
+      <w:r>
+        <w:rPr>
+          <w:sz w:val="28"/>
+          <w:szCs w:val="28"/>
+        </w:rPr>
+        <w:t>setters</w:t>
+      </w:r>
+      <w:proofErr w:type="spellEnd"/>
+      <w:r>
+        <w:rPr>
+          <w:sz w:val="28"/>
+          <w:szCs w:val="28"/>
+        </w:rPr>
+        <w:t xml:space="preserve"> de </w:t>
+      </w:r>
+      <w:proofErr w:type="spellStart"/>
+      <w:r>
+        <w:rPr>
+          <w:sz w:val="28"/>
+          <w:szCs w:val="28"/>
+        </w:rPr>
+        <w:t>UsuarioLigero</w:t>
+      </w:r>
+      <w:proofErr w:type="spellEnd"/>
+      <w:r>
+        <w:rPr>
+          <w:sz w:val="28"/>
+          <w:szCs w:val="28"/>
+        </w:rPr>
+        <w:t xml:space="preserve"> → copia profunda.</w:t>
+      </w:r>
+    </w:p>
+    <w:p>
+      <w:pPr>
+        <w:numPr>
+          <w:ilvl w:val="1"/>
+          <w:numId w:val="21"/>
+        </w:numPr>
+        <w:spacing w:after="0"/>
+        <w:rPr>
+          <w:sz w:val="28"/>
+          <w:szCs w:val="28"/>
+        </w:rPr>
+      </w:pPr>
+      <w:r>
+        <w:rPr>
+          <w:sz w:val="28"/>
+          <w:szCs w:val="28"/>
+        </w:rPr>
+        <w:t xml:space="preserve">Los temporales se liberan con </w:t>
+      </w:r>
+      <w:proofErr w:type="spellStart"/>
+      <w:r>
+        <w:rPr>
+          <w:sz w:val="28"/>
+          <w:szCs w:val="28"/>
+        </w:rPr>
+        <w:t>delete</w:t>
+      </w:r>
+      <w:proofErr w:type="spellEnd"/>
+      <w:r>
+        <w:rPr>
+          <w:sz w:val="28"/>
+          <w:szCs w:val="28"/>
+        </w:rPr>
+        <w:t>[].</w:t>
+      </w:r>
+    </w:p>
+    <w:p>
+      <w:pPr>
+        <w:numPr>
+          <w:ilvl w:val="0"/>
+          <w:numId w:val="21"/>
+        </w:numPr>
+        <w:spacing w:after="0"/>
+        <w:rPr>
+          <w:b/>
+          <w:bCs/>
+          <w:sz w:val="28"/>
+          <w:szCs w:val="28"/>
+        </w:rPr>
+      </w:pPr>
+      <w:r>
+        <w:rPr>
+          <w:sz w:val="28"/>
+          <w:szCs w:val="28"/>
+        </w:rPr>
+        <w:t>Cerrar archivo y devolver true.</w:t>
+      </w:r>
+    </w:p>
+    <w:p>
+      <w:pPr>
+        <w:spacing w:after="0"/>
+        <w:rPr>
+          <w:sz w:val="28"/>
+          <w:szCs w:val="28"/>
+        </w:rPr>
+      </w:pPr>
+    </w:p>
+    <w:p>
+      <w:pPr>
+        <w:spacing w:after="0"/>
+        <w:rPr>
+          <w:sz w:val="28"/>
+          <w:szCs w:val="28"/>
+        </w:rPr>
+      </w:pPr>
+    </w:p>
+    <w:p>
+      <w:pPr>
+        <w:spacing w:after="0"/>
+        <w:rPr>
+          <w:b/>
+          <w:bCs/>
+          <w:sz w:val="32"/>
+          <w:szCs w:val="32"/>
+        </w:rPr>
+      </w:pPr>
+      <w:r>
+        <w:rPr>
+          <w:b/>
+          <w:bCs/>
+          <w:i/>
+          <w:iCs/>
+          <w:sz w:val="32"/>
+          <w:szCs w:val="32"/>
+        </w:rPr>
+        <w:t xml:space="preserve">_ </w:t>
+      </w:r>
+      <w:r>
+        <w:rPr>
+          <w:b/>
+          <w:bCs/>
+          <w:sz w:val="36"/>
+          <w:szCs w:val="36"/>
+        </w:rPr>
+        <w:t>T</w:t>
+      </w:r>
+      <w:r>
+        <w:rPr>
+          <w:b/>
+          <w:bCs/>
+          <w:sz w:val="32"/>
+          <w:szCs w:val="32"/>
+        </w:rPr>
+        <w:t>ener en cuenta:</w:t>
+      </w:r>
+    </w:p>
+    <w:p>
+      <w:pPr>
+        <w:spacing w:after="0"/>
+        <w:rPr>
+          <w:sz w:val="32"/>
+          <w:szCs w:val="32"/>
+        </w:rPr>
+      </w:pPr>
+    </w:p>
+    <w:p>
+      <w:pPr>
+        <w:spacing w:after="0"/>
+        <w:ind w:firstLine="708"/>
+        <w:rPr>
+          <w:sz w:val="28"/>
+          <w:szCs w:val="28"/>
+        </w:rPr>
+      </w:pPr>
+      <w:proofErr w:type="spellStart"/>
+      <w:r>
+        <w:rPr>
+          <w:b/>
+          <w:bCs/>
+          <w:sz w:val="28"/>
+          <w:szCs w:val="28"/>
+        </w:rPr>
+        <w:t>this</w:t>
+      </w:r>
+      <w:proofErr w:type="spellEnd"/>
+      <w:r>
+        <w:rPr>
+          <w:b/>
+          <w:bCs/>
+          <w:sz w:val="28"/>
+          <w:szCs w:val="28"/>
+        </w:rPr>
+        <w:t>-&gt;</w:t>
+      </w:r>
+      <w:r>
+        <w:rPr>
+          <w:sz w:val="28"/>
+          <w:szCs w:val="28"/>
+        </w:rPr>
+        <w:t xml:space="preserve"> es el puntero implícito a la instancia actual; se usa para distinguir atributos de variables locales. </w:t>
+      </w:r>
+    </w:p>
+    <w:p>
+      <w:pPr>
+        <w:spacing w:after="0"/>
+        <w:ind w:firstLine="708"/>
+        <w:rPr>
+          <w:sz w:val="28"/>
+          <w:szCs w:val="28"/>
+        </w:rPr>
+      </w:pPr>
+      <w:r>
+        <w:rPr>
+          <w:b/>
+          <w:bCs/>
+          <w:sz w:val="28"/>
+          <w:szCs w:val="28"/>
+        </w:rPr>
+        <w:lastRenderedPageBreak/>
+        <w:t>-&gt;</w:t>
+      </w:r>
+      <w:r>
+        <w:rPr>
+          <w:sz w:val="28"/>
+          <w:szCs w:val="28"/>
+        </w:rPr>
+        <w:t xml:space="preserve"> es el operador de acceso a miembros a través de un puntero (ej. </w:t>
+      </w:r>
+      <w:proofErr w:type="spellStart"/>
+      <w:r>
+        <w:rPr>
+          <w:sz w:val="28"/>
+          <w:szCs w:val="28"/>
+        </w:rPr>
+        <w:t>this</w:t>
+      </w:r>
+      <w:proofErr w:type="spellEnd"/>
+      <w:r>
+        <w:rPr>
+          <w:sz w:val="28"/>
+          <w:szCs w:val="28"/>
+        </w:rPr>
+        <w:t>-&gt;</w:t>
+      </w:r>
+      <w:proofErr w:type="spellStart"/>
+      <w:r>
+        <w:rPr>
+          <w:sz w:val="28"/>
+          <w:szCs w:val="28"/>
+        </w:rPr>
+        <w:t>totalUsuarios</w:t>
+      </w:r>
+      <w:proofErr w:type="spellEnd"/>
+      <w:r>
+        <w:rPr>
+          <w:sz w:val="28"/>
+          <w:szCs w:val="28"/>
+        </w:rPr>
+        <w:t xml:space="preserve">). </w:t>
+      </w:r>
+    </w:p>
+    <w:p>
+      <w:pPr>
+        <w:spacing w:after="0"/>
+        <w:ind w:firstLine="708"/>
+        <w:rPr>
+          <w:sz w:val="28"/>
+          <w:szCs w:val="28"/>
+        </w:rPr>
+      </w:pPr>
+      <w:r>
+        <w:rPr>
+          <w:b/>
+          <w:bCs/>
+          <w:sz w:val="28"/>
+          <w:szCs w:val="28"/>
+        </w:rPr>
+        <w:t>buffer</w:t>
+      </w:r>
+      <w:r>
+        <w:rPr>
+          <w:sz w:val="28"/>
+          <w:szCs w:val="28"/>
+        </w:rPr>
+        <w:t xml:space="preserve"> es un array de la pila usado como buffer temporal para cada línea del archivo. </w:t>
+      </w:r>
+    </w:p>
+    <w:p>
+      <w:pPr>
+        <w:spacing w:after="0"/>
+        <w:ind w:firstLine="708"/>
+        <w:rPr>
+          <w:sz w:val="28"/>
+          <w:szCs w:val="28"/>
+        </w:rPr>
+      </w:pPr>
+      <w:r>
+        <w:rPr>
+          <w:sz w:val="28"/>
+          <w:szCs w:val="28"/>
+        </w:rPr>
+        <w:t xml:space="preserve">El bucle </w:t>
+      </w:r>
+      <w:proofErr w:type="spellStart"/>
+      <w:r>
+        <w:rPr>
+          <w:sz w:val="28"/>
+          <w:szCs w:val="28"/>
+        </w:rPr>
+        <w:t>while</w:t>
+      </w:r>
+      <w:proofErr w:type="spellEnd"/>
+      <w:r>
+        <w:rPr>
+          <w:sz w:val="28"/>
+          <w:szCs w:val="28"/>
+        </w:rPr>
+        <w:t xml:space="preserve"> (explorador &lt; </w:t>
+      </w:r>
+      <w:proofErr w:type="spellStart"/>
+      <w:r>
+        <w:rPr>
+          <w:sz w:val="28"/>
+          <w:szCs w:val="28"/>
+        </w:rPr>
+        <w:t>totalUsuarios</w:t>
+      </w:r>
+      <w:proofErr w:type="spellEnd"/>
+      <w:r>
+        <w:rPr>
+          <w:sz w:val="28"/>
+          <w:szCs w:val="28"/>
+        </w:rPr>
+        <w:t>) recorre todas las filas del archivo, no un JSON.</w:t>
+      </w:r>
+    </w:p>
+    <w:p>
+      <w:pPr>
+        <w:spacing w:after="0"/>
+        <w:rPr>
+          <w:sz w:val="28"/>
+          <w:szCs w:val="28"/>
+        </w:rPr>
+      </w:pPr>
+    </w:p>
+    <w:p>
+      <w:pPr>
+        <w:spacing w:after="0"/>
+        <w:rPr>
+          <w:sz w:val="28"/>
+          <w:szCs w:val="28"/>
+        </w:rPr>
+      </w:pPr>
+    </w:p>
+    <w:p>
+      <w:pPr>
+        <w:spacing w:after="0"/>
+        <w:rPr>
+          <w:b/>
+          <w:bCs/>
+          <w:sz w:val="28"/>
+          <w:szCs w:val="28"/>
+        </w:rPr>
+      </w:pPr>
+      <w:r>
+        <w:rPr>
+          <w:b/>
+          <w:bCs/>
+          <w:sz w:val="28"/>
+          <w:szCs w:val="28"/>
+        </w:rPr>
+        <w:t>Respuestas a tus dudas específicas</w:t>
+      </w:r>
+    </w:p>
+    <w:p>
+      <w:pPr>
+        <w:numPr>
+          <w:ilvl w:val="0"/>
+          <w:numId w:val="22"/>
+        </w:numPr>
+        <w:spacing w:after="0"/>
+        <w:rPr>
+          <w:sz w:val="28"/>
+          <w:szCs w:val="28"/>
+        </w:rPr>
+      </w:pPr>
+      <w:proofErr w:type="spellStart"/>
+      <w:r>
+        <w:rPr>
+          <w:b/>
+          <w:bCs/>
+          <w:sz w:val="28"/>
+          <w:szCs w:val="28"/>
+        </w:rPr>
+        <w:t>this</w:t>
+      </w:r>
+      <w:proofErr w:type="spellEnd"/>
+      <w:r>
+        <w:rPr>
+          <w:b/>
+          <w:bCs/>
+          <w:sz w:val="28"/>
+          <w:szCs w:val="28"/>
+        </w:rPr>
+        <w:t>-&gt; y -&gt;</w:t>
+      </w:r>
+      <w:r>
+        <w:rPr>
+          <w:sz w:val="28"/>
+          <w:szCs w:val="28"/>
+        </w:rPr>
+        <w:t xml:space="preserve"> – </w:t>
+      </w:r>
+      <w:proofErr w:type="spellStart"/>
+      <w:r>
+        <w:rPr>
+          <w:sz w:val="28"/>
+          <w:szCs w:val="28"/>
+        </w:rPr>
+        <w:t>this</w:t>
+      </w:r>
+      <w:proofErr w:type="spellEnd"/>
+      <w:r>
+        <w:rPr>
+          <w:sz w:val="28"/>
+          <w:szCs w:val="28"/>
+        </w:rPr>
+        <w:t xml:space="preserve"> es una palabra clave; -&gt; accede a miembros mediante un puntero.</w:t>
+      </w:r>
+    </w:p>
+    <w:p>
+      <w:pPr>
+        <w:numPr>
+          <w:ilvl w:val="0"/>
+          <w:numId w:val="22"/>
+        </w:numPr>
+        <w:spacing w:after="0"/>
+        <w:rPr>
+          <w:sz w:val="28"/>
+          <w:szCs w:val="28"/>
+        </w:rPr>
+      </w:pPr>
+      <w:proofErr w:type="spellStart"/>
+      <w:r>
+        <w:rPr>
+          <w:b/>
+          <w:bCs/>
+          <w:sz w:val="28"/>
+          <w:szCs w:val="28"/>
+        </w:rPr>
+        <w:t>archivoLectura.ignore</w:t>
+      </w:r>
+      <w:proofErr w:type="spellEnd"/>
+      <w:r>
+        <w:rPr>
+          <w:b/>
+          <w:bCs/>
+          <w:sz w:val="28"/>
+          <w:szCs w:val="28"/>
+        </w:rPr>
+        <w:t>();</w:t>
+      </w:r>
+      <w:r>
+        <w:rPr>
+          <w:sz w:val="28"/>
+          <w:szCs w:val="28"/>
+        </w:rPr>
+        <w:t xml:space="preserve"> – elimina el salto de línea pendiente tras &gt;&gt;. Sin él, la primera </w:t>
+      </w:r>
+      <w:proofErr w:type="spellStart"/>
+      <w:r>
+        <w:rPr>
+          <w:sz w:val="28"/>
+          <w:szCs w:val="28"/>
+        </w:rPr>
+        <w:t>getline</w:t>
+      </w:r>
+      <w:proofErr w:type="spellEnd"/>
+      <w:r>
+        <w:rPr>
+          <w:sz w:val="28"/>
+          <w:szCs w:val="28"/>
+        </w:rPr>
+        <w:t xml:space="preserve"> leería una cadena vacía.</w:t>
+      </w:r>
+    </w:p>
+    <w:p>
+      <w:pPr>
+        <w:numPr>
+          <w:ilvl w:val="0"/>
+          <w:numId w:val="22"/>
+        </w:numPr>
+        <w:spacing w:after="0"/>
+        <w:rPr>
+          <w:sz w:val="28"/>
+          <w:szCs w:val="28"/>
+        </w:rPr>
+      </w:pPr>
+      <w:r>
+        <w:rPr>
+          <w:b/>
+          <w:bCs/>
+          <w:sz w:val="28"/>
+          <w:szCs w:val="28"/>
+        </w:rPr>
+        <w:t>Ejemplo de indice.txt</w:t>
+      </w:r>
+    </w:p>
+    <w:p>
+      <w:pPr>
+        <w:spacing w:after="0"/>
+        <w:rPr>
+          <w:sz w:val="28"/>
+          <w:szCs w:val="28"/>
+        </w:rPr>
+      </w:pPr>
+      <w:r>
+        <w:rPr>
+          <w:sz w:val="28"/>
+          <w:szCs w:val="28"/>
+        </w:rPr>
+        <w:t xml:space="preserve">3                ← </w:t>
+      </w:r>
+      <w:proofErr w:type="spellStart"/>
+      <w:r>
+        <w:rPr>
+          <w:sz w:val="28"/>
+          <w:szCs w:val="28"/>
+        </w:rPr>
+        <w:t>totalUsuarios</w:t>
+      </w:r>
+      <w:proofErr w:type="spellEnd"/>
+      <w:r>
+        <w:rPr>
+          <w:sz w:val="28"/>
+          <w:szCs w:val="28"/>
+        </w:rPr>
+        <w:t xml:space="preserve"> (leído con &gt;&gt;)</w:t>
+      </w:r>
+    </w:p>
+    <w:p>
+      <w:pPr>
+        <w:spacing w:after="0"/>
+        <w:rPr>
+          <w:sz w:val="28"/>
+          <w:szCs w:val="28"/>
+        </w:rPr>
+      </w:pPr>
+      <w:r>
+        <w:rPr>
+          <w:sz w:val="28"/>
+          <w:szCs w:val="28"/>
+        </w:rPr>
+        <w:t>1001;pass123;daniel mosquera</w:t>
+      </w:r>
+    </w:p>
+    <w:p>
+      <w:pPr>
+        <w:spacing w:after="0"/>
+        <w:rPr>
+          <w:sz w:val="28"/>
+          <w:szCs w:val="28"/>
+        </w:rPr>
+      </w:pPr>
+      <w:r>
+        <w:rPr>
+          <w:sz w:val="28"/>
+          <w:szCs w:val="28"/>
+        </w:rPr>
+        <w:t xml:space="preserve">1002;pwd456;ana </w:t>
+      </w:r>
+      <w:proofErr w:type="spellStart"/>
+      <w:r>
+        <w:rPr>
+          <w:sz w:val="28"/>
+          <w:szCs w:val="28"/>
+        </w:rPr>
+        <w:t>pérez</w:t>
+      </w:r>
+      <w:proofErr w:type="spellEnd"/>
+    </w:p>
+    <w:p>
+      <w:pPr>
+        <w:spacing w:after="0"/>
+        <w:rPr>
+          <w:sz w:val="28"/>
+          <w:szCs w:val="28"/>
+        </w:rPr>
+      </w:pPr>
+      <w:r>
+        <w:rPr>
+          <w:sz w:val="28"/>
+          <w:szCs w:val="28"/>
+        </w:rPr>
+        <w:t xml:space="preserve">1003;abc789;juan </w:t>
+      </w:r>
+      <w:proofErr w:type="spellStart"/>
+      <w:r>
+        <w:rPr>
+          <w:sz w:val="28"/>
+          <w:szCs w:val="28"/>
+        </w:rPr>
+        <w:t>lopez</w:t>
+      </w:r>
+      <w:proofErr w:type="spellEnd"/>
+    </w:p>
+    <w:p>
+      <w:pPr>
+        <w:spacing w:after="0"/>
+        <w:rPr>
+          <w:sz w:val="28"/>
+          <w:szCs w:val="28"/>
+        </w:rPr>
+      </w:pPr>
+    </w:p>
+    <w:p>
+      <w:pPr>
+        <w:spacing w:after="0"/>
+        <w:rPr>
+          <w:sz w:val="28"/>
+          <w:szCs w:val="28"/>
+        </w:rPr>
+      </w:pPr>
+      <w:r>
+        <w:rPr>
+          <w:sz w:val="28"/>
+          <w:szCs w:val="28"/>
+        </w:rPr>
+        <w:t xml:space="preserve">Después de ignore(), la primera </w:t>
+      </w:r>
+      <w:proofErr w:type="spellStart"/>
+      <w:r>
+        <w:rPr>
+          <w:sz w:val="28"/>
+          <w:szCs w:val="28"/>
+        </w:rPr>
+        <w:t>getline</w:t>
+      </w:r>
+      <w:proofErr w:type="spellEnd"/>
+      <w:r>
+        <w:rPr>
+          <w:sz w:val="28"/>
+          <w:szCs w:val="28"/>
+        </w:rPr>
+        <w:t xml:space="preserve"> lee 1001;pass123;daniel mosquera.</w:t>
+      </w:r>
+    </w:p>
+    <w:p>
+      <w:pPr>
+        <w:spacing w:after="0"/>
+        <w:rPr>
+          <w:b/>
+          <w:bCs/>
+          <w:sz w:val="28"/>
+          <w:szCs w:val="28"/>
+        </w:rPr>
+      </w:pPr>
+    </w:p>
+    <w:p>
+      <w:pPr>
+        <w:pStyle w:val="Prrafodelista"/>
+        <w:numPr>
+          <w:ilvl w:val="0"/>
+          <w:numId w:val="22"/>
+        </w:numPr>
+        <w:spacing w:after="0"/>
+        <w:rPr>
+          <w:sz w:val="28"/>
+          <w:szCs w:val="28"/>
+        </w:rPr>
+      </w:pPr>
+      <w:proofErr w:type="spellStart"/>
+      <w:r>
+        <w:rPr>
+          <w:b/>
+          <w:bCs/>
+          <w:sz w:val="28"/>
+          <w:szCs w:val="28"/>
+        </w:rPr>
+        <w:t>nullptr</w:t>
+      </w:r>
+      <w:proofErr w:type="spellEnd"/>
+      <w:r>
+        <w:rPr>
+          <w:sz w:val="28"/>
+          <w:szCs w:val="28"/>
+        </w:rPr>
+        <w:t xml:space="preserve"> – palabra reservada que representa un puntero nulo (equivalente a </w:t>
+      </w:r>
+      <w:proofErr w:type="spellStart"/>
+      <w:r>
+        <w:rPr>
+          <w:sz w:val="28"/>
+          <w:szCs w:val="28"/>
+        </w:rPr>
+        <w:t>null</w:t>
+      </w:r>
+      <w:proofErr w:type="spellEnd"/>
+      <w:r>
+        <w:rPr>
+          <w:sz w:val="28"/>
+          <w:szCs w:val="28"/>
+        </w:rPr>
+        <w:t>).</w:t>
+      </w:r>
+    </w:p>
+    <w:p>
+      <w:pPr>
+        <w:numPr>
+          <w:ilvl w:val="0"/>
+          <w:numId w:val="22"/>
+        </w:numPr>
+        <w:spacing w:after="0"/>
+        <w:rPr>
+          <w:sz w:val="28"/>
+          <w:szCs w:val="28"/>
+        </w:rPr>
+      </w:pPr>
+      <w:r>
+        <w:rPr>
+          <w:b/>
+          <w:bCs/>
+          <w:sz w:val="28"/>
+          <w:szCs w:val="28"/>
+        </w:rPr>
+        <w:t>::</w:t>
+      </w:r>
+      <w:r>
+        <w:rPr>
+          <w:sz w:val="28"/>
+          <w:szCs w:val="28"/>
+        </w:rPr>
+        <w:t xml:space="preserve"> – operador de resolución de alcance; Clase::</w:t>
+      </w:r>
+      <w:proofErr w:type="spellStart"/>
+      <w:r>
+        <w:rPr>
+          <w:sz w:val="28"/>
+          <w:szCs w:val="28"/>
+        </w:rPr>
+        <w:t>miMetodo</w:t>
+      </w:r>
+      <w:proofErr w:type="spellEnd"/>
+      <w:r>
+        <w:rPr>
+          <w:sz w:val="28"/>
+          <w:szCs w:val="28"/>
+        </w:rPr>
+        <w:t xml:space="preserve"> indica que el método pertenece a Clase.</w:t>
+      </w:r>
+    </w:p>
+    <w:p>
+      <w:pPr>
+        <w:spacing w:after="0"/>
+        <w:rPr>
+          <w:sz w:val="28"/>
+          <w:szCs w:val="28"/>
+        </w:rPr>
+      </w:pPr>
+    </w:p>
+    <w:p>
+      <w:pPr>
+        <w:spacing w:after="0"/>
+        <w:rPr>
+          <w:sz w:val="28"/>
+          <w:szCs w:val="28"/>
+        </w:rPr>
+      </w:pPr>
+    </w:p>
+    <w:p>
+      <w:pPr>
+        <w:spacing w:after="0"/>
+        <w:rPr>
+          <w:sz w:val="28"/>
+          <w:szCs w:val="28"/>
+        </w:rPr>
+      </w:pPr>
+    </w:p>
+    <w:p>
+      <w:pPr>
+        <w:spacing w:after="0"/>
+        <w:rPr>
+          <w:sz w:val="28"/>
+          <w:szCs w:val="28"/>
+        </w:rPr>
+      </w:pPr>
+    </w:p>
+    <w:p>
+      <w:pPr>
+        <w:spacing w:after="0"/>
+        <w:rPr>
+          <w:sz w:val="28"/>
+          <w:szCs w:val="28"/>
+        </w:rPr>
+      </w:pPr>
+    </w:p>
+    <w:p>
+      <w:pPr>
+        <w:spacing w:after="0"/>
+        <w:rPr>
+          <w:sz w:val="28"/>
+          <w:szCs w:val="28"/>
+        </w:rPr>
+      </w:pPr>
+    </w:p>
+    <w:p>
+      <w:pPr>
+        <w:spacing w:after="0"/>
+        <w:rPr>
+          <w:sz w:val="28"/>
+          <w:szCs w:val="28"/>
+        </w:rPr>
+      </w:pPr>
+    </w:p>
+    <w:p>
+      <w:pPr>
+        <w:spacing w:after="0"/>
+        <w:rPr>
+          <w:sz w:val="34"/>
+          <w:szCs w:val="34"/>
+        </w:rPr>
+      </w:pPr>
+      <w:r>
+        <w:rPr>
+          <w:sz w:val="34"/>
+          <w:szCs w:val="34"/>
+        </w:rPr>
+        <w:t>Próximo a abordar para DANIEL MOSQUERA:</w:t>
+      </w:r>
+    </w:p>
+    <w:p>
+      <w:pPr>
+        <w:spacing w:after="0"/>
+        <w:rPr>
+          <w:sz w:val="28"/>
+          <w:szCs w:val="28"/>
+        </w:rPr>
+      </w:pPr>
+    </w:p>
+    <w:p>
+      <w:pPr>
+        <w:pStyle w:val="Prrafodelista"/>
+        <w:numPr>
+          <w:ilvl w:val="0"/>
+          <w:numId w:val="19"/>
+        </w:numPr>
+        <w:spacing w:after="0"/>
+        <w:ind w:firstLine="708"/>
+        <w:rPr>
+          <w:sz w:val="28"/>
+          <w:szCs w:val="28"/>
+        </w:rPr>
+      </w:pPr>
+      <w:r>
+        <w:rPr>
+          <w:sz w:val="28"/>
+          <w:szCs w:val="28"/>
+        </w:rPr>
+        <w:t xml:space="preserve"> </w:t>
+      </w:r>
+      <w:r>
+        <w:rPr>
+          <w:b/>
+          <w:bCs/>
+          <w:sz w:val="28"/>
+          <w:szCs w:val="28"/>
+        </w:rPr>
+        <w:t xml:space="preserve">Terminar </w:t>
+      </w:r>
+      <w:proofErr w:type="spellStart"/>
+      <w:r>
+        <w:rPr>
+          <w:b/>
+          <w:bCs/>
+          <w:sz w:val="28"/>
+          <w:szCs w:val="28"/>
+        </w:rPr>
+        <w:t>monitor_recursos</w:t>
+      </w:r>
+      <w:proofErr w:type="spellEnd"/>
+      <w:r>
+        <w:rPr>
+          <w:sz w:val="28"/>
+          <w:szCs w:val="28"/>
+        </w:rPr>
+        <w:t xml:space="preserve"> – añadir contadores de iteraciones y memoria. </w:t>
+      </w:r>
+    </w:p>
+    <w:p>
+      <w:pPr>
+        <w:pStyle w:val="Prrafodelista"/>
+        <w:numPr>
+          <w:ilvl w:val="0"/>
+          <w:numId w:val="19"/>
+        </w:numPr>
+        <w:spacing w:after="0"/>
+        <w:ind w:firstLine="708"/>
+        <w:rPr>
+          <w:sz w:val="28"/>
+          <w:szCs w:val="28"/>
+        </w:rPr>
+      </w:pPr>
+      <w:r>
+        <w:rPr>
+          <w:b/>
+          <w:bCs/>
+          <w:sz w:val="28"/>
+          <w:szCs w:val="28"/>
+        </w:rPr>
+        <w:t>Implementar la lógica de los módulos dinámicos</w:t>
+      </w:r>
+      <w:r>
+        <w:rPr>
+          <w:sz w:val="28"/>
+          <w:szCs w:val="28"/>
+        </w:rPr>
+        <w:t xml:space="preserve"> (</w:t>
+      </w:r>
+      <w:proofErr w:type="spellStart"/>
+      <w:r>
+        <w:rPr>
+          <w:sz w:val="28"/>
+          <w:szCs w:val="28"/>
+        </w:rPr>
+        <w:t>autenticacion</w:t>
+      </w:r>
+      <w:proofErr w:type="spellEnd"/>
+      <w:r>
+        <w:rPr>
+          <w:sz w:val="28"/>
+          <w:szCs w:val="28"/>
+        </w:rPr>
+        <w:t xml:space="preserve">, </w:t>
+      </w:r>
+      <w:proofErr w:type="spellStart"/>
+      <w:r>
+        <w:rPr>
+          <w:sz w:val="28"/>
+          <w:szCs w:val="28"/>
+        </w:rPr>
+        <w:t>admin_amistades</w:t>
+      </w:r>
+      <w:proofErr w:type="spellEnd"/>
+      <w:r>
+        <w:rPr>
+          <w:sz w:val="28"/>
+          <w:szCs w:val="28"/>
+        </w:rPr>
+        <w:t xml:space="preserve">, </w:t>
+      </w:r>
+      <w:proofErr w:type="spellStart"/>
+      <w:r>
+        <w:rPr>
+          <w:sz w:val="28"/>
+          <w:szCs w:val="28"/>
+        </w:rPr>
+        <w:t>visor_perfiles</w:t>
+      </w:r>
+      <w:proofErr w:type="spellEnd"/>
+      <w:r>
+        <w:rPr>
+          <w:sz w:val="28"/>
+          <w:szCs w:val="28"/>
+        </w:rPr>
+        <w:t xml:space="preserve">, </w:t>
+      </w:r>
+      <w:proofErr w:type="spellStart"/>
+      <w:r>
+        <w:rPr>
+          <w:sz w:val="28"/>
+          <w:szCs w:val="28"/>
+        </w:rPr>
+        <w:t>gestor_mensajes</w:t>
+      </w:r>
+      <w:proofErr w:type="spellEnd"/>
+      <w:r>
+        <w:rPr>
+          <w:sz w:val="28"/>
+          <w:szCs w:val="28"/>
+        </w:rPr>
+        <w:t xml:space="preserve">). </w:t>
+      </w:r>
+    </w:p>
+    <w:p>
+      <w:pPr>
+        <w:pStyle w:val="Prrafodelista"/>
+        <w:numPr>
+          <w:ilvl w:val="0"/>
+          <w:numId w:val="19"/>
+        </w:numPr>
+        <w:spacing w:after="0"/>
+        <w:ind w:firstLine="708"/>
+        <w:rPr>
+          <w:sz w:val="28"/>
+          <w:szCs w:val="28"/>
+        </w:rPr>
+      </w:pPr>
+      <w:r>
+        <w:rPr>
+          <w:sz w:val="28"/>
+          <w:szCs w:val="28"/>
+        </w:rPr>
+        <w:t xml:space="preserve"> </w:t>
+      </w:r>
+      <w:r>
+        <w:rPr>
+          <w:b/>
+          <w:bCs/>
+          <w:sz w:val="28"/>
+          <w:szCs w:val="28"/>
+        </w:rPr>
+        <w:t>Crear pruebas unitarias</w:t>
+      </w:r>
+      <w:r>
+        <w:rPr>
+          <w:sz w:val="28"/>
+          <w:szCs w:val="28"/>
+        </w:rPr>
+        <w:t xml:space="preserve"> – por ejemplo, un indice.txt con 3 usuarios y validar que </w:t>
+      </w:r>
+      <w:proofErr w:type="spellStart"/>
+      <w:r>
+        <w:rPr>
+          <w:sz w:val="28"/>
+          <w:szCs w:val="28"/>
+        </w:rPr>
+        <w:t>cargarIndiceUsuarios</w:t>
+      </w:r>
+      <w:proofErr w:type="spellEnd"/>
+      <w:r>
+        <w:rPr>
+          <w:sz w:val="28"/>
+          <w:szCs w:val="28"/>
+        </w:rPr>
+        <w:t xml:space="preserve"> rellena correctamente el arreglo. </w:t>
+      </w:r>
+    </w:p>
+    <w:p>
+      <w:pPr>
+        <w:pStyle w:val="Prrafodelista"/>
+        <w:numPr>
+          <w:ilvl w:val="0"/>
+          <w:numId w:val="19"/>
+        </w:numPr>
+        <w:spacing w:after="0"/>
+        <w:ind w:firstLine="708"/>
+        <w:rPr>
+          <w:sz w:val="28"/>
+          <w:szCs w:val="28"/>
+        </w:rPr>
+      </w:pPr>
+      <w:r>
+        <w:rPr>
+          <w:b/>
+          <w:bCs/>
+          <w:sz w:val="28"/>
+          <w:szCs w:val="28"/>
+        </w:rPr>
+        <w:t>Documentar cada función</w:t>
+      </w:r>
+      <w:r>
+        <w:rPr>
+          <w:sz w:val="28"/>
+          <w:szCs w:val="28"/>
+        </w:rPr>
+        <w:t xml:space="preserve"> con comentarios estilo </w:t>
+      </w:r>
+      <w:proofErr w:type="spellStart"/>
+      <w:r>
+        <w:rPr>
+          <w:sz w:val="28"/>
+          <w:szCs w:val="28"/>
+        </w:rPr>
+        <w:t>Doxygen</w:t>
+      </w:r>
+      <w:proofErr w:type="spellEnd"/>
+      <w:r>
+        <w:rPr>
+          <w:sz w:val="28"/>
+          <w:szCs w:val="28"/>
+        </w:rPr>
+        <w:t xml:space="preserve"> (sin cambiar código existente).</w:t>
+      </w:r>
+    </w:p>
+    <w:p>
+      <w:pPr>
+        <w:spacing w:after="0"/>
+        <w:rPr>
+          <w:sz w:val="28"/>
+          <w:szCs w:val="28"/>
         </w:rPr>
       </w:pPr>
     </w:p>
@@ -4529,6 +7364,127 @@
     </w:lvl>
   </w:abstractNum>
   <w:abstractNum w:abstractNumId="2" w15:restartNumberingAfterBreak="0">
+    <w:nsid w:val="179A15CF"/>
+    <w:multiLevelType w:val="multilevel"/>
+    <w:tmpl w:val="9C863854"/>
+    <w:lvl w:ilvl="0">
+      <w:start w:val="1"/>
+      <w:numFmt w:val="decimal"/>
+      <w:lvlText w:val="%1."/>
+      <w:lvlJc w:val="left"/>
+      <w:pPr>
+        <w:tabs>
+          <w:tab w:val="num" w:pos="720"/>
+        </w:tabs>
+        <w:ind w:left="720" w:hanging="360"/>
+      </w:pPr>
+      <w:rPr>
+        <w:b w:val="0"/>
+        <w:bCs w:val="0"/>
+      </w:rPr>
+    </w:lvl>
+    <w:lvl w:ilvl="1">
+      <w:start w:val="1"/>
+      <w:numFmt w:val="bullet"/>
+      <w:lvlText w:val="o"/>
+      <w:lvlJc w:val="left"/>
+      <w:pPr>
+        <w:tabs>
+          <w:tab w:val="num" w:pos="1440"/>
+        </w:tabs>
+        <w:ind w:left="1440" w:hanging="360"/>
+      </w:pPr>
+      <w:rPr>
+        <w:rFonts w:ascii="Courier New" w:hAnsi="Courier New" w:hint="default"/>
+        <w:sz w:val="20"/>
+      </w:rPr>
+    </w:lvl>
+    <w:lvl w:ilvl="2" w:tentative="1">
+      <w:start w:val="1"/>
+      <w:numFmt w:val="decimal"/>
+      <w:lvlText w:val="%3."/>
+      <w:lvlJc w:val="left"/>
+      <w:pPr>
+        <w:tabs>
+          <w:tab w:val="num" w:pos="2160"/>
+        </w:tabs>
+        <w:ind w:left="2160" w:hanging="360"/>
+      </w:pPr>
+    </w:lvl>
+    <w:lvl w:ilvl="3" w:tentative="1">
+      <w:start w:val="1"/>
+      <w:numFmt w:val="decimal"/>
+      <w:lvlText w:val="%4."/>
+      <w:lvlJc w:val="left"/>
+      <w:pPr>
+        <w:tabs>
+          <w:tab w:val="num" w:pos="2880"/>
+        </w:tabs>
+        <w:ind w:left="2880" w:hanging="360"/>
+      </w:pPr>
+    </w:lvl>
+    <w:lvl w:ilvl="4" w:tentative="1">
+      <w:start w:val="1"/>
+      <w:numFmt w:val="decimal"/>
+      <w:lvlText w:val="%5."/>
+      <w:lvlJc w:val="left"/>
+      <w:pPr>
+        <w:tabs>
+          <w:tab w:val="num" w:pos="3600"/>
+        </w:tabs>
+        <w:ind w:left="3600" w:hanging="360"/>
+      </w:pPr>
+    </w:lvl>
+    <w:lvl w:ilvl="5" w:tentative="1">
+      <w:start w:val="1"/>
+      <w:numFmt w:val="decimal"/>
+      <w:lvlText w:val="%6."/>
+      <w:lvlJc w:val="left"/>
+      <w:pPr>
+        <w:tabs>
+          <w:tab w:val="num" w:pos="4320"/>
+        </w:tabs>
+        <w:ind w:left="4320" w:hanging="360"/>
+      </w:pPr>
+    </w:lvl>
+    <w:lvl w:ilvl="6" w:tentative="1">
+      <w:start w:val="1"/>
+      <w:numFmt w:val="decimal"/>
+      <w:lvlText w:val="%7."/>
+      <w:lvlJc w:val="left"/>
+      <w:pPr>
+        <w:tabs>
+          <w:tab w:val="num" w:pos="5040"/>
+        </w:tabs>
+        <w:ind w:left="5040" w:hanging="360"/>
+      </w:pPr>
+    </w:lvl>
+    <w:lvl w:ilvl="7" w:tentative="1">
+      <w:start w:val="1"/>
+      <w:numFmt w:val="decimal"/>
+      <w:lvlText w:val="%8."/>
+      <w:lvlJc w:val="left"/>
+      <w:pPr>
+        <w:tabs>
+          <w:tab w:val="num" w:pos="5760"/>
+        </w:tabs>
+        <w:ind w:left="5760" w:hanging="360"/>
+      </w:pPr>
+    </w:lvl>
+    <w:lvl w:ilvl="8" w:tentative="1">
+      <w:start w:val="1"/>
+      <w:numFmt w:val="decimal"/>
+      <w:lvlText w:val="%9."/>
+      <w:lvlJc w:val="left"/>
+      <w:pPr>
+        <w:tabs>
+          <w:tab w:val="num" w:pos="6480"/>
+        </w:tabs>
+        <w:ind w:left="6480" w:hanging="360"/>
+      </w:pPr>
+    </w:lvl>
+  </w:abstractNum>
+  <w:abstractNum w:abstractNumId="3" w15:restartNumberingAfterBreak="0">
     <w:nsid w:val="18E71B46"/>
     <w:multiLevelType w:val="multilevel"/>
     <w:tmpl w:val="19A640C4"/>
@@ -4677,7 +7633,7 @@
       </w:rPr>
     </w:lvl>
   </w:abstractNum>
-  <w:abstractNum w:abstractNumId="3" w15:restartNumberingAfterBreak="0">
+  <w:abstractNum w:abstractNumId="4" w15:restartNumberingAfterBreak="0">
     <w:nsid w:val="2342463C"/>
     <w:multiLevelType w:val="multilevel"/>
     <w:tmpl w:val="73C01272"/>
@@ -4826,7 +7782,7 @@
       </w:rPr>
     </w:lvl>
   </w:abstractNum>
-  <w:abstractNum w:abstractNumId="4" w15:restartNumberingAfterBreak="0">
+  <w:abstractNum w:abstractNumId="5" w15:restartNumberingAfterBreak="0">
     <w:nsid w:val="28D11D4C"/>
     <w:multiLevelType w:val="multilevel"/>
     <w:tmpl w:val="2DEC1902"/>
@@ -4975,7 +7931,120 @@
       </w:rPr>
     </w:lvl>
   </w:abstractNum>
-  <w:abstractNum w:abstractNumId="5" w15:restartNumberingAfterBreak="0">
+  <w:abstractNum w:abstractNumId="6" w15:restartNumberingAfterBreak="0">
+    <w:nsid w:val="375E61A1"/>
+    <w:multiLevelType w:val="multilevel"/>
+    <w:tmpl w:val="2BCCBDBC"/>
+    <w:lvl w:ilvl="0">
+      <w:start w:val="1"/>
+      <w:numFmt w:val="decimal"/>
+      <w:lvlText w:val="%1."/>
+      <w:lvlJc w:val="left"/>
+      <w:pPr>
+        <w:tabs>
+          <w:tab w:val="num" w:pos="720"/>
+        </w:tabs>
+        <w:ind w:left="720" w:hanging="360"/>
+      </w:pPr>
+    </w:lvl>
+    <w:lvl w:ilvl="1" w:tentative="1">
+      <w:start w:val="1"/>
+      <w:numFmt w:val="decimal"/>
+      <w:lvlText w:val="%2."/>
+      <w:lvlJc w:val="left"/>
+      <w:pPr>
+        <w:tabs>
+          <w:tab w:val="num" w:pos="1440"/>
+        </w:tabs>
+        <w:ind w:left="1440" w:hanging="360"/>
+      </w:pPr>
+    </w:lvl>
+    <w:lvl w:ilvl="2" w:tentative="1">
+      <w:start w:val="1"/>
+      <w:numFmt w:val="decimal"/>
+      <w:lvlText w:val="%3."/>
+      <w:lvlJc w:val="left"/>
+      <w:pPr>
+        <w:tabs>
+          <w:tab w:val="num" w:pos="2160"/>
+        </w:tabs>
+        <w:ind w:left="2160" w:hanging="360"/>
+      </w:pPr>
+    </w:lvl>
+    <w:lvl w:ilvl="3" w:tentative="1">
+      <w:start w:val="1"/>
+      <w:numFmt w:val="decimal"/>
+      <w:lvlText w:val="%4."/>
+      <w:lvlJc w:val="left"/>
+      <w:pPr>
+        <w:tabs>
+          <w:tab w:val="num" w:pos="2880"/>
+        </w:tabs>
+        <w:ind w:left="2880" w:hanging="360"/>
+      </w:pPr>
+    </w:lvl>
+    <w:lvl w:ilvl="4" w:tentative="1">
+      <w:start w:val="1"/>
+      <w:numFmt w:val="decimal"/>
+      <w:lvlText w:val="%5."/>
+      <w:lvlJc w:val="left"/>
+      <w:pPr>
+        <w:tabs>
+          <w:tab w:val="num" w:pos="3600"/>
+        </w:tabs>
+        <w:ind w:left="3600" w:hanging="360"/>
+      </w:pPr>
+    </w:lvl>
+    <w:lvl w:ilvl="5" w:tentative="1">
+      <w:start w:val="1"/>
+      <w:numFmt w:val="decimal"/>
+      <w:lvlText w:val="%6."/>
+      <w:lvlJc w:val="left"/>
+      <w:pPr>
+        <w:tabs>
+          <w:tab w:val="num" w:pos="4320"/>
+        </w:tabs>
+        <w:ind w:left="4320" w:hanging="360"/>
+      </w:pPr>
+    </w:lvl>
+    <w:lvl w:ilvl="6" w:tentative="1">
+      <w:start w:val="1"/>
+      <w:numFmt w:val="decimal"/>
+      <w:lvlText w:val="%7."/>
+      <w:lvlJc w:val="left"/>
+      <w:pPr>
+        <w:tabs>
+          <w:tab w:val="num" w:pos="5040"/>
+        </w:tabs>
+        <w:ind w:left="5040" w:hanging="360"/>
+      </w:pPr>
+    </w:lvl>
+    <w:lvl w:ilvl="7" w:tentative="1">
+      <w:start w:val="1"/>
+      <w:numFmt w:val="decimal"/>
+      <w:lvlText w:val="%8."/>
+      <w:lvlJc w:val="left"/>
+      <w:pPr>
+        <w:tabs>
+          <w:tab w:val="num" w:pos="5760"/>
+        </w:tabs>
+        <w:ind w:left="5760" w:hanging="360"/>
+      </w:pPr>
+    </w:lvl>
+    <w:lvl w:ilvl="8" w:tentative="1">
+      <w:start w:val="1"/>
+      <w:numFmt w:val="decimal"/>
+      <w:lvlText w:val="%9."/>
+      <w:lvlJc w:val="left"/>
+      <w:pPr>
+        <w:tabs>
+          <w:tab w:val="num" w:pos="6480"/>
+        </w:tabs>
+        <w:ind w:left="6480" w:hanging="360"/>
+      </w:pPr>
+    </w:lvl>
+  </w:abstractNum>
+  <w:abstractNum w:abstractNumId="7" w15:restartNumberingAfterBreak="0">
     <w:nsid w:val="3F0C013E"/>
     <w:multiLevelType w:val="hybridMultilevel"/>
     <w:tmpl w:val="A706069E"/>
@@ -5064,7 +8133,7 @@
       </w:pPr>
     </w:lvl>
   </w:abstractNum>
-  <w:abstractNum w:abstractNumId="6" w15:restartNumberingAfterBreak="0">
+  <w:abstractNum w:abstractNumId="8" w15:restartNumberingAfterBreak="0">
     <w:nsid w:val="428C3367"/>
     <w:multiLevelType w:val="multilevel"/>
     <w:tmpl w:val="474A4062"/>
@@ -5213,7 +8282,7 @@
       </w:rPr>
     </w:lvl>
   </w:abstractNum>
-  <w:abstractNum w:abstractNumId="7" w15:restartNumberingAfterBreak="0">
+  <w:abstractNum w:abstractNumId="9" w15:restartNumberingAfterBreak="0">
     <w:nsid w:val="4CFE0499"/>
     <w:multiLevelType w:val="hybridMultilevel"/>
     <w:tmpl w:val="91DC105C"/>
@@ -5302,7 +8371,120 @@
       </w:pPr>
     </w:lvl>
   </w:abstractNum>
-  <w:abstractNum w:abstractNumId="8" w15:restartNumberingAfterBreak="0">
+  <w:abstractNum w:abstractNumId="10" w15:restartNumberingAfterBreak="0">
+    <w:nsid w:val="5C5606EB"/>
+    <w:multiLevelType w:val="multilevel"/>
+    <w:tmpl w:val="4E408560"/>
+    <w:lvl w:ilvl="0">
+      <w:start w:val="1"/>
+      <w:numFmt w:val="decimal"/>
+      <w:lvlText w:val="%1."/>
+      <w:lvlJc w:val="left"/>
+      <w:pPr>
+        <w:tabs>
+          <w:tab w:val="num" w:pos="720"/>
+        </w:tabs>
+        <w:ind w:left="720" w:hanging="360"/>
+      </w:pPr>
+    </w:lvl>
+    <w:lvl w:ilvl="1" w:tentative="1">
+      <w:start w:val="1"/>
+      <w:numFmt w:val="decimal"/>
+      <w:lvlText w:val="%2."/>
+      <w:lvlJc w:val="left"/>
+      <w:pPr>
+        <w:tabs>
+          <w:tab w:val="num" w:pos="1440"/>
+        </w:tabs>
+        <w:ind w:left="1440" w:hanging="360"/>
+      </w:pPr>
+    </w:lvl>
+    <w:lvl w:ilvl="2" w:tentative="1">
+      <w:start w:val="1"/>
+      <w:numFmt w:val="decimal"/>
+      <w:lvlText w:val="%3."/>
+      <w:lvlJc w:val="left"/>
+      <w:pPr>
+        <w:tabs>
+          <w:tab w:val="num" w:pos="2160"/>
+        </w:tabs>
+        <w:ind w:left="2160" w:hanging="360"/>
+      </w:pPr>
+    </w:lvl>
+    <w:lvl w:ilvl="3" w:tentative="1">
+      <w:start w:val="1"/>
+      <w:numFmt w:val="decimal"/>
+      <w:lvlText w:val="%4."/>
+      <w:lvlJc w:val="left"/>
+      <w:pPr>
+        <w:tabs>
+          <w:tab w:val="num" w:pos="2880"/>
+        </w:tabs>
+        <w:ind w:left="2880" w:hanging="360"/>
+      </w:pPr>
+    </w:lvl>
+    <w:lvl w:ilvl="4" w:tentative="1">
+      <w:start w:val="1"/>
+      <w:numFmt w:val="decimal"/>
+      <w:lvlText w:val="%5."/>
+      <w:lvlJc w:val="left"/>
+      <w:pPr>
+        <w:tabs>
+          <w:tab w:val="num" w:pos="3600"/>
+        </w:tabs>
+        <w:ind w:left="3600" w:hanging="360"/>
+      </w:pPr>
+    </w:lvl>
+    <w:lvl w:ilvl="5" w:tentative="1">
+      <w:start w:val="1"/>
+      <w:numFmt w:val="decimal"/>
+      <w:lvlText w:val="%6."/>
+      <w:lvlJc w:val="left"/>
+      <w:pPr>
+        <w:tabs>
+          <w:tab w:val="num" w:pos="4320"/>
+        </w:tabs>
+        <w:ind w:left="4320" w:hanging="360"/>
+      </w:pPr>
+    </w:lvl>
+    <w:lvl w:ilvl="6" w:tentative="1">
+      <w:start w:val="1"/>
+      <w:numFmt w:val="decimal"/>
+      <w:lvlText w:val="%7."/>
+      <w:lvlJc w:val="left"/>
+      <w:pPr>
+        <w:tabs>
+          <w:tab w:val="num" w:pos="5040"/>
+        </w:tabs>
+        <w:ind w:left="5040" w:hanging="360"/>
+      </w:pPr>
+    </w:lvl>
+    <w:lvl w:ilvl="7" w:tentative="1">
+      <w:start w:val="1"/>
+      <w:numFmt w:val="decimal"/>
+      <w:lvlText w:val="%8."/>
+      <w:lvlJc w:val="left"/>
+      <w:pPr>
+        <w:tabs>
+          <w:tab w:val="num" w:pos="5760"/>
+        </w:tabs>
+        <w:ind w:left="5760" w:hanging="360"/>
+      </w:pPr>
+    </w:lvl>
+    <w:lvl w:ilvl="8" w:tentative="1">
+      <w:start w:val="1"/>
+      <w:numFmt w:val="decimal"/>
+      <w:lvlText w:val="%9."/>
+      <w:lvlJc w:val="left"/>
+      <w:pPr>
+        <w:tabs>
+          <w:tab w:val="num" w:pos="6480"/>
+        </w:tabs>
+        <w:ind w:left="6480" w:hanging="360"/>
+      </w:pPr>
+    </w:lvl>
+  </w:abstractNum>
+  <w:abstractNum w:abstractNumId="11" w15:restartNumberingAfterBreak="0">
     <w:nsid w:val="5F687274"/>
     <w:multiLevelType w:val="multilevel"/>
     <w:tmpl w:val="4BB85720"/>
@@ -5451,7 +8633,7 @@
       </w:rPr>
     </w:lvl>
   </w:abstractNum>
-  <w:abstractNum w:abstractNumId="9" w15:restartNumberingAfterBreak="0">
+  <w:abstractNum w:abstractNumId="12" w15:restartNumberingAfterBreak="0">
     <w:nsid w:val="6142616B"/>
     <w:multiLevelType w:val="multilevel"/>
     <w:tmpl w:val="258CF9A0"/>
@@ -5600,7 +8782,7 @@
       </w:rPr>
     </w:lvl>
   </w:abstractNum>
-  <w:abstractNum w:abstractNumId="10" w15:restartNumberingAfterBreak="0">
+  <w:abstractNum w:abstractNumId="13" w15:restartNumberingAfterBreak="0">
     <w:nsid w:val="615D0667"/>
     <w:multiLevelType w:val="hybridMultilevel"/>
     <w:tmpl w:val="9000C4A4"/>
@@ -5689,7 +8871,7 @@
       </w:pPr>
     </w:lvl>
   </w:abstractNum>
-  <w:abstractNum w:abstractNumId="11" w15:restartNumberingAfterBreak="0">
+  <w:abstractNum w:abstractNumId="14" w15:restartNumberingAfterBreak="0">
     <w:nsid w:val="616A6C17"/>
     <w:multiLevelType w:val="hybridMultilevel"/>
     <w:tmpl w:val="8F8EB438"/>
@@ -5778,7 +8960,7 @@
       </w:pPr>
     </w:lvl>
   </w:abstractNum>
-  <w:abstractNum w:abstractNumId="12" w15:restartNumberingAfterBreak="0">
+  <w:abstractNum w:abstractNumId="15" w15:restartNumberingAfterBreak="0">
     <w:nsid w:val="62E52EA8"/>
     <w:multiLevelType w:val="multilevel"/>
     <w:tmpl w:val="5074C0B8"/>
@@ -5927,7 +9109,7 @@
       </w:rPr>
     </w:lvl>
   </w:abstractNum>
-  <w:abstractNum w:abstractNumId="13" w15:restartNumberingAfterBreak="0">
+  <w:abstractNum w:abstractNumId="16" w15:restartNumberingAfterBreak="0">
     <w:nsid w:val="64D63A8E"/>
     <w:multiLevelType w:val="multilevel"/>
     <w:tmpl w:val="542C7B8A"/>
@@ -6076,7 +9258,7 @@
       </w:rPr>
     </w:lvl>
   </w:abstractNum>
-  <w:abstractNum w:abstractNumId="14" w15:restartNumberingAfterBreak="0">
+  <w:abstractNum w:abstractNumId="17" w15:restartNumberingAfterBreak="0">
     <w:nsid w:val="6C6406F4"/>
     <w:multiLevelType w:val="multilevel"/>
     <w:tmpl w:val="DC960F50"/>
@@ -6225,7 +9407,7 @@
       </w:rPr>
     </w:lvl>
   </w:abstractNum>
-  <w:abstractNum w:abstractNumId="15" w15:restartNumberingAfterBreak="0">
+  <w:abstractNum w:abstractNumId="18" w15:restartNumberingAfterBreak="0">
     <w:nsid w:val="6F5F5486"/>
     <w:multiLevelType w:val="multilevel"/>
     <w:tmpl w:val="DF925EC8"/>
@@ -6374,7 +9556,7 @@
       </w:rPr>
     </w:lvl>
   </w:abstractNum>
-  <w:abstractNum w:abstractNumId="16" w15:restartNumberingAfterBreak="0">
+  <w:abstractNum w:abstractNumId="19" w15:restartNumberingAfterBreak="0">
     <w:nsid w:val="76E2175C"/>
     <w:multiLevelType w:val="multilevel"/>
     <w:tmpl w:val="C25855FE"/>
@@ -6523,7 +9705,7 @@
       </w:rPr>
     </w:lvl>
   </w:abstractNum>
-  <w:abstractNum w:abstractNumId="17" w15:restartNumberingAfterBreak="0">
+  <w:abstractNum w:abstractNumId="20" w15:restartNumberingAfterBreak="0">
     <w:nsid w:val="79A90858"/>
     <w:multiLevelType w:val="multilevel"/>
     <w:tmpl w:val="6F7C4650"/>
@@ -6672,7 +9854,7 @@
       </w:rPr>
     </w:lvl>
   </w:abstractNum>
-  <w:abstractNum w:abstractNumId="18" w15:restartNumberingAfterBreak="0">
+  <w:abstractNum w:abstractNumId="21" w15:restartNumberingAfterBreak="0">
     <w:nsid w:val="7E7F3464"/>
     <w:multiLevelType w:val="hybridMultilevel"/>
     <w:tmpl w:val="E4F4E77C"/>
@@ -6762,46 +9944,46 @@
     </w:lvl>
   </w:abstractNum>
   <w:num w:numId="1" w16cid:durableId="1983191156">
-    <w:abstractNumId w:val="17"/>
+    <w:abstractNumId w:val="20"/>
   </w:num>
   <w:num w:numId="2" w16cid:durableId="1165901977">
-    <w:abstractNumId w:val="16"/>
+    <w:abstractNumId w:val="19"/>
   </w:num>
   <w:num w:numId="3" w16cid:durableId="200899774">
-    <w:abstractNumId w:val="11"/>
+    <w:abstractNumId w:val="14"/>
   </w:num>
   <w:num w:numId="4" w16cid:durableId="985087451">
-    <w:abstractNumId w:val="10"/>
+    <w:abstractNumId w:val="13"/>
   </w:num>
   <w:num w:numId="5" w16cid:durableId="1569462111">
+    <w:abstractNumId w:val="9"/>
+  </w:num>
+  <w:num w:numId="6" w16cid:durableId="895049046">
+    <w:abstractNumId w:val="21"/>
+  </w:num>
+  <w:num w:numId="7" w16cid:durableId="1824157321">
     <w:abstractNumId w:val="7"/>
   </w:num>
-  <w:num w:numId="6" w16cid:durableId="895049046">
+  <w:num w:numId="8" w16cid:durableId="39014597">
+    <w:abstractNumId w:val="3"/>
+  </w:num>
+  <w:num w:numId="9" w16cid:durableId="78409640">
+    <w:abstractNumId w:val="15"/>
+  </w:num>
+  <w:num w:numId="10" w16cid:durableId="2102598756">
+    <w:abstractNumId w:val="12"/>
+  </w:num>
+  <w:num w:numId="11" w16cid:durableId="1429619284">
     <w:abstractNumId w:val="18"/>
   </w:num>
-  <w:num w:numId="7" w16cid:durableId="1824157321">
+  <w:num w:numId="12" w16cid:durableId="894046786">
+    <w:abstractNumId w:val="8"/>
+  </w:num>
+  <w:num w:numId="13" w16cid:durableId="1528103090">
     <w:abstractNumId w:val="5"/>
   </w:num>
-  <w:num w:numId="8" w16cid:durableId="39014597">
-    <w:abstractNumId w:val="2"/>
-  </w:num>
-  <w:num w:numId="9" w16cid:durableId="78409640">
-    <w:abstractNumId w:val="12"/>
-  </w:num>
-  <w:num w:numId="10" w16cid:durableId="2102598756">
-    <w:abstractNumId w:val="9"/>
-  </w:num>
-  <w:num w:numId="11" w16cid:durableId="1429619284">
-    <w:abstractNumId w:val="15"/>
-  </w:num>
-  <w:num w:numId="12" w16cid:durableId="894046786">
-    <w:abstractNumId w:val="6"/>
-  </w:num>
-  <w:num w:numId="13" w16cid:durableId="1528103090">
-    <w:abstractNumId w:val="4"/>
-  </w:num>
   <w:num w:numId="14" w16cid:durableId="13045550">
-    <w:abstractNumId w:val="8"/>
+    <w:abstractNumId w:val="11"/>
   </w:num>
   <w:num w:numId="15" w16cid:durableId="1860968736">
     <w:abstractNumId w:val="0"/>
@@ -6810,13 +9992,22 @@
     <w:abstractNumId w:val="1"/>
   </w:num>
   <w:num w:numId="17" w16cid:durableId="1644584623">
-    <w:abstractNumId w:val="13"/>
+    <w:abstractNumId w:val="16"/>
   </w:num>
   <w:num w:numId="18" w16cid:durableId="1884711325">
-    <w:abstractNumId w:val="3"/>
+    <w:abstractNumId w:val="4"/>
   </w:num>
   <w:num w:numId="19" w16cid:durableId="1479346868">
-    <w:abstractNumId w:val="14"/>
+    <w:abstractNumId w:val="17"/>
+  </w:num>
+  <w:num w:numId="20" w16cid:durableId="1196427765">
+    <w:abstractNumId w:val="6"/>
+  </w:num>
+  <w:num w:numId="21" w16cid:durableId="522673995">
+    <w:abstractNumId w:val="2"/>
+  </w:num>
+  <w:num w:numId="22" w16cid:durableId="697656525">
+    <w:abstractNumId w:val="10"/>
   </w:num>
 </w:numbering>
 </file>
@@ -7424,7 +10615,6 @@
   <w:style w:type="character" w:default="1" w:styleId="Fuentedeprrafopredeter">
     <w:name w:val="Default Paragraph Font"/>
     <w:uiPriority w:val="1"/>
-    <w:semiHidden/>
     <w:unhideWhenUsed/>
   </w:style>
   <w:style w:type="table" w:default="1" w:styleId="Tablanormal">

</xml_diff>